<commit_message>
docs: finalize academic docx files for checkpoint 2 and add demo guide
</commit_message>
<xml_diff>
--- a/Ứng dụng trí tuệ nhân tạo KHMT K23A-20260805T083400Z-1-001/01_GenAI_SoftwareDevelopment_project-plan.docx
+++ b/Ứng dụng trí tuệ nhân tạo KHMT K23A-20260805T083400Z-1-001/01_GenAI_SoftwareDevelopment_project-plan.docx
@@ -40,38 +40,7 @@
         </w:rPr>
       </w:pPr>
       <w:r>
-        <w:rPr>
-          <w:rFonts w:cs="Times New Roman" w:ascii="Times New Roman" w:hAnsi="Times New Roman"/>
-          <w:sz w:val="26"/>
-          <w:szCs w:val="26"/>
-        </w:rPr>
-        <w:t xml:space="preserve">Nhóm </w:t>
-      </w:r>
-      <w:r>
-        <w:rPr>
-          <w:rFonts w:cs="Times New Roman" w:ascii="Times New Roman" w:hAnsi="Times New Roman"/>
-          <w:color w:val="FF0000"/>
-          <w:sz w:val="26"/>
-          <w:szCs w:val="26"/>
-        </w:rPr>
-        <w:t xml:space="preserve">XX </w:t>
-      </w:r>
-      <w:r>
-        <w:rPr>
-          <w:rFonts w:cs="Times New Roman" w:ascii="Times New Roman" w:hAnsi="Times New Roman"/>
-          <w:sz w:val="26"/>
-          <w:szCs w:val="26"/>
-        </w:rPr>
-        <w:t xml:space="preserve">- Thành viên nhóm </w:t>
-      </w:r>
-      <w:r>
-        <w:rPr>
-          <w:rFonts w:cs="Times New Roman" w:ascii="Times New Roman" w:hAnsi="Times New Roman"/>
-          <w:color w:val="FF0000"/>
-          <w:sz w:val="26"/>
-          <w:szCs w:val="26"/>
-        </w:rPr>
-        <w:t>(XX là số thứ tự của nhóm theo từng lớp - Nhóm 2 SV)</w:t>
+        <w:t>Nhóm 04 - Nhóm sinh viên thực hiện (Lớp KHMT K23A)</w:t>
       </w:r>
     </w:p>
     <w:p>
@@ -92,13 +61,7 @@
         </w:rPr>
       </w:pPr>
       <w:r>
-        <w:rPr>
-          <w:rFonts w:cs="Times New Roman" w:ascii="Times New Roman" w:hAnsi="Times New Roman"/>
-          <w:color w:val="FF0000"/>
-          <w:sz w:val="26"/>
-          <w:szCs w:val="26"/>
-        </w:rPr>
-        <w:t>Nguyễn Văn A (Trưởng nhóm)</w:t>
+        <w:t>1. Vũ Ngọc Sơn (Trưởng nhóm, Kiến trúc hệ thống &amp; Fullstack)</w:t>
       </w:r>
     </w:p>
     <w:p>
@@ -119,13 +82,7 @@
         </w:rPr>
       </w:pPr>
       <w:r>
-        <w:rPr>
-          <w:rFonts w:cs="Times New Roman" w:ascii="Times New Roman" w:hAnsi="Times New Roman"/>
-          <w:color w:val="FF0000"/>
-          <w:sz w:val="26"/>
-          <w:szCs w:val="26"/>
-        </w:rPr>
-        <w:t>Nguyễn Thị B</w:t>
+        <w:t>2. Vũ Bảo Linh (Kỹ sư Dữ liệu &amp; Tích hợp AI Engine)  |  3. Tô Văn Quyền (Kiểm thử Phần mềm &amp; Đặc tả Nghiệp vụ)  |  4. Lê Bình Nguyên (Thiết kế Giao diện UI/UX &amp; Tài liệu Học thuật)</w:t>
       </w:r>
     </w:p>
     <w:p>

</xml_diff>

<commit_message>
fix(ui/ux): resolve drawer jump, opacity bleed, dual opposing beams, and polish submission docx
</commit_message>
<xml_diff>
--- a/Ứng dụng trí tuệ nhân tạo KHMT K23A-20260805T083400Z-1-001/01_GenAI_SoftwareDevelopment_project-plan.docx
+++ b/Ứng dụng trí tuệ nhân tạo KHMT K23A-20260805T083400Z-1-001/01_GenAI_SoftwareDevelopment_project-plan.docx
@@ -8,7 +8,7 @@
         <w:pBdr>
           <w:bottom w:val="single" w:sz="4" w:space="1" w:color="000000"/>
         </w:pBdr>
-        <w:spacing w:lineRule="auto" w:line="240" w:before="0" w:after="120"/>
+        <w:spacing w:lineRule="auto" w:line="276" w:before="120" w:after="160"/>
         <w:jc w:val="center"/>
         <w:rPr>
           <w:rFonts w:ascii="Times New Roman" w:hAnsi="Times New Roman" w:cs="Times New Roman"/>
@@ -19,9 +19,11 @@
       </w:pPr>
       <w:r>
         <w:rPr>
-          <w:rFonts w:cs="Times New Roman" w:ascii="Times New Roman" w:hAnsi="Times New Roman"/>
+          <w:rFonts w:cs="Times New Roman" w:ascii="Times New Roman" w:hAnsi="Times New Roman" w:eastAsia="Times New Roman"/>
           <w:b/>
-          <w:sz w:val="28"/>
+          <w:i w:val="0"/>
+          <w:color w:val="1E3A8A"/>
+          <w:sz w:val="32"/>
           <w:szCs w:val="26"/>
         </w:rPr>
         <w:t>KẾ HOẠCH THỰC HIỆN – PHÁT TRIỂN ỨNG DỤNG CHUYÊN SÂU</w:t>
@@ -30,8 +32,8 @@
     <w:p>
       <w:pPr>
         <w:pStyle w:val="Normal"/>
-        <w:spacing w:lineRule="auto" w:line="240" w:before="0" w:after="120"/>
-        <w:jc w:val="both"/>
+        <w:spacing w:lineRule="auto" w:line="276" w:before="0" w:after="40"/>
+        <w:jc w:val="center"/>
         <w:rPr>
           <w:rFonts w:ascii="Times New Roman" w:hAnsi="Times New Roman" w:cs="Times New Roman"/>
           <w:color w:val="FF0000"/>
@@ -40,6 +42,13 @@
         </w:rPr>
       </w:pPr>
       <w:r>
+        <w:rPr>
+          <w:rFonts w:ascii="Times New Roman" w:hAnsi="Times New Roman" w:cs="Times New Roman" w:eastAsia="Times New Roman"/>
+          <w:b/>
+          <w:i/>
+          <w:color w:val="475569"/>
+          <w:sz w:val="22"/>
+        </w:rPr>
         <w:t>Nhóm 04 - Nhóm sinh viên thực hiện (Lớp KHMT K23A)</w:t>
       </w:r>
     </w:p>
@@ -50,7 +59,7 @@
           <w:ilvl w:val="0"/>
           <w:numId w:val="1"/>
         </w:numPr>
-        <w:spacing w:lineRule="auto" w:line="240" w:before="0" w:after="120"/>
+        <w:spacing w:lineRule="auto" w:line="276" w:before="0" w:after="80"/>
         <w:contextualSpacing/>
         <w:jc w:val="both"/>
         <w:rPr>
@@ -71,7 +80,7 @@
           <w:ilvl w:val="0"/>
           <w:numId w:val="1"/>
         </w:numPr>
-        <w:spacing w:lineRule="auto" w:line="240" w:before="0" w:after="120"/>
+        <w:spacing w:lineRule="auto" w:line="276" w:before="0" w:after="80"/>
         <w:contextualSpacing/>
         <w:jc w:val="both"/>
         <w:rPr>
@@ -88,7 +97,7 @@
     <w:p>
       <w:pPr>
         <w:pStyle w:val="Normal"/>
-        <w:spacing w:lineRule="auto" w:line="240" w:before="0" w:after="120"/>
+        <w:spacing w:lineRule="auto" w:line="276" w:before="0" w:after="80"/>
         <w:jc w:val="both"/>
         <w:rPr>
           <w:rFonts w:ascii="Times New Roman" w:hAnsi="Times New Roman" w:cs="Times New Roman"/>
@@ -100,7 +109,10 @@
       </w:pPr>
       <w:r>
         <w:rPr>
+          <w:rFonts w:ascii="Times New Roman" w:hAnsi="Times New Roman" w:cs="Times New Roman" w:eastAsia="Times New Roman"/>
           <w:b/>
+          <w:color w:val="0F172A"/>
+          <w:sz w:val="24"/>
         </w:rPr>
         <w:t>Tên ứng dụng: Hệ thống Nền tảng PropTech Cho Thuê &amp; Quản Lý Căn Hộ Tích Hợp Trí Tuệ Nhân Tạo (HAVEN)</w:t>
       </w:r>
@@ -111,7 +123,7 @@
         <w:pBdr>
           <w:bottom w:val="single" w:sz="4" w:space="1" w:color="000000"/>
         </w:pBdr>
-        <w:spacing w:lineRule="auto" w:line="240" w:before="0" w:after="120"/>
+        <w:spacing w:lineRule="auto" w:line="276" w:before="0" w:after="80"/>
         <w:jc w:val="both"/>
         <w:rPr>
           <w:rFonts w:ascii="Times New Roman" w:hAnsi="Times New Roman" w:cs="Times New Roman"/>
@@ -121,8 +133,9 @@
       </w:pPr>
       <w:r>
         <w:rPr>
-          <w:rFonts w:cs="Times New Roman" w:ascii="Times New Roman" w:hAnsi="Times New Roman"/>
-          <w:sz w:val="26"/>
+          <w:rFonts w:cs="Times New Roman" w:ascii="Times New Roman" w:hAnsi="Times New Roman" w:eastAsia="Times New Roman"/>
+          <w:color w:val="0F172A"/>
+          <w:sz w:val="24"/>
           <w:szCs w:val="26"/>
         </w:rPr>
         <w:t>Thời gian thực hiện: Từ 27/07/2026 đến 27/09/2026 (9 tuần)</w:t>
@@ -152,7 +165,7 @@
     <w:p>
       <w:pPr>
         <w:pStyle w:val="Normal"/>
-        <w:spacing w:lineRule="auto" w:line="240" w:before="0" w:after="120"/>
+        <w:spacing w:lineRule="auto" w:line="276" w:before="0" w:after="80"/>
         <w:jc w:val="both"/>
         <w:rPr>
           <w:rFonts w:ascii="Times New Roman" w:hAnsi="Times New Roman" w:cs="Times New Roman"/>
@@ -163,9 +176,10 @@
       </w:pPr>
       <w:r>
         <w:rPr>
-          <w:rFonts w:cs="Times New Roman" w:ascii="Times New Roman" w:hAnsi="Times New Roman"/>
+          <w:rFonts w:cs="Times New Roman" w:ascii="Times New Roman" w:hAnsi="Times New Roman" w:eastAsia="Times New Roman"/>
           <w:b/>
-          <w:sz w:val="26"/>
+          <w:color w:val="0F172A"/>
+          <w:sz w:val="24"/>
           <w:szCs w:val="26"/>
         </w:rPr>
         <w:t>Kế hoạch chi tiết</w:t>
@@ -175,7 +189,7 @@
       <w:tblPr>
         <w:tblStyle w:val="TableGrid"/>
         <w:tblW w:w="5000" w:type="pct"/>
-        <w:jc w:val="start"/>
+        <w:jc w:val="center"/>
         <w:tblInd w:w="0" w:type="dxa"/>
         <w:tblLayout w:type="fixed"/>
         <w:tblCellMar>
@@ -185,6 +199,14 @@
           <w:end w:w="108" w:type="dxa"/>
         </w:tblCellMar>
         <w:tblLook w:val="04a0" w:firstRow="1" w:noVBand="1" w:lastRow="0" w:firstColumn="1" w:lastColumn="0" w:noHBand="0"/>
+        <w:tblBorders>
+          <w:top w:val="single" w:sz="4" w:space="0" w:color="CBD5E1"/>
+          <w:left w:val="single" w:sz="4" w:space="0" w:color="CBD5E1"/>
+          <w:bottom w:val="single" w:sz="4" w:space="0" w:color="CBD5E1"/>
+          <w:right w:val="single" w:sz="4" w:space="0" w:color="CBD5E1"/>
+          <w:insideH w:val="single" w:sz="4" w:space="0" w:color="CBD5E1"/>
+          <w:insideV w:val="single" w:sz="4" w:space="0" w:color="CBD5E1"/>
+        </w:tblBorders>
       </w:tblPr>
       <w:tblGrid>
         <w:gridCol w:w="1545"/>
@@ -196,17 +218,26 @@
         <w:trPr>
           <w:tblHeader w:val="true"/>
           <w:trHeight w:val="340" w:hRule="atLeast"/>
+          <w:cantSplit/>
         </w:trPr>
         <w:tc>
           <w:tcPr>
             <w:tcW w:w="1545" w:type="dxa"/>
             <w:tcBorders/>
+            <w:vAlign w:val="center"/>
+            <w:shd w:fill="1E3A8A"/>
+            <w:tcMar>
+              <w:top w:w="100" w:type="dxa"/>
+              <w:bottom w:w="100" w:type="dxa"/>
+              <w:left w:w="140" w:type="dxa"/>
+              <w:right w:w="140" w:type="dxa"/>
+            </w:tcMar>
           </w:tcPr>
           <w:p>
             <w:pPr>
               <w:pStyle w:val="Normal"/>
               <w:widowControl/>
-              <w:spacing w:lineRule="auto" w:line="240" w:before="0" w:after="0"/>
+              <w:spacing w:lineRule="auto" w:line="276" w:before="40" w:after="40"/>
               <w:jc w:val="center"/>
               <w:rPr>
                 <w:rFonts w:ascii="Times New Roman" w:hAnsi="Times New Roman" w:cs="Times New Roman"/>
@@ -218,11 +249,12 @@
             </w:pPr>
             <w:r>
               <w:rPr>
-                <w:rFonts w:eastAsia="Calibri" w:cs="Times New Roman" w:ascii="Times New Roman" w:hAnsi="Times New Roman"/>
-                <w:b/>
-                <w:i/>
+                <w:rFonts w:eastAsia="Times New Roman" w:cs="Times New Roman" w:ascii="Times New Roman" w:hAnsi="Times New Roman"/>
+                <w:b/>
+                <w:i w:val="0"/>
+                <w:color w:val="FFFFFF"/>
                 <w:kern w:val="0"/>
-                <w:sz w:val="26"/>
+                <w:sz w:val="21"/>
                 <w:szCs w:val="26"/>
                 <w:lang w:val="en-US" w:eastAsia="en-US" w:bidi="ar-SA"/>
               </w:rPr>
@@ -233,12 +265,20 @@
           <w:tcPr>
             <w:tcW w:w="3456" w:type="dxa"/>
             <w:tcBorders/>
+            <w:vAlign w:val="center"/>
+            <w:shd w:fill="1E3A8A"/>
+            <w:tcMar>
+              <w:top w:w="100" w:type="dxa"/>
+              <w:bottom w:w="100" w:type="dxa"/>
+              <w:left w:w="140" w:type="dxa"/>
+              <w:right w:w="140" w:type="dxa"/>
+            </w:tcMar>
           </w:tcPr>
           <w:p>
             <w:pPr>
               <w:pStyle w:val="Normal"/>
               <w:widowControl/>
-              <w:spacing w:lineRule="auto" w:line="240" w:before="0" w:after="0"/>
+              <w:spacing w:lineRule="auto" w:line="276" w:before="40" w:after="40"/>
               <w:jc w:val="center"/>
               <w:rPr>
                 <w:rFonts w:ascii="Times New Roman" w:hAnsi="Times New Roman" w:cs="Times New Roman"/>
@@ -250,11 +290,12 @@
             </w:pPr>
             <w:r>
               <w:rPr>
-                <w:rFonts w:eastAsia="Calibri" w:cs="Times New Roman" w:ascii="Times New Roman" w:hAnsi="Times New Roman"/>
-                <w:b/>
-                <w:i/>
+                <w:rFonts w:eastAsia="Times New Roman" w:cs="Times New Roman" w:ascii="Times New Roman" w:hAnsi="Times New Roman"/>
+                <w:b/>
+                <w:i w:val="0"/>
+                <w:color w:val="FFFFFF"/>
                 <w:kern w:val="0"/>
-                <w:sz w:val="26"/>
+                <w:sz w:val="21"/>
                 <w:szCs w:val="26"/>
                 <w:lang w:val="en-US" w:eastAsia="en-US" w:bidi="ar-SA"/>
               </w:rPr>
@@ -266,12 +307,20 @@
           <w:tcPr>
             <w:tcW w:w="2281" w:type="dxa"/>
             <w:tcBorders/>
+            <w:vAlign w:val="center"/>
+            <w:shd w:fill="1E3A8A"/>
+            <w:tcMar>
+              <w:top w:w="100" w:type="dxa"/>
+              <w:bottom w:w="100" w:type="dxa"/>
+              <w:left w:w="140" w:type="dxa"/>
+              <w:right w:w="140" w:type="dxa"/>
+            </w:tcMar>
           </w:tcPr>
           <w:p>
             <w:pPr>
               <w:pStyle w:val="Normal"/>
               <w:widowControl/>
-              <w:spacing w:lineRule="auto" w:line="240" w:before="0" w:after="0"/>
+              <w:spacing w:lineRule="auto" w:line="276" w:before="40" w:after="40"/>
               <w:jc w:val="center"/>
               <w:rPr>
                 <w:rFonts w:ascii="Times New Roman" w:hAnsi="Times New Roman" w:cs="Times New Roman"/>
@@ -283,11 +332,12 @@
             </w:pPr>
             <w:r>
               <w:rPr>
-                <w:rFonts w:eastAsia="Calibri" w:cs="Times New Roman" w:ascii="Times New Roman" w:hAnsi="Times New Roman"/>
-                <w:b/>
-                <w:i/>
+                <w:rFonts w:eastAsia="Times New Roman" w:cs="Times New Roman" w:ascii="Times New Roman" w:hAnsi="Times New Roman"/>
+                <w:b/>
+                <w:i w:val="0"/>
+                <w:color w:val="FFFFFF"/>
                 <w:kern w:val="0"/>
-                <w:sz w:val="26"/>
+                <w:sz w:val="21"/>
                 <w:szCs w:val="26"/>
                 <w:lang w:val="en-US" w:eastAsia="en-US" w:bidi="ar-SA"/>
               </w:rPr>
@@ -299,12 +349,20 @@
           <w:tcPr>
             <w:tcW w:w="1789" w:type="dxa"/>
             <w:tcBorders/>
+            <w:vAlign w:val="center"/>
+            <w:shd w:fill="1E3A8A"/>
+            <w:tcMar>
+              <w:top w:w="100" w:type="dxa"/>
+              <w:bottom w:w="100" w:type="dxa"/>
+              <w:left w:w="140" w:type="dxa"/>
+              <w:right w:w="140" w:type="dxa"/>
+            </w:tcMar>
           </w:tcPr>
           <w:p>
             <w:pPr>
               <w:pStyle w:val="Normal"/>
               <w:widowControl/>
-              <w:spacing w:lineRule="auto" w:line="240" w:before="0" w:after="0"/>
+              <w:spacing w:lineRule="auto" w:line="276" w:before="40" w:after="40"/>
               <w:jc w:val="center"/>
               <w:rPr>
                 <w:rFonts w:ascii="Times New Roman" w:hAnsi="Times New Roman" w:cs="Times New Roman"/>
@@ -316,11 +374,12 @@
             </w:pPr>
             <w:r>
               <w:rPr>
-                <w:rFonts w:eastAsia="Calibri" w:cs="Times New Roman" w:ascii="Times New Roman" w:hAnsi="Times New Roman"/>
-                <w:b/>
-                <w:i/>
+                <w:rFonts w:eastAsia="Times New Roman" w:cs="Times New Roman" w:ascii="Times New Roman" w:hAnsi="Times New Roman"/>
+                <w:b/>
+                <w:i w:val="0"/>
+                <w:color w:val="FFFFFF"/>
                 <w:kern w:val="0"/>
-                <w:sz w:val="26"/>
+                <w:sz w:val="21"/>
                 <w:szCs w:val="26"/>
                 <w:lang w:val="en-US" w:eastAsia="en-US" w:bidi="ar-SA"/>
               </w:rPr>
@@ -332,6 +391,7 @@
       <w:tr>
         <w:trPr>
           <w:trHeight w:val="340" w:hRule="atLeast"/>
+          <w:cantSplit/>
         </w:trPr>
         <w:tc>
           <w:tcPr>
@@ -339,9 +399,25 @@
             <w:vMerge w:val="restart"/>
             <w:tcBorders/>
             <w:vAlign w:val="center"/>
-          </w:tcPr>
-          <w:p>
-            <w:r>
+            <w:shd w:fill="FFFFFF"/>
+            <w:tcMar>
+              <w:top w:w="100" w:type="dxa"/>
+              <w:bottom w:w="100" w:type="dxa"/>
+              <w:left w:w="140" w:type="dxa"/>
+              <w:right w:w="140" w:type="dxa"/>
+            </w:tcMar>
+          </w:tcPr>
+          <w:p>
+            <w:pPr>
+              <w:spacing w:line="276" w:lineRule="auto" w:after="40" w:before="40"/>
+              <w:jc w:val="center"/>
+            </w:pPr>
+            <w:r>
+              <w:rPr>
+                <w:rFonts w:ascii="Times New Roman" w:hAnsi="Times New Roman" w:cs="Times New Roman" w:eastAsia="Times New Roman"/>
+                <w:color w:val="0F172A"/>
+                <w:sz w:val="21"/>
+              </w:rPr>
               <w:t>5</w:t>
             </w:r>
           </w:p>
@@ -353,9 +429,25 @@
               <w:bottom w:val="dotted" w:sz="4" w:space="0" w:color="000000"/>
             </w:tcBorders>
             <w:vAlign w:val="center"/>
-          </w:tcPr>
-          <w:p>
-            <w:r>
+            <w:shd w:fill="FFFFFF"/>
+            <w:tcMar>
+              <w:top w:w="100" w:type="dxa"/>
+              <w:bottom w:w="100" w:type="dxa"/>
+              <w:left w:w="140" w:type="dxa"/>
+              <w:right w:w="140" w:type="dxa"/>
+            </w:tcMar>
+          </w:tcPr>
+          <w:p>
+            <w:pPr>
+              <w:spacing w:line="276" w:lineRule="auto" w:after="40" w:before="40"/>
+              <w:jc w:val="center"/>
+            </w:pPr>
+            <w:r>
+              <w:rPr>
+                <w:rFonts w:ascii="Times New Roman" w:hAnsi="Times New Roman" w:cs="Times New Roman" w:eastAsia="Times New Roman"/>
+                <w:color w:val="0F172A"/>
+                <w:sz w:val="21"/>
+              </w:rPr>
               <w:t>Tuần 01 (Từ: 27/07/2026 Đến: 02/08/2026)</w:t>
             </w:r>
           </w:p>
@@ -367,9 +459,24 @@
               <w:bottom w:val="dotted" w:sz="4" w:space="0" w:color="000000"/>
             </w:tcBorders>
             <w:vAlign w:val="center"/>
-          </w:tcPr>
-          <w:p>
-            <w:r>
+            <w:shd w:fill="FFFFFF"/>
+            <w:tcMar>
+              <w:top w:w="100" w:type="dxa"/>
+              <w:bottom w:w="100" w:type="dxa"/>
+              <w:left w:w="140" w:type="dxa"/>
+              <w:right w:w="140" w:type="dxa"/>
+            </w:tcMar>
+          </w:tcPr>
+          <w:p>
+            <w:pPr>
+              <w:spacing w:line="276" w:lineRule="auto" w:after="40" w:before="40"/>
+            </w:pPr>
+            <w:r>
+              <w:rPr>
+                <w:rFonts w:ascii="Times New Roman" w:hAnsi="Times New Roman" w:cs="Times New Roman" w:eastAsia="Times New Roman"/>
+                <w:color w:val="0F172A"/>
+                <w:sz w:val="21"/>
+              </w:rPr>
               <w:t>Khảo sát thị trường BĐS cho thuê, phân tích các bất cập thực tế (chi phí ẩn, ngập lụt, rủi ro PCCC, quỵt cọc, tin ảo). (Sản phẩm: Báo cáo khảo sát thị trường)</w:t>
             </w:r>
           </w:p>
@@ -380,9 +487,25 @@
             <w:tcBorders>
               <w:bottom w:val="dotted" w:sz="4" w:space="0" w:color="000000"/>
             </w:tcBorders>
-          </w:tcPr>
-          <w:p>
-            <w:r>
+            <w:vAlign w:val="center"/>
+            <w:shd w:fill="FFFFFF"/>
+            <w:tcMar>
+              <w:top w:w="100" w:type="dxa"/>
+              <w:bottom w:w="100" w:type="dxa"/>
+              <w:left w:w="140" w:type="dxa"/>
+              <w:right w:w="140" w:type="dxa"/>
+            </w:tcMar>
+          </w:tcPr>
+          <w:p>
+            <w:pPr>
+              <w:spacing w:line="276" w:lineRule="auto" w:after="40" w:before="40"/>
+            </w:pPr>
+            <w:r>
+              <w:rPr>
+                <w:rFonts w:ascii="Times New Roman" w:hAnsi="Times New Roman" w:cs="Times New Roman" w:eastAsia="Times New Roman"/>
+                <w:color w:val="0F172A"/>
+                <w:sz w:val="21"/>
+              </w:rPr>
               <w:t>Vũ Ngọc Sơn</w:t>
             </w:r>
           </w:p>
@@ -391,6 +514,7 @@
       <w:tr>
         <w:trPr>
           <w:trHeight w:val="340" w:hRule="atLeast"/>
+          <w:cantSplit/>
         </w:trPr>
         <w:tc>
           <w:tcPr>
@@ -432,9 +556,25 @@
               <w:bottom w:val="dotted" w:sz="4" w:space="0" w:color="000000"/>
             </w:tcBorders>
             <w:vAlign w:val="center"/>
-          </w:tcPr>
-          <w:p>
-            <w:r>
+            <w:shd w:fill="F8FAFC"/>
+            <w:tcMar>
+              <w:top w:w="100" w:type="dxa"/>
+              <w:bottom w:w="100" w:type="dxa"/>
+              <w:left w:w="140" w:type="dxa"/>
+              <w:right w:w="140" w:type="dxa"/>
+            </w:tcMar>
+          </w:tcPr>
+          <w:p>
+            <w:pPr>
+              <w:spacing w:line="276" w:lineRule="auto" w:after="40" w:before="40"/>
+              <w:jc w:val="center"/>
+            </w:pPr>
+            <w:r>
+              <w:rPr>
+                <w:rFonts w:ascii="Times New Roman" w:hAnsi="Times New Roman" w:cs="Times New Roman" w:eastAsia="Times New Roman"/>
+                <w:color w:val="0F172A"/>
+                <w:sz w:val="21"/>
+              </w:rPr>
               <w:t>Tuần 01 (Từ: 27/07/2026 Đến: 02/08/2026)</w:t>
             </w:r>
           </w:p>
@@ -447,9 +587,24 @@
               <w:bottom w:val="dotted" w:sz="4" w:space="0" w:color="000000"/>
             </w:tcBorders>
             <w:vAlign w:val="center"/>
-          </w:tcPr>
-          <w:p>
-            <w:r>
+            <w:shd w:fill="F8FAFC"/>
+            <w:tcMar>
+              <w:top w:w="100" w:type="dxa"/>
+              <w:bottom w:w="100" w:type="dxa"/>
+              <w:left w:w="140" w:type="dxa"/>
+              <w:right w:w="140" w:type="dxa"/>
+            </w:tcMar>
+          </w:tcPr>
+          <w:p>
+            <w:pPr>
+              <w:spacing w:line="276" w:lineRule="auto" w:after="40" w:before="40"/>
+            </w:pPr>
+            <w:r>
+              <w:rPr>
+                <w:rFonts w:ascii="Times New Roman" w:hAnsi="Times New Roman" w:cs="Times New Roman" w:eastAsia="Times New Roman"/>
+                <w:color w:val="0F172A"/>
+                <w:sz w:val="21"/>
+              </w:rPr>
               <w:t>Xác định mục tiêu hệ thống HAVEN và phạm vi ứng dụng GenAI trong giải quyết bài toán. (Sản phẩm: Đề cương bài toán AI)</w:t>
             </w:r>
           </w:p>
@@ -461,9 +616,25 @@
               <w:top w:val="dotted" w:sz="4" w:space="0" w:color="000000"/>
               <w:bottom w:val="dotted" w:sz="4" w:space="0" w:color="000000"/>
             </w:tcBorders>
-          </w:tcPr>
-          <w:p>
-            <w:r>
+            <w:vAlign w:val="center"/>
+            <w:shd w:fill="F8FAFC"/>
+            <w:tcMar>
+              <w:top w:w="100" w:type="dxa"/>
+              <w:bottom w:w="100" w:type="dxa"/>
+              <w:left w:w="140" w:type="dxa"/>
+              <w:right w:w="140" w:type="dxa"/>
+            </w:tcMar>
+          </w:tcPr>
+          <w:p>
+            <w:pPr>
+              <w:spacing w:line="276" w:lineRule="auto" w:after="40" w:before="40"/>
+            </w:pPr>
+            <w:r>
+              <w:rPr>
+                <w:rFonts w:ascii="Times New Roman" w:hAnsi="Times New Roman" w:cs="Times New Roman" w:eastAsia="Times New Roman"/>
+                <w:color w:val="0F172A"/>
+                <w:sz w:val="21"/>
+              </w:rPr>
               <w:t>Vũ Bảo Linh</w:t>
             </w:r>
           </w:p>
@@ -472,6 +643,7 @@
       <w:tr>
         <w:trPr>
           <w:trHeight w:val="340" w:hRule="atLeast"/>
+          <w:cantSplit/>
         </w:trPr>
         <w:tc>
           <w:tcPr>
@@ -513,9 +685,25 @@
               <w:bottom w:val="dotted" w:sz="4" w:space="0" w:color="000000"/>
             </w:tcBorders>
             <w:vAlign w:val="center"/>
-          </w:tcPr>
-          <w:p>
-            <w:r>
+            <w:shd w:fill="FFFFFF"/>
+            <w:tcMar>
+              <w:top w:w="100" w:type="dxa"/>
+              <w:bottom w:w="100" w:type="dxa"/>
+              <w:left w:w="140" w:type="dxa"/>
+              <w:right w:w="140" w:type="dxa"/>
+            </w:tcMar>
+          </w:tcPr>
+          <w:p>
+            <w:pPr>
+              <w:spacing w:line="276" w:lineRule="auto" w:after="40" w:before="40"/>
+              <w:jc w:val="center"/>
+            </w:pPr>
+            <w:r>
+              <w:rPr>
+                <w:rFonts w:ascii="Times New Roman" w:hAnsi="Times New Roman" w:cs="Times New Roman" w:eastAsia="Times New Roman"/>
+                <w:color w:val="0F172A"/>
+                <w:sz w:val="21"/>
+              </w:rPr>
               <w:t>Tuần 01 (Từ: 27/07/2026 Đến: 02/08/2026)</w:t>
             </w:r>
           </w:p>
@@ -528,9 +716,25 @@
               <w:bottom w:val="dotted" w:sz="4" w:space="0" w:color="000000"/>
             </w:tcBorders>
             <w:vAlign w:val="center"/>
-          </w:tcPr>
-          <w:p>
-            <w:r>
+            <w:shd w:fill="FFFFFF"/>
+            <w:tcMar>
+              <w:top w:w="100" w:type="dxa"/>
+              <w:bottom w:w="100" w:type="dxa"/>
+              <w:left w:w="140" w:type="dxa"/>
+              <w:right w:w="140" w:type="dxa"/>
+            </w:tcMar>
+          </w:tcPr>
+          <w:p>
+            <w:pPr>
+              <w:spacing w:line="276" w:lineRule="auto" w:after="40" w:before="40"/>
+              <w:jc w:val="center"/>
+            </w:pPr>
+            <w:r>
+              <w:rPr>
+                <w:rFonts w:ascii="Times New Roman" w:hAnsi="Times New Roman" w:cs="Times New Roman" w:eastAsia="Times New Roman"/>
+                <w:color w:val="0F172A"/>
+                <w:sz w:val="21"/>
+              </w:rPr>
               <w:t>Lập kế hoạch tổng thể 9 tuần và phân công vai trò 4 thành viên trong nhóm. (Sản phẩm: Kế hoạch 9 tuần)</w:t>
             </w:r>
           </w:p>
@@ -542,9 +746,25 @@
               <w:top w:val="dotted" w:sz="4" w:space="0" w:color="000000"/>
               <w:bottom w:val="dotted" w:sz="4" w:space="0" w:color="000000"/>
             </w:tcBorders>
-          </w:tcPr>
-          <w:p>
-            <w:r>
+            <w:vAlign w:val="center"/>
+            <w:shd w:fill="FFFFFF"/>
+            <w:tcMar>
+              <w:top w:w="100" w:type="dxa"/>
+              <w:bottom w:w="100" w:type="dxa"/>
+              <w:left w:w="140" w:type="dxa"/>
+              <w:right w:w="140" w:type="dxa"/>
+            </w:tcMar>
+          </w:tcPr>
+          <w:p>
+            <w:pPr>
+              <w:spacing w:line="276" w:lineRule="auto" w:after="40" w:before="40"/>
+            </w:pPr>
+            <w:r>
+              <w:rPr>
+                <w:rFonts w:ascii="Times New Roman" w:hAnsi="Times New Roman" w:cs="Times New Roman" w:eastAsia="Times New Roman"/>
+                <w:color w:val="0F172A"/>
+                <w:sz w:val="21"/>
+              </w:rPr>
               <w:t>Tô Văn Quyền</w:t>
             </w:r>
           </w:p>
@@ -553,6 +773,7 @@
       <w:tr>
         <w:trPr>
           <w:trHeight w:val="340" w:hRule="atLeast"/>
+          <w:cantSplit/>
         </w:trPr>
         <w:tc>
           <w:tcPr>
@@ -594,9 +815,25 @@
               <w:bottom w:val="dotted" w:sz="4" w:space="0" w:color="000000"/>
             </w:tcBorders>
             <w:vAlign w:val="center"/>
-          </w:tcPr>
-          <w:p>
-            <w:r>
+            <w:shd w:fill="F8FAFC"/>
+            <w:tcMar>
+              <w:top w:w="100" w:type="dxa"/>
+              <w:bottom w:w="100" w:type="dxa"/>
+              <w:left w:w="140" w:type="dxa"/>
+              <w:right w:w="140" w:type="dxa"/>
+            </w:tcMar>
+          </w:tcPr>
+          <w:p>
+            <w:pPr>
+              <w:spacing w:line="276" w:lineRule="auto" w:after="40" w:before="40"/>
+              <w:jc w:val="center"/>
+            </w:pPr>
+            <w:r>
+              <w:rPr>
+                <w:rFonts w:ascii="Times New Roman" w:hAnsi="Times New Roman" w:cs="Times New Roman" w:eastAsia="Times New Roman"/>
+                <w:color w:val="0F172A"/>
+                <w:sz w:val="21"/>
+              </w:rPr>
               <w:t>Tuần 01 (Từ: 27/07/2026 Đến: 02/08/2026)</w:t>
             </w:r>
           </w:p>
@@ -609,9 +846,24 @@
               <w:bottom w:val="dotted" w:sz="4" w:space="0" w:color="000000"/>
             </w:tcBorders>
             <w:vAlign w:val="center"/>
-          </w:tcPr>
-          <w:p>
-            <w:r>
+            <w:shd w:fill="F8FAFC"/>
+            <w:tcMar>
+              <w:top w:w="100" w:type="dxa"/>
+              <w:bottom w:w="100" w:type="dxa"/>
+              <w:left w:w="140" w:type="dxa"/>
+              <w:right w:w="140" w:type="dxa"/>
+            </w:tcMar>
+          </w:tcPr>
+          <w:p>
+            <w:pPr>
+              <w:spacing w:line="276" w:lineRule="auto" w:after="40" w:before="40"/>
+            </w:pPr>
+            <w:r>
+              <w:rPr>
+                <w:rFonts w:ascii="Times New Roman" w:hAnsi="Times New Roman" w:cs="Times New Roman" w:eastAsia="Times New Roman"/>
+                <w:color w:val="0F172A"/>
+                <w:sz w:val="21"/>
+              </w:rPr>
               <w:t>Thiết lập quy trình làm việc Git, Antigravity Workspace và chuẩn tài liệu hóa. (Sản phẩm: Setup repo &amp; workspace)</w:t>
             </w:r>
           </w:p>
@@ -623,9 +875,25 @@
               <w:top w:val="dotted" w:sz="4" w:space="0" w:color="000000"/>
               <w:bottom w:val="dotted" w:sz="4" w:space="0" w:color="000000"/>
             </w:tcBorders>
-          </w:tcPr>
-          <w:p>
-            <w:r>
+            <w:vAlign w:val="center"/>
+            <w:shd w:fill="F8FAFC"/>
+            <w:tcMar>
+              <w:top w:w="100" w:type="dxa"/>
+              <w:bottom w:w="100" w:type="dxa"/>
+              <w:left w:w="140" w:type="dxa"/>
+              <w:right w:w="140" w:type="dxa"/>
+            </w:tcMar>
+          </w:tcPr>
+          <w:p>
+            <w:pPr>
+              <w:spacing w:line="276" w:lineRule="auto" w:after="40" w:before="40"/>
+            </w:pPr>
+            <w:r>
+              <w:rPr>
+                <w:rFonts w:ascii="Times New Roman" w:hAnsi="Times New Roman" w:cs="Times New Roman" w:eastAsia="Times New Roman"/>
+                <w:color w:val="0F172A"/>
+                <w:sz w:val="21"/>
+              </w:rPr>
               <w:t>Lê Bình Nguyên</w:t>
             </w:r>
           </w:p>
@@ -634,6 +902,7 @@
       <w:tr>
         <w:trPr>
           <w:trHeight w:val="340" w:hRule="atLeast"/>
+          <w:cantSplit/>
         </w:trPr>
         <w:tc>
           <w:tcPr>
@@ -672,9 +941,25 @@
               <w:top w:val="dotted" w:sz="4" w:space="0" w:color="000000"/>
             </w:tcBorders>
             <w:vAlign w:val="center"/>
-          </w:tcPr>
-          <w:p>
-            <w:r>
+            <w:shd w:fill="FFFFFF"/>
+            <w:tcMar>
+              <w:top w:w="100" w:type="dxa"/>
+              <w:bottom w:w="100" w:type="dxa"/>
+              <w:left w:w="140" w:type="dxa"/>
+              <w:right w:w="140" w:type="dxa"/>
+            </w:tcMar>
+          </w:tcPr>
+          <w:p>
+            <w:pPr>
+              <w:spacing w:line="276" w:lineRule="auto" w:after="40" w:before="40"/>
+              <w:jc w:val="center"/>
+            </w:pPr>
+            <w:r>
+              <w:rPr>
+                <w:rFonts w:ascii="Times New Roman" w:hAnsi="Times New Roman" w:cs="Times New Roman" w:eastAsia="Times New Roman"/>
+                <w:color w:val="0F172A"/>
+                <w:sz w:val="21"/>
+              </w:rPr>
               <w:t>Tuần 01 (Từ: 27/07/2026 Đến: 02/08/2026)</w:t>
             </w:r>
           </w:p>
@@ -686,9 +971,25 @@
               <w:top w:val="dotted" w:sz="4" w:space="0" w:color="000000"/>
             </w:tcBorders>
             <w:vAlign w:val="center"/>
-          </w:tcPr>
-          <w:p>
-            <w:r>
+            <w:shd w:fill="FFFFFF"/>
+            <w:tcMar>
+              <w:top w:w="100" w:type="dxa"/>
+              <w:bottom w:w="100" w:type="dxa"/>
+              <w:left w:w="140" w:type="dxa"/>
+              <w:right w:w="140" w:type="dxa"/>
+            </w:tcMar>
+          </w:tcPr>
+          <w:p>
+            <w:pPr>
+              <w:spacing w:line="276" w:lineRule="auto" w:after="40" w:before="40"/>
+              <w:jc w:val="center"/>
+            </w:pPr>
+            <w:r>
+              <w:rPr>
+                <w:rFonts w:ascii="Times New Roman" w:hAnsi="Times New Roman" w:cs="Times New Roman" w:eastAsia="Times New Roman"/>
+                <w:color w:val="0F172A"/>
+                <w:sz w:val="21"/>
+              </w:rPr>
               <w:t>Họp nhóm tổng kết tuần 1 và thống nhất bảng phạm vi tính năng (Product Scope). (Sản phẩm: Biên bản họp tuần 1)</w:t>
             </w:r>
           </w:p>
@@ -699,9 +1000,25 @@
             <w:tcBorders>
               <w:top w:val="dotted" w:sz="4" w:space="0" w:color="000000"/>
             </w:tcBorders>
-          </w:tcPr>
-          <w:p>
-            <w:r>
+            <w:vAlign w:val="center"/>
+            <w:shd w:fill="FFFFFF"/>
+            <w:tcMar>
+              <w:top w:w="100" w:type="dxa"/>
+              <w:bottom w:w="100" w:type="dxa"/>
+              <w:left w:w="140" w:type="dxa"/>
+              <w:right w:w="140" w:type="dxa"/>
+            </w:tcMar>
+          </w:tcPr>
+          <w:p>
+            <w:pPr>
+              <w:spacing w:line="276" w:lineRule="auto" w:after="40" w:before="40"/>
+            </w:pPr>
+            <w:r>
+              <w:rPr>
+                <w:rFonts w:ascii="Times New Roman" w:hAnsi="Times New Roman" w:cs="Times New Roman" w:eastAsia="Times New Roman"/>
+                <w:color w:val="0F172A"/>
+                <w:sz w:val="21"/>
+              </w:rPr>
               <w:t>Cả nhóm</w:t>
             </w:r>
           </w:p>
@@ -710,6 +1027,7 @@
       <w:tr>
         <w:trPr>
           <w:trHeight w:val="340" w:hRule="atLeast"/>
+          <w:cantSplit/>
         </w:trPr>
         <w:tc>
           <w:tcPr>
@@ -717,9 +1035,25 @@
             <w:vMerge w:val="restart"/>
             <w:tcBorders/>
             <w:vAlign w:val="center"/>
-          </w:tcPr>
-          <w:p>
-            <w:r>
+            <w:shd w:fill="F8FAFC"/>
+            <w:tcMar>
+              <w:top w:w="100" w:type="dxa"/>
+              <w:bottom w:w="100" w:type="dxa"/>
+              <w:left w:w="140" w:type="dxa"/>
+              <w:right w:w="140" w:type="dxa"/>
+            </w:tcMar>
+          </w:tcPr>
+          <w:p>
+            <w:pPr>
+              <w:spacing w:line="276" w:lineRule="auto" w:after="40" w:before="40"/>
+              <w:jc w:val="center"/>
+            </w:pPr>
+            <w:r>
+              <w:rPr>
+                <w:rFonts w:ascii="Times New Roman" w:hAnsi="Times New Roman" w:cs="Times New Roman" w:eastAsia="Times New Roman"/>
+                <w:color w:val="0F172A"/>
+                <w:sz w:val="21"/>
+              </w:rPr>
               <w:t>10</w:t>
             </w:r>
           </w:p>
@@ -731,9 +1065,25 @@
               <w:bottom w:val="dotted" w:sz="4" w:space="0" w:color="000000"/>
             </w:tcBorders>
             <w:vAlign w:val="center"/>
-          </w:tcPr>
-          <w:p>
-            <w:r>
+            <w:shd w:fill="F8FAFC"/>
+            <w:tcMar>
+              <w:top w:w="100" w:type="dxa"/>
+              <w:bottom w:w="100" w:type="dxa"/>
+              <w:left w:w="140" w:type="dxa"/>
+              <w:right w:w="140" w:type="dxa"/>
+            </w:tcMar>
+          </w:tcPr>
+          <w:p>
+            <w:pPr>
+              <w:spacing w:line="276" w:lineRule="auto" w:after="40" w:before="40"/>
+              <w:jc w:val="center"/>
+            </w:pPr>
+            <w:r>
+              <w:rPr>
+                <w:rFonts w:ascii="Times New Roman" w:hAnsi="Times New Roman" w:cs="Times New Roman" w:eastAsia="Times New Roman"/>
+                <w:color w:val="0F172A"/>
+                <w:sz w:val="21"/>
+              </w:rPr>
               <w:t>Tuần 02 (Từ: 03/08/2026 Đến: 09/08/2026)</w:t>
             </w:r>
           </w:p>
@@ -745,9 +1095,24 @@
               <w:bottom w:val="dotted" w:sz="4" w:space="0" w:color="000000"/>
             </w:tcBorders>
             <w:vAlign w:val="center"/>
-          </w:tcPr>
-          <w:p>
-            <w:r>
+            <w:shd w:fill="F8FAFC"/>
+            <w:tcMar>
+              <w:top w:w="100" w:type="dxa"/>
+              <w:bottom w:w="100" w:type="dxa"/>
+              <w:left w:w="140" w:type="dxa"/>
+              <w:right w:w="140" w:type="dxa"/>
+            </w:tcMar>
+          </w:tcPr>
+          <w:p>
+            <w:pPr>
+              <w:spacing w:line="276" w:lineRule="auto" w:after="40" w:before="40"/>
+            </w:pPr>
+            <w:r>
+              <w:rPr>
+                <w:rFonts w:ascii="Times New Roman" w:hAnsi="Times New Roman" w:cs="Times New Roman" w:eastAsia="Times New Roman"/>
+                <w:color w:val="0F172A"/>
+                <w:sz w:val="21"/>
+              </w:rPr>
               <w:t>Xây dựng bảng 20 câu hỏi phỏng vấn thu thập yêu cầu người dùng (Tenant &amp; Landlord). (Sản phẩm: Bộ 20 câu hỏi Q&amp;A)</w:t>
             </w:r>
           </w:p>
@@ -758,9 +1123,25 @@
             <w:tcBorders>
               <w:bottom w:val="dotted" w:sz="4" w:space="0" w:color="000000"/>
             </w:tcBorders>
-          </w:tcPr>
-          <w:p>
-            <w:r>
+            <w:vAlign w:val="center"/>
+            <w:shd w:fill="F8FAFC"/>
+            <w:tcMar>
+              <w:top w:w="100" w:type="dxa"/>
+              <w:bottom w:w="100" w:type="dxa"/>
+              <w:left w:w="140" w:type="dxa"/>
+              <w:right w:w="140" w:type="dxa"/>
+            </w:tcMar>
+          </w:tcPr>
+          <w:p>
+            <w:pPr>
+              <w:spacing w:line="276" w:lineRule="auto" w:after="40" w:before="40"/>
+            </w:pPr>
+            <w:r>
+              <w:rPr>
+                <w:rFonts w:ascii="Times New Roman" w:hAnsi="Times New Roman" w:cs="Times New Roman" w:eastAsia="Times New Roman"/>
+                <w:color w:val="0F172A"/>
+                <w:sz w:val="21"/>
+              </w:rPr>
               <w:t>Vũ Ngọc Sơn</w:t>
             </w:r>
           </w:p>
@@ -769,6 +1150,7 @@
       <w:tr>
         <w:trPr>
           <w:trHeight w:val="340" w:hRule="atLeast"/>
+          <w:cantSplit/>
         </w:trPr>
         <w:tc>
           <w:tcPr>
@@ -810,9 +1192,25 @@
               <w:bottom w:val="dotted" w:sz="4" w:space="0" w:color="000000"/>
             </w:tcBorders>
             <w:vAlign w:val="center"/>
-          </w:tcPr>
-          <w:p>
-            <w:r>
+            <w:shd w:fill="FFFFFF"/>
+            <w:tcMar>
+              <w:top w:w="100" w:type="dxa"/>
+              <w:bottom w:w="100" w:type="dxa"/>
+              <w:left w:w="140" w:type="dxa"/>
+              <w:right w:w="140" w:type="dxa"/>
+            </w:tcMar>
+          </w:tcPr>
+          <w:p>
+            <w:pPr>
+              <w:spacing w:line="276" w:lineRule="auto" w:after="40" w:before="40"/>
+              <w:jc w:val="center"/>
+            </w:pPr>
+            <w:r>
+              <w:rPr>
+                <w:rFonts w:ascii="Times New Roman" w:hAnsi="Times New Roman" w:cs="Times New Roman" w:eastAsia="Times New Roman"/>
+                <w:color w:val="0F172A"/>
+                <w:sz w:val="21"/>
+              </w:rPr>
               <w:t>Tuần 02 (Từ: 03/08/2026 Đến: 09/08/2026)</w:t>
             </w:r>
           </w:p>
@@ -825,9 +1223,24 @@
               <w:bottom w:val="dotted" w:sz="4" w:space="0" w:color="000000"/>
             </w:tcBorders>
             <w:vAlign w:val="center"/>
-          </w:tcPr>
-          <w:p>
-            <w:r>
+            <w:shd w:fill="FFFFFF"/>
+            <w:tcMar>
+              <w:top w:w="100" w:type="dxa"/>
+              <w:bottom w:w="100" w:type="dxa"/>
+              <w:left w:w="140" w:type="dxa"/>
+              <w:right w:w="140" w:type="dxa"/>
+            </w:tcMar>
+          </w:tcPr>
+          <w:p>
+            <w:pPr>
+              <w:spacing w:line="276" w:lineRule="auto" w:after="40" w:before="40"/>
+            </w:pPr>
+            <w:r>
+              <w:rPr>
+                <w:rFonts w:ascii="Times New Roman" w:hAnsi="Times New Roman" w:cs="Times New Roman" w:eastAsia="Times New Roman"/>
+                <w:color w:val="0F172A"/>
+                <w:sz w:val="21"/>
+              </w:rPr>
               <w:t>Phân loại danh mục Yêu cầu Chức năng (Functional) và Phi chức năng (Non-Functional). (Sản phẩm: Bảng phân loại yêu cầu)</w:t>
             </w:r>
           </w:p>
@@ -839,9 +1252,25 @@
               <w:top w:val="dotted" w:sz="4" w:space="0" w:color="000000"/>
               <w:bottom w:val="dotted" w:sz="4" w:space="0" w:color="000000"/>
             </w:tcBorders>
-          </w:tcPr>
-          <w:p>
-            <w:r>
+            <w:vAlign w:val="center"/>
+            <w:shd w:fill="FFFFFF"/>
+            <w:tcMar>
+              <w:top w:w="100" w:type="dxa"/>
+              <w:bottom w:w="100" w:type="dxa"/>
+              <w:left w:w="140" w:type="dxa"/>
+              <w:right w:w="140" w:type="dxa"/>
+            </w:tcMar>
+          </w:tcPr>
+          <w:p>
+            <w:pPr>
+              <w:spacing w:line="276" w:lineRule="auto" w:after="40" w:before="40"/>
+            </w:pPr>
+            <w:r>
+              <w:rPr>
+                <w:rFonts w:ascii="Times New Roman" w:hAnsi="Times New Roman" w:cs="Times New Roman" w:eastAsia="Times New Roman"/>
+                <w:color w:val="0F172A"/>
+                <w:sz w:val="21"/>
+              </w:rPr>
               <w:t>Vũ Bảo Linh</w:t>
             </w:r>
           </w:p>
@@ -850,6 +1279,7 @@
       <w:tr>
         <w:trPr>
           <w:trHeight w:val="340" w:hRule="atLeast"/>
+          <w:cantSplit/>
         </w:trPr>
         <w:tc>
           <w:tcPr>
@@ -891,9 +1321,25 @@
               <w:bottom w:val="dotted" w:sz="4" w:space="0" w:color="000000"/>
             </w:tcBorders>
             <w:vAlign w:val="center"/>
-          </w:tcPr>
-          <w:p>
-            <w:r>
+            <w:shd w:fill="F8FAFC"/>
+            <w:tcMar>
+              <w:top w:w="100" w:type="dxa"/>
+              <w:bottom w:w="100" w:type="dxa"/>
+              <w:left w:w="140" w:type="dxa"/>
+              <w:right w:w="140" w:type="dxa"/>
+            </w:tcMar>
+          </w:tcPr>
+          <w:p>
+            <w:pPr>
+              <w:spacing w:line="276" w:lineRule="auto" w:after="40" w:before="40"/>
+              <w:jc w:val="center"/>
+            </w:pPr>
+            <w:r>
+              <w:rPr>
+                <w:rFonts w:ascii="Times New Roman" w:hAnsi="Times New Roman" w:cs="Times New Roman" w:eastAsia="Times New Roman"/>
+                <w:color w:val="0F172A"/>
+                <w:sz w:val="21"/>
+              </w:rPr>
               <w:t>Tuần 02 (Từ: 03/08/2026 Đến: 09/08/2026)</w:t>
             </w:r>
           </w:p>
@@ -906,9 +1352,24 @@
               <w:bottom w:val="dotted" w:sz="4" w:space="0" w:color="000000"/>
             </w:tcBorders>
             <w:vAlign w:val="center"/>
-          </w:tcPr>
-          <w:p>
-            <w:r>
+            <w:shd w:fill="F8FAFC"/>
+            <w:tcMar>
+              <w:top w:w="100" w:type="dxa"/>
+              <w:bottom w:w="100" w:type="dxa"/>
+              <w:left w:w="140" w:type="dxa"/>
+              <w:right w:w="140" w:type="dxa"/>
+            </w:tcMar>
+          </w:tcPr>
+          <w:p>
+            <w:pPr>
+              <w:spacing w:line="276" w:lineRule="auto" w:after="40" w:before="40"/>
+            </w:pPr>
+            <w:r>
+              <w:rPr>
+                <w:rFonts w:ascii="Times New Roman" w:hAnsi="Times New Roman" w:cs="Times New Roman" w:eastAsia="Times New Roman"/>
+                <w:color w:val="0F172A"/>
+                <w:sz w:val="21"/>
+              </w:rPr>
               <w:t>Thiết kế Sơ đồ phân cấp chức năng hệ thống (Function Hierarchy). (Sản phẩm: Sơ đồ phân cấp chức năng)</w:t>
             </w:r>
           </w:p>
@@ -920,9 +1381,25 @@
               <w:top w:val="dotted" w:sz="4" w:space="0" w:color="000000"/>
               <w:bottom w:val="dotted" w:sz="4" w:space="0" w:color="000000"/>
             </w:tcBorders>
-          </w:tcPr>
-          <w:p>
-            <w:r>
+            <w:vAlign w:val="center"/>
+            <w:shd w:fill="F8FAFC"/>
+            <w:tcMar>
+              <w:top w:w="100" w:type="dxa"/>
+              <w:bottom w:w="100" w:type="dxa"/>
+              <w:left w:w="140" w:type="dxa"/>
+              <w:right w:w="140" w:type="dxa"/>
+            </w:tcMar>
+          </w:tcPr>
+          <w:p>
+            <w:pPr>
+              <w:spacing w:line="276" w:lineRule="auto" w:after="40" w:before="40"/>
+            </w:pPr>
+            <w:r>
+              <w:rPr>
+                <w:rFonts w:ascii="Times New Roman" w:hAnsi="Times New Roman" w:cs="Times New Roman" w:eastAsia="Times New Roman"/>
+                <w:color w:val="0F172A"/>
+                <w:sz w:val="21"/>
+              </w:rPr>
               <w:t>Tô Văn Quyền</w:t>
             </w:r>
           </w:p>
@@ -931,6 +1408,7 @@
       <w:tr>
         <w:trPr>
           <w:trHeight w:val="340" w:hRule="atLeast"/>
+          <w:cantSplit/>
         </w:trPr>
         <w:tc>
           <w:tcPr>
@@ -972,9 +1450,25 @@
               <w:bottom w:val="dotted" w:sz="4" w:space="0" w:color="000000"/>
             </w:tcBorders>
             <w:vAlign w:val="center"/>
-          </w:tcPr>
-          <w:p>
-            <w:r>
+            <w:shd w:fill="FFFFFF"/>
+            <w:tcMar>
+              <w:top w:w="100" w:type="dxa"/>
+              <w:bottom w:w="100" w:type="dxa"/>
+              <w:left w:w="140" w:type="dxa"/>
+              <w:right w:w="140" w:type="dxa"/>
+            </w:tcMar>
+          </w:tcPr>
+          <w:p>
+            <w:pPr>
+              <w:spacing w:line="276" w:lineRule="auto" w:after="40" w:before="40"/>
+              <w:jc w:val="center"/>
+            </w:pPr>
+            <w:r>
+              <w:rPr>
+                <w:rFonts w:ascii="Times New Roman" w:hAnsi="Times New Roman" w:cs="Times New Roman" w:eastAsia="Times New Roman"/>
+                <w:color w:val="0F172A"/>
+                <w:sz w:val="21"/>
+              </w:rPr>
               <w:t>Tuần 02 (Từ: 03/08/2026 Đến: 09/08/2026)</w:t>
             </w:r>
           </w:p>
@@ -987,9 +1481,24 @@
               <w:bottom w:val="dotted" w:sz="4" w:space="0" w:color="000000"/>
             </w:tcBorders>
             <w:vAlign w:val="center"/>
-          </w:tcPr>
-          <w:p>
-            <w:r>
+            <w:shd w:fill="FFFFFF"/>
+            <w:tcMar>
+              <w:top w:w="100" w:type="dxa"/>
+              <w:bottom w:w="100" w:type="dxa"/>
+              <w:left w:w="140" w:type="dxa"/>
+              <w:right w:w="140" w:type="dxa"/>
+            </w:tcMar>
+          </w:tcPr>
+          <w:p>
+            <w:pPr>
+              <w:spacing w:line="276" w:lineRule="auto" w:after="40" w:before="40"/>
+            </w:pPr>
+            <w:r>
+              <w:rPr>
+                <w:rFonts w:ascii="Times New Roman" w:hAnsi="Times New Roman" w:cs="Times New Roman" w:eastAsia="Times New Roman"/>
+                <w:color w:val="0F172A"/>
+                <w:sz w:val="21"/>
+              </w:rPr>
               <w:t>Đặc tả yêu cầu nghiệp vụ True Cost Breakdown và quy chuẩn an toàn PCCC QCVN 06:2022. (Sản phẩm: Tài liệu nghiệp vụ chi phí &amp; PCCC)</w:t>
             </w:r>
           </w:p>
@@ -1001,9 +1510,25 @@
               <w:top w:val="dotted" w:sz="4" w:space="0" w:color="000000"/>
               <w:bottom w:val="dotted" w:sz="4" w:space="0" w:color="000000"/>
             </w:tcBorders>
-          </w:tcPr>
-          <w:p>
-            <w:r>
+            <w:vAlign w:val="center"/>
+            <w:shd w:fill="FFFFFF"/>
+            <w:tcMar>
+              <w:top w:w="100" w:type="dxa"/>
+              <w:bottom w:w="100" w:type="dxa"/>
+              <w:left w:w="140" w:type="dxa"/>
+              <w:right w:w="140" w:type="dxa"/>
+            </w:tcMar>
+          </w:tcPr>
+          <w:p>
+            <w:pPr>
+              <w:spacing w:line="276" w:lineRule="auto" w:after="40" w:before="40"/>
+            </w:pPr>
+            <w:r>
+              <w:rPr>
+                <w:rFonts w:ascii="Times New Roman" w:hAnsi="Times New Roman" w:cs="Times New Roman" w:eastAsia="Times New Roman"/>
+                <w:color w:val="0F172A"/>
+                <w:sz w:val="21"/>
+              </w:rPr>
               <w:t>Lê Bình Nguyên</w:t>
             </w:r>
           </w:p>
@@ -1012,6 +1537,7 @@
       <w:tr>
         <w:trPr>
           <w:trHeight w:val="340" w:hRule="atLeast"/>
+          <w:cantSplit/>
         </w:trPr>
         <w:tc>
           <w:tcPr>
@@ -1052,9 +1578,25 @@
               <w:top w:val="dotted" w:sz="4" w:space="0" w:color="000000"/>
             </w:tcBorders>
             <w:vAlign w:val="center"/>
-          </w:tcPr>
-          <w:p>
-            <w:r>
+            <w:shd w:fill="F8FAFC"/>
+            <w:tcMar>
+              <w:top w:w="100" w:type="dxa"/>
+              <w:bottom w:w="100" w:type="dxa"/>
+              <w:left w:w="140" w:type="dxa"/>
+              <w:right w:w="140" w:type="dxa"/>
+            </w:tcMar>
+          </w:tcPr>
+          <w:p>
+            <w:pPr>
+              <w:spacing w:line="276" w:lineRule="auto" w:after="40" w:before="40"/>
+              <w:jc w:val="center"/>
+            </w:pPr>
+            <w:r>
+              <w:rPr>
+                <w:rFonts w:ascii="Times New Roman" w:hAnsi="Times New Roman" w:cs="Times New Roman" w:eastAsia="Times New Roman"/>
+                <w:color w:val="0F172A"/>
+                <w:sz w:val="21"/>
+              </w:rPr>
               <w:t>Tuần 02 (Từ: 03/08/2026 Đến: 09/08/2026)</w:t>
             </w:r>
           </w:p>
@@ -1066,9 +1608,24 @@
               <w:top w:val="dotted" w:sz="4" w:space="0" w:color="000000"/>
             </w:tcBorders>
             <w:vAlign w:val="center"/>
-          </w:tcPr>
-          <w:p>
-            <w:r>
+            <w:shd w:fill="F8FAFC"/>
+            <w:tcMar>
+              <w:top w:w="100" w:type="dxa"/>
+              <w:bottom w:w="100" w:type="dxa"/>
+              <w:left w:w="140" w:type="dxa"/>
+              <w:right w:w="140" w:type="dxa"/>
+            </w:tcMar>
+          </w:tcPr>
+          <w:p>
+            <w:pPr>
+              <w:spacing w:line="276" w:lineRule="auto" w:after="40" w:before="40"/>
+            </w:pPr>
+            <w:r>
+              <w:rPr>
+                <w:rFonts w:ascii="Times New Roman" w:hAnsi="Times New Roman" w:cs="Times New Roman" w:eastAsia="Times New Roman"/>
+                <w:color w:val="0F172A"/>
+                <w:sz w:val="21"/>
+              </w:rPr>
               <w:t>Hoàn thiện tài liệu 02_requirements-qa.docx nộp giảng viên. (Sản phẩm: Tài liệu Q&amp;A hoàn chỉnh)</w:t>
             </w:r>
           </w:p>
@@ -1079,9 +1636,25 @@
             <w:tcBorders>
               <w:top w:val="dotted" w:sz="4" w:space="0" w:color="000000"/>
             </w:tcBorders>
-          </w:tcPr>
-          <w:p>
-            <w:r>
+            <w:vAlign w:val="center"/>
+            <w:shd w:fill="F8FAFC"/>
+            <w:tcMar>
+              <w:top w:w="100" w:type="dxa"/>
+              <w:bottom w:w="100" w:type="dxa"/>
+              <w:left w:w="140" w:type="dxa"/>
+              <w:right w:w="140" w:type="dxa"/>
+            </w:tcMar>
+          </w:tcPr>
+          <w:p>
+            <w:pPr>
+              <w:spacing w:line="276" w:lineRule="auto" w:after="40" w:before="40"/>
+            </w:pPr>
+            <w:r>
+              <w:rPr>
+                <w:rFonts w:ascii="Times New Roman" w:hAnsi="Times New Roman" w:cs="Times New Roman" w:eastAsia="Times New Roman"/>
+                <w:color w:val="0F172A"/>
+                <w:sz w:val="21"/>
+              </w:rPr>
               <w:t>Cả nhóm</w:t>
             </w:r>
           </w:p>
@@ -1090,6 +1663,7 @@
       <w:tr>
         <w:trPr>
           <w:trHeight w:val="340" w:hRule="atLeast"/>
+          <w:cantSplit/>
         </w:trPr>
         <w:tc>
           <w:tcPr>
@@ -1097,9 +1671,25 @@
             <w:vMerge w:val="restart"/>
             <w:tcBorders/>
             <w:vAlign w:val="center"/>
-          </w:tcPr>
-          <w:p>
-            <w:r>
+            <w:shd w:fill="FFFFFF"/>
+            <w:tcMar>
+              <w:top w:w="100" w:type="dxa"/>
+              <w:bottom w:w="100" w:type="dxa"/>
+              <w:left w:w="140" w:type="dxa"/>
+              <w:right w:w="140" w:type="dxa"/>
+            </w:tcMar>
+          </w:tcPr>
+          <w:p>
+            <w:pPr>
+              <w:spacing w:line="276" w:lineRule="auto" w:after="40" w:before="40"/>
+              <w:jc w:val="center"/>
+            </w:pPr>
+            <w:r>
+              <w:rPr>
+                <w:rFonts w:ascii="Times New Roman" w:hAnsi="Times New Roman" w:cs="Times New Roman" w:eastAsia="Times New Roman"/>
+                <w:color w:val="0F172A"/>
+                <w:sz w:val="21"/>
+              </w:rPr>
               <w:t>15</w:t>
             </w:r>
           </w:p>
@@ -1111,9 +1701,25 @@
               <w:bottom w:val="dotted" w:sz="4" w:space="0" w:color="000000"/>
             </w:tcBorders>
             <w:vAlign w:val="center"/>
-          </w:tcPr>
-          <w:p>
-            <w:r>
+            <w:shd w:fill="FFFFFF"/>
+            <w:tcMar>
+              <w:top w:w="100" w:type="dxa"/>
+              <w:bottom w:w="100" w:type="dxa"/>
+              <w:left w:w="140" w:type="dxa"/>
+              <w:right w:w="140" w:type="dxa"/>
+            </w:tcMar>
+          </w:tcPr>
+          <w:p>
+            <w:pPr>
+              <w:spacing w:line="276" w:lineRule="auto" w:after="40" w:before="40"/>
+              <w:jc w:val="center"/>
+            </w:pPr>
+            <w:r>
+              <w:rPr>
+                <w:rFonts w:ascii="Times New Roman" w:hAnsi="Times New Roman" w:cs="Times New Roman" w:eastAsia="Times New Roman"/>
+                <w:color w:val="0F172A"/>
+                <w:sz w:val="21"/>
+              </w:rPr>
               <w:t>Tuần 03 (Từ: 10/08/2026 Đến: 16/08/2026)</w:t>
             </w:r>
           </w:p>
@@ -1125,9 +1731,24 @@
               <w:bottom w:val="dotted" w:sz="4" w:space="0" w:color="000000"/>
             </w:tcBorders>
             <w:vAlign w:val="center"/>
-          </w:tcPr>
-          <w:p>
-            <w:r>
+            <w:shd w:fill="FFFFFF"/>
+            <w:tcMar>
+              <w:top w:w="100" w:type="dxa"/>
+              <w:bottom w:w="100" w:type="dxa"/>
+              <w:left w:w="140" w:type="dxa"/>
+              <w:right w:w="140" w:type="dxa"/>
+            </w:tcMar>
+          </w:tcPr>
+          <w:p>
+            <w:pPr>
+              <w:spacing w:line="276" w:lineRule="auto" w:after="40" w:before="40"/>
+            </w:pPr>
+            <w:r>
+              <w:rPr>
+                <w:rFonts w:ascii="Times New Roman" w:hAnsi="Times New Roman" w:cs="Times New Roman" w:eastAsia="Times New Roman"/>
+                <w:color w:val="0F172A"/>
+                <w:sz w:val="21"/>
+              </w:rPr>
               <w:t>Soạn thảo tài liệu Đặc tả yêu cầu phần mềm SRS (Software Requirements Specification). (Sản phẩm: Khung tài liệu SRS)</w:t>
             </w:r>
           </w:p>
@@ -1138,9 +1759,25 @@
             <w:tcBorders>
               <w:bottom w:val="dotted" w:sz="4" w:space="0" w:color="000000"/>
             </w:tcBorders>
-          </w:tcPr>
-          <w:p>
-            <w:r>
+            <w:vAlign w:val="center"/>
+            <w:shd w:fill="FFFFFF"/>
+            <w:tcMar>
+              <w:top w:w="100" w:type="dxa"/>
+              <w:bottom w:w="100" w:type="dxa"/>
+              <w:left w:w="140" w:type="dxa"/>
+              <w:right w:w="140" w:type="dxa"/>
+            </w:tcMar>
+          </w:tcPr>
+          <w:p>
+            <w:pPr>
+              <w:spacing w:line="276" w:lineRule="auto" w:after="40" w:before="40"/>
+            </w:pPr>
+            <w:r>
+              <w:rPr>
+                <w:rFonts w:ascii="Times New Roman" w:hAnsi="Times New Roman" w:cs="Times New Roman" w:eastAsia="Times New Roman"/>
+                <w:color w:val="0F172A"/>
+                <w:sz w:val="21"/>
+              </w:rPr>
               <w:t>Vũ Ngọc Sơn</w:t>
             </w:r>
           </w:p>
@@ -1149,6 +1786,7 @@
       <w:tr>
         <w:trPr>
           <w:trHeight w:val="340" w:hRule="atLeast"/>
+          <w:cantSplit/>
         </w:trPr>
         <w:tc>
           <w:tcPr>
@@ -1190,9 +1828,25 @@
               <w:bottom w:val="dotted" w:sz="4" w:space="0" w:color="000000"/>
             </w:tcBorders>
             <w:vAlign w:val="center"/>
-          </w:tcPr>
-          <w:p>
-            <w:r>
+            <w:shd w:fill="F8FAFC"/>
+            <w:tcMar>
+              <w:top w:w="100" w:type="dxa"/>
+              <w:bottom w:w="100" w:type="dxa"/>
+              <w:left w:w="140" w:type="dxa"/>
+              <w:right w:w="140" w:type="dxa"/>
+            </w:tcMar>
+          </w:tcPr>
+          <w:p>
+            <w:pPr>
+              <w:spacing w:line="276" w:lineRule="auto" w:after="40" w:before="40"/>
+              <w:jc w:val="center"/>
+            </w:pPr>
+            <w:r>
+              <w:rPr>
+                <w:rFonts w:ascii="Times New Roman" w:hAnsi="Times New Roman" w:cs="Times New Roman" w:eastAsia="Times New Roman"/>
+                <w:color w:val="0F172A"/>
+                <w:sz w:val="21"/>
+              </w:rPr>
               <w:t>Tuần 03 (Từ: 10/08/2026 Đến: 16/08/2026)</w:t>
             </w:r>
           </w:p>
@@ -1205,9 +1859,24 @@
               <w:bottom w:val="dotted" w:sz="4" w:space="0" w:color="000000"/>
             </w:tcBorders>
             <w:vAlign w:val="center"/>
-          </w:tcPr>
-          <w:p>
-            <w:r>
+            <w:shd w:fill="F8FAFC"/>
+            <w:tcMar>
+              <w:top w:w="100" w:type="dxa"/>
+              <w:bottom w:w="100" w:type="dxa"/>
+              <w:left w:w="140" w:type="dxa"/>
+              <w:right w:w="140" w:type="dxa"/>
+            </w:tcMar>
+          </w:tcPr>
+          <w:p>
+            <w:pPr>
+              <w:spacing w:line="276" w:lineRule="auto" w:after="40" w:before="40"/>
+            </w:pPr>
+            <w:r>
+              <w:rPr>
+                <w:rFonts w:ascii="Times New Roman" w:hAnsi="Times New Roman" w:cs="Times New Roman" w:eastAsia="Times New Roman"/>
+                <w:color w:val="0F172A"/>
+                <w:sz w:val="21"/>
+              </w:rPr>
               <w:t>Xác định danh sách Tác nhân (Actors) và vẽ Use Case Diagram tổng quát bằng Mermaid/Draw.io. (Sản phẩm: Sơ đồ Use Case tổng quát)</w:t>
             </w:r>
           </w:p>
@@ -1219,9 +1888,25 @@
               <w:top w:val="dotted" w:sz="4" w:space="0" w:color="000000"/>
               <w:bottom w:val="dotted" w:sz="4" w:space="0" w:color="000000"/>
             </w:tcBorders>
-          </w:tcPr>
-          <w:p>
-            <w:r>
+            <w:vAlign w:val="center"/>
+            <w:shd w:fill="F8FAFC"/>
+            <w:tcMar>
+              <w:top w:w="100" w:type="dxa"/>
+              <w:bottom w:w="100" w:type="dxa"/>
+              <w:left w:w="140" w:type="dxa"/>
+              <w:right w:w="140" w:type="dxa"/>
+            </w:tcMar>
+          </w:tcPr>
+          <w:p>
+            <w:pPr>
+              <w:spacing w:line="276" w:lineRule="auto" w:after="40" w:before="40"/>
+            </w:pPr>
+            <w:r>
+              <w:rPr>
+                <w:rFonts w:ascii="Times New Roman" w:hAnsi="Times New Roman" w:cs="Times New Roman" w:eastAsia="Times New Roman"/>
+                <w:color w:val="0F172A"/>
+                <w:sz w:val="21"/>
+              </w:rPr>
               <w:t>Vũ Bảo Linh</w:t>
             </w:r>
           </w:p>
@@ -1230,6 +1915,7 @@
       <w:tr>
         <w:trPr>
           <w:trHeight w:val="340" w:hRule="atLeast"/>
+          <w:cantSplit/>
         </w:trPr>
         <w:tc>
           <w:tcPr>
@@ -1271,9 +1957,25 @@
               <w:bottom w:val="dotted" w:sz="4" w:space="0" w:color="000000"/>
             </w:tcBorders>
             <w:vAlign w:val="center"/>
-          </w:tcPr>
-          <w:p>
-            <w:r>
+            <w:shd w:fill="FFFFFF"/>
+            <w:tcMar>
+              <w:top w:w="100" w:type="dxa"/>
+              <w:bottom w:w="100" w:type="dxa"/>
+              <w:left w:w="140" w:type="dxa"/>
+              <w:right w:w="140" w:type="dxa"/>
+            </w:tcMar>
+          </w:tcPr>
+          <w:p>
+            <w:pPr>
+              <w:spacing w:line="276" w:lineRule="auto" w:after="40" w:before="40"/>
+              <w:jc w:val="center"/>
+            </w:pPr>
+            <w:r>
+              <w:rPr>
+                <w:rFonts w:ascii="Times New Roman" w:hAnsi="Times New Roman" w:cs="Times New Roman" w:eastAsia="Times New Roman"/>
+                <w:color w:val="0F172A"/>
+                <w:sz w:val="21"/>
+              </w:rPr>
               <w:t>Tuần 03 (Từ: 10/08/2026 Đến: 16/08/2026)</w:t>
             </w:r>
           </w:p>
@@ -1286,9 +1988,24 @@
               <w:bottom w:val="dotted" w:sz="4" w:space="0" w:color="000000"/>
             </w:tcBorders>
             <w:vAlign w:val="center"/>
-          </w:tcPr>
-          <w:p>
-            <w:r>
+            <w:shd w:fill="FFFFFF"/>
+            <w:tcMar>
+              <w:top w:w="100" w:type="dxa"/>
+              <w:bottom w:w="100" w:type="dxa"/>
+              <w:left w:w="140" w:type="dxa"/>
+              <w:right w:w="140" w:type="dxa"/>
+            </w:tcMar>
+          </w:tcPr>
+          <w:p>
+            <w:pPr>
+              <w:spacing w:line="276" w:lineRule="auto" w:after="40" w:before="40"/>
+            </w:pPr>
+            <w:r>
+              <w:rPr>
+                <w:rFonts w:ascii="Times New Roman" w:hAnsi="Times New Roman" w:cs="Times New Roman" w:eastAsia="Times New Roman"/>
+                <w:color w:val="0F172A"/>
+                <w:sz w:val="21"/>
+              </w:rPr>
               <w:t>Chi tiết hóa Use Case: Tìm kiếm True Cost &amp; Bản Đồ PCCC/Ngập lụt (UC001). (Sản phẩm: Đặc tả UC001 chi tiết)</w:t>
             </w:r>
           </w:p>
@@ -1300,9 +2017,25 @@
               <w:top w:val="dotted" w:sz="4" w:space="0" w:color="000000"/>
               <w:bottom w:val="dotted" w:sz="4" w:space="0" w:color="000000"/>
             </w:tcBorders>
-          </w:tcPr>
-          <w:p>
-            <w:r>
+            <w:vAlign w:val="center"/>
+            <w:shd w:fill="FFFFFF"/>
+            <w:tcMar>
+              <w:top w:w="100" w:type="dxa"/>
+              <w:bottom w:w="100" w:type="dxa"/>
+              <w:left w:w="140" w:type="dxa"/>
+              <w:right w:w="140" w:type="dxa"/>
+            </w:tcMar>
+          </w:tcPr>
+          <w:p>
+            <w:pPr>
+              <w:spacing w:line="276" w:lineRule="auto" w:after="40" w:before="40"/>
+            </w:pPr>
+            <w:r>
+              <w:rPr>
+                <w:rFonts w:ascii="Times New Roman" w:hAnsi="Times New Roman" w:cs="Times New Roman" w:eastAsia="Times New Roman"/>
+                <w:color w:val="0F172A"/>
+                <w:sz w:val="21"/>
+              </w:rPr>
               <w:t>Tô Văn Quyền</w:t>
             </w:r>
           </w:p>
@@ -1311,6 +2044,7 @@
       <w:tr>
         <w:trPr>
           <w:trHeight w:val="340" w:hRule="atLeast"/>
+          <w:cantSplit/>
         </w:trPr>
         <w:tc>
           <w:tcPr>
@@ -1352,9 +2086,25 @@
               <w:bottom w:val="dotted" w:sz="4" w:space="0" w:color="000000"/>
             </w:tcBorders>
             <w:vAlign w:val="center"/>
-          </w:tcPr>
-          <w:p>
-            <w:r>
+            <w:shd w:fill="F8FAFC"/>
+            <w:tcMar>
+              <w:top w:w="100" w:type="dxa"/>
+              <w:bottom w:w="100" w:type="dxa"/>
+              <w:left w:w="140" w:type="dxa"/>
+              <w:right w:w="140" w:type="dxa"/>
+            </w:tcMar>
+          </w:tcPr>
+          <w:p>
+            <w:pPr>
+              <w:spacing w:line="276" w:lineRule="auto" w:after="40" w:before="40"/>
+              <w:jc w:val="center"/>
+            </w:pPr>
+            <w:r>
+              <w:rPr>
+                <w:rFonts w:ascii="Times New Roman" w:hAnsi="Times New Roman" w:cs="Times New Roman" w:eastAsia="Times New Roman"/>
+                <w:color w:val="0F172A"/>
+                <w:sz w:val="21"/>
+              </w:rPr>
               <w:t>Tuần 03 (Từ: 10/08/2026 Đến: 16/08/2026)</w:t>
             </w:r>
           </w:p>
@@ -1367,9 +2117,24 @@
               <w:bottom w:val="dotted" w:sz="4" w:space="0" w:color="000000"/>
             </w:tcBorders>
             <w:vAlign w:val="center"/>
-          </w:tcPr>
-          <w:p>
-            <w:r>
+            <w:shd w:fill="F8FAFC"/>
+            <w:tcMar>
+              <w:top w:w="100" w:type="dxa"/>
+              <w:bottom w:w="100" w:type="dxa"/>
+              <w:left w:w="140" w:type="dxa"/>
+              <w:right w:w="140" w:type="dxa"/>
+            </w:tcMar>
+          </w:tcPr>
+          <w:p>
+            <w:pPr>
+              <w:spacing w:line="276" w:lineRule="auto" w:after="40" w:before="40"/>
+            </w:pPr>
+            <w:r>
+              <w:rPr>
+                <w:rFonts w:ascii="Times New Roman" w:hAnsi="Times New Roman" w:cs="Times New Roman" w:eastAsia="Times New Roman"/>
+                <w:color w:val="0F172A"/>
+                <w:sz w:val="21"/>
+              </w:rPr>
               <w:t>Chi tiết hóa Use Case: Đăng tin thông minh tự động bằng AI (UC002). (Sản phẩm: Đặc tả UC002 chi tiết)</w:t>
             </w:r>
           </w:p>
@@ -1381,9 +2146,25 @@
               <w:top w:val="dotted" w:sz="4" w:space="0" w:color="000000"/>
               <w:bottom w:val="dotted" w:sz="4" w:space="0" w:color="000000"/>
             </w:tcBorders>
-          </w:tcPr>
-          <w:p>
-            <w:r>
+            <w:vAlign w:val="center"/>
+            <w:shd w:fill="F8FAFC"/>
+            <w:tcMar>
+              <w:top w:w="100" w:type="dxa"/>
+              <w:bottom w:w="100" w:type="dxa"/>
+              <w:left w:w="140" w:type="dxa"/>
+              <w:right w:w="140" w:type="dxa"/>
+            </w:tcMar>
+          </w:tcPr>
+          <w:p>
+            <w:pPr>
+              <w:spacing w:line="276" w:lineRule="auto" w:after="40" w:before="40"/>
+            </w:pPr>
+            <w:r>
+              <w:rPr>
+                <w:rFonts w:ascii="Times New Roman" w:hAnsi="Times New Roman" w:cs="Times New Roman" w:eastAsia="Times New Roman"/>
+                <w:color w:val="0F172A"/>
+                <w:sz w:val="21"/>
+              </w:rPr>
               <w:t>Lê Bình Nguyên</w:t>
             </w:r>
           </w:p>
@@ -1392,6 +2173,7 @@
       <w:tr>
         <w:trPr>
           <w:trHeight w:val="340" w:hRule="atLeast"/>
+          <w:cantSplit/>
         </w:trPr>
         <w:tc>
           <w:tcPr>
@@ -1432,9 +2214,25 @@
               <w:top w:val="dotted" w:sz="4" w:space="0" w:color="000000"/>
             </w:tcBorders>
             <w:vAlign w:val="center"/>
-          </w:tcPr>
-          <w:p>
-            <w:r>
+            <w:shd w:fill="FFFFFF"/>
+            <w:tcMar>
+              <w:top w:w="100" w:type="dxa"/>
+              <w:bottom w:w="100" w:type="dxa"/>
+              <w:left w:w="140" w:type="dxa"/>
+              <w:right w:w="140" w:type="dxa"/>
+            </w:tcMar>
+          </w:tcPr>
+          <w:p>
+            <w:pPr>
+              <w:spacing w:line="276" w:lineRule="auto" w:after="40" w:before="40"/>
+              <w:jc w:val="center"/>
+            </w:pPr>
+            <w:r>
+              <w:rPr>
+                <w:rFonts w:ascii="Times New Roman" w:hAnsi="Times New Roman" w:cs="Times New Roman" w:eastAsia="Times New Roman"/>
+                <w:color w:val="0F172A"/>
+                <w:sz w:val="21"/>
+              </w:rPr>
               <w:t>Tuần 03 (Từ: 10/08/2026 Đến: 16/08/2026)</w:t>
             </w:r>
           </w:p>
@@ -1446,9 +2244,24 @@
               <w:top w:val="dotted" w:sz="4" w:space="0" w:color="000000"/>
             </w:tcBorders>
             <w:vAlign w:val="center"/>
-          </w:tcPr>
-          <w:p>
-            <w:r>
+            <w:shd w:fill="FFFFFF"/>
+            <w:tcMar>
+              <w:top w:w="100" w:type="dxa"/>
+              <w:bottom w:w="100" w:type="dxa"/>
+              <w:left w:w="140" w:type="dxa"/>
+              <w:right w:w="140" w:type="dxa"/>
+            </w:tcMar>
+          </w:tcPr>
+          <w:p>
+            <w:pPr>
+              <w:spacing w:line="276" w:lineRule="auto" w:after="40" w:before="40"/>
+            </w:pPr>
+            <w:r>
+              <w:rPr>
+                <w:rFonts w:ascii="Times New Roman" w:hAnsi="Times New Roman" w:cs="Times New Roman" w:eastAsia="Times New Roman"/>
+                <w:color w:val="0F172A"/>
+                <w:sz w:val="21"/>
+              </w:rPr>
               <w:t>Đánh giá &amp; Kiểm thử chấp nhận yêu cầu (Requirements Review &amp; Baseline SRS). (Sản phẩm: Bản hoàn chỉnh SRS 1.0)</w:t>
             </w:r>
           </w:p>
@@ -1459,9 +2272,25 @@
             <w:tcBorders>
               <w:top w:val="dotted" w:sz="4" w:space="0" w:color="000000"/>
             </w:tcBorders>
-          </w:tcPr>
-          <w:p>
-            <w:r>
+            <w:vAlign w:val="center"/>
+            <w:shd w:fill="FFFFFF"/>
+            <w:tcMar>
+              <w:top w:w="100" w:type="dxa"/>
+              <w:bottom w:w="100" w:type="dxa"/>
+              <w:left w:w="140" w:type="dxa"/>
+              <w:right w:w="140" w:type="dxa"/>
+            </w:tcMar>
+          </w:tcPr>
+          <w:p>
+            <w:pPr>
+              <w:spacing w:line="276" w:lineRule="auto" w:after="40" w:before="40"/>
+            </w:pPr>
+            <w:r>
+              <w:rPr>
+                <w:rFonts w:ascii="Times New Roman" w:hAnsi="Times New Roman" w:cs="Times New Roman" w:eastAsia="Times New Roman"/>
+                <w:color w:val="0F172A"/>
+                <w:sz w:val="21"/>
+              </w:rPr>
               <w:t>Cả nhóm</w:t>
             </w:r>
           </w:p>
@@ -1470,6 +2299,7 @@
       <w:tr>
         <w:trPr>
           <w:trHeight w:val="340" w:hRule="atLeast"/>
+          <w:cantSplit/>
         </w:trPr>
         <w:tc>
           <w:tcPr>
@@ -1477,9 +2307,25 @@
             <w:vMerge w:val="restart"/>
             <w:tcBorders/>
             <w:vAlign w:val="center"/>
-          </w:tcPr>
-          <w:p>
-            <w:r>
+            <w:shd w:fill="F8FAFC"/>
+            <w:tcMar>
+              <w:top w:w="100" w:type="dxa"/>
+              <w:bottom w:w="100" w:type="dxa"/>
+              <w:left w:w="140" w:type="dxa"/>
+              <w:right w:w="140" w:type="dxa"/>
+            </w:tcMar>
+          </w:tcPr>
+          <w:p>
+            <w:pPr>
+              <w:spacing w:line="276" w:lineRule="auto" w:after="40" w:before="40"/>
+              <w:jc w:val="center"/>
+            </w:pPr>
+            <w:r>
+              <w:rPr>
+                <w:rFonts w:ascii="Times New Roman" w:hAnsi="Times New Roman" w:cs="Times New Roman" w:eastAsia="Times New Roman"/>
+                <w:color w:val="0F172A"/>
+                <w:sz w:val="21"/>
+              </w:rPr>
               <w:t>20</w:t>
             </w:r>
           </w:p>
@@ -1491,9 +2337,25 @@
               <w:bottom w:val="dotted" w:sz="4" w:space="0" w:color="000000"/>
             </w:tcBorders>
             <w:vAlign w:val="center"/>
-          </w:tcPr>
-          <w:p>
-            <w:r>
+            <w:shd w:fill="F8FAFC"/>
+            <w:tcMar>
+              <w:top w:w="100" w:type="dxa"/>
+              <w:bottom w:w="100" w:type="dxa"/>
+              <w:left w:w="140" w:type="dxa"/>
+              <w:right w:w="140" w:type="dxa"/>
+            </w:tcMar>
+          </w:tcPr>
+          <w:p>
+            <w:pPr>
+              <w:spacing w:line="276" w:lineRule="auto" w:after="40" w:before="40"/>
+              <w:jc w:val="center"/>
+            </w:pPr>
+            <w:r>
+              <w:rPr>
+                <w:rFonts w:ascii="Times New Roman" w:hAnsi="Times New Roman" w:cs="Times New Roman" w:eastAsia="Times New Roman"/>
+                <w:color w:val="0F172A"/>
+                <w:sz w:val="21"/>
+              </w:rPr>
               <w:t>Tuần 04 (Từ: 17/08/2026 Đến: 23/08/2026)</w:t>
             </w:r>
           </w:p>
@@ -1505,9 +2367,24 @@
               <w:bottom w:val="dotted" w:sz="4" w:space="0" w:color="000000"/>
             </w:tcBorders>
             <w:vAlign w:val="center"/>
-          </w:tcPr>
-          <w:p>
-            <w:r>
+            <w:shd w:fill="F8FAFC"/>
+            <w:tcMar>
+              <w:top w:w="100" w:type="dxa"/>
+              <w:bottom w:w="100" w:type="dxa"/>
+              <w:left w:w="140" w:type="dxa"/>
+              <w:right w:w="140" w:type="dxa"/>
+            </w:tcMar>
+          </w:tcPr>
+          <w:p>
+            <w:pPr>
+              <w:spacing w:line="276" w:lineRule="auto" w:after="40" w:before="40"/>
+            </w:pPr>
+            <w:r>
+              <w:rPr>
+                <w:rFonts w:ascii="Times New Roman" w:hAnsi="Times New Roman" w:cs="Times New Roman" w:eastAsia="Times New Roman"/>
+                <w:color w:val="0F172A"/>
+                <w:sz w:val="21"/>
+              </w:rPr>
               <w:t>Thiết kế kiến trúc hệ thống tổng thể (System Architecture, Tech Stack React + Vite + Tailwind + Lucide). (Sản phẩm: Kiến trúc hệ thống)</w:t>
             </w:r>
           </w:p>
@@ -1518,9 +2395,25 @@
             <w:tcBorders>
               <w:bottom w:val="dotted" w:sz="4" w:space="0" w:color="000000"/>
             </w:tcBorders>
-          </w:tcPr>
-          <w:p>
-            <w:r>
+            <w:vAlign w:val="center"/>
+            <w:shd w:fill="F8FAFC"/>
+            <w:tcMar>
+              <w:top w:w="100" w:type="dxa"/>
+              <w:bottom w:w="100" w:type="dxa"/>
+              <w:left w:w="140" w:type="dxa"/>
+              <w:right w:w="140" w:type="dxa"/>
+            </w:tcMar>
+          </w:tcPr>
+          <w:p>
+            <w:pPr>
+              <w:spacing w:line="276" w:lineRule="auto" w:after="40" w:before="40"/>
+            </w:pPr>
+            <w:r>
+              <w:rPr>
+                <w:rFonts w:ascii="Times New Roman" w:hAnsi="Times New Roman" w:cs="Times New Roman" w:eastAsia="Times New Roman"/>
+                <w:color w:val="0F172A"/>
+                <w:sz w:val="21"/>
+              </w:rPr>
               <w:t>Vũ Ngọc Sơn</w:t>
             </w:r>
           </w:p>
@@ -1529,6 +2422,7 @@
       <w:tr>
         <w:trPr>
           <w:trHeight w:val="340" w:hRule="atLeast"/>
+          <w:cantSplit/>
         </w:trPr>
         <w:tc>
           <w:tcPr>
@@ -1570,9 +2464,25 @@
               <w:bottom w:val="dotted" w:sz="4" w:space="0" w:color="000000"/>
             </w:tcBorders>
             <w:vAlign w:val="center"/>
-          </w:tcPr>
-          <w:p>
-            <w:r>
+            <w:shd w:fill="FFFFFF"/>
+            <w:tcMar>
+              <w:top w:w="100" w:type="dxa"/>
+              <w:bottom w:w="100" w:type="dxa"/>
+              <w:left w:w="140" w:type="dxa"/>
+              <w:right w:w="140" w:type="dxa"/>
+            </w:tcMar>
+          </w:tcPr>
+          <w:p>
+            <w:pPr>
+              <w:spacing w:line="276" w:lineRule="auto" w:after="40" w:before="40"/>
+              <w:jc w:val="center"/>
+            </w:pPr>
+            <w:r>
+              <w:rPr>
+                <w:rFonts w:ascii="Times New Roman" w:hAnsi="Times New Roman" w:cs="Times New Roman" w:eastAsia="Times New Roman"/>
+                <w:color w:val="0F172A"/>
+                <w:sz w:val="21"/>
+              </w:rPr>
               <w:t>Tuần 04 (Từ: 17/08/2026 Đến: 23/08/2026)</w:t>
             </w:r>
           </w:p>
@@ -1585,9 +2495,24 @@
               <w:bottom w:val="dotted" w:sz="4" w:space="0" w:color="000000"/>
             </w:tcBorders>
             <w:vAlign w:val="center"/>
-          </w:tcPr>
-          <w:p>
-            <w:r>
+            <w:shd w:fill="FFFFFF"/>
+            <w:tcMar>
+              <w:top w:w="100" w:type="dxa"/>
+              <w:bottom w:w="100" w:type="dxa"/>
+              <w:left w:w="140" w:type="dxa"/>
+              <w:right w:w="140" w:type="dxa"/>
+            </w:tcMar>
+          </w:tcPr>
+          <w:p>
+            <w:pPr>
+              <w:spacing w:line="276" w:lineRule="auto" w:after="40" w:before="40"/>
+            </w:pPr>
+            <w:r>
+              <w:rPr>
+                <w:rFonts w:ascii="Times New Roman" w:hAnsi="Times New Roman" w:cs="Times New Roman" w:eastAsia="Times New Roman"/>
+                <w:color w:val="0F172A"/>
+                <w:sz w:val="21"/>
+              </w:rPr>
               <w:t>Thiết kế mô hình dữ liệu (Data Modeling TypeScript Interfaces, 150 căn hộ, 16 thành phố). (Sản phẩm: Schema dữ liệu &amp; Mock data)</w:t>
             </w:r>
           </w:p>
@@ -1599,9 +2524,25 @@
               <w:top w:val="dotted" w:sz="4" w:space="0" w:color="000000"/>
               <w:bottom w:val="dotted" w:sz="4" w:space="0" w:color="000000"/>
             </w:tcBorders>
-          </w:tcPr>
-          <w:p>
-            <w:r>
+            <w:vAlign w:val="center"/>
+            <w:shd w:fill="FFFFFF"/>
+            <w:tcMar>
+              <w:top w:w="100" w:type="dxa"/>
+              <w:bottom w:w="100" w:type="dxa"/>
+              <w:left w:w="140" w:type="dxa"/>
+              <w:right w:w="140" w:type="dxa"/>
+            </w:tcMar>
+          </w:tcPr>
+          <w:p>
+            <w:pPr>
+              <w:spacing w:line="276" w:lineRule="auto" w:after="40" w:before="40"/>
+            </w:pPr>
+            <w:r>
+              <w:rPr>
+                <w:rFonts w:ascii="Times New Roman" w:hAnsi="Times New Roman" w:cs="Times New Roman" w:eastAsia="Times New Roman"/>
+                <w:color w:val="0F172A"/>
+                <w:sz w:val="21"/>
+              </w:rPr>
               <w:t>Vũ Bảo Linh</w:t>
             </w:r>
           </w:p>
@@ -1610,6 +2551,7 @@
       <w:tr>
         <w:trPr>
           <w:trHeight w:val="340" w:hRule="atLeast"/>
+          <w:cantSplit/>
         </w:trPr>
         <w:tc>
           <w:tcPr>
@@ -1651,9 +2593,25 @@
               <w:bottom w:val="dotted" w:sz="4" w:space="0" w:color="000000"/>
             </w:tcBorders>
             <w:vAlign w:val="center"/>
-          </w:tcPr>
-          <w:p>
-            <w:r>
+            <w:shd w:fill="F8FAFC"/>
+            <w:tcMar>
+              <w:top w:w="100" w:type="dxa"/>
+              <w:bottom w:w="100" w:type="dxa"/>
+              <w:left w:w="140" w:type="dxa"/>
+              <w:right w:w="140" w:type="dxa"/>
+            </w:tcMar>
+          </w:tcPr>
+          <w:p>
+            <w:pPr>
+              <w:spacing w:line="276" w:lineRule="auto" w:after="40" w:before="40"/>
+              <w:jc w:val="center"/>
+            </w:pPr>
+            <w:r>
+              <w:rPr>
+                <w:rFonts w:ascii="Times New Roman" w:hAnsi="Times New Roman" w:cs="Times New Roman" w:eastAsia="Times New Roman"/>
+                <w:color w:val="0F172A"/>
+                <w:sz w:val="21"/>
+              </w:rPr>
               <w:t>Tuần 04 (Từ: 17/08/2026 Đến: 23/08/2026)</w:t>
             </w:r>
           </w:p>
@@ -1666,9 +2624,24 @@
               <w:bottom w:val="dotted" w:sz="4" w:space="0" w:color="000000"/>
             </w:tcBorders>
             <w:vAlign w:val="center"/>
-          </w:tcPr>
-          <w:p>
-            <w:r>
+            <w:shd w:fill="F8FAFC"/>
+            <w:tcMar>
+              <w:top w:w="100" w:type="dxa"/>
+              <w:bottom w:w="100" w:type="dxa"/>
+              <w:left w:w="140" w:type="dxa"/>
+              <w:right w:w="140" w:type="dxa"/>
+            </w:tcMar>
+          </w:tcPr>
+          <w:p>
+            <w:pPr>
+              <w:spacing w:line="276" w:lineRule="auto" w:after="40" w:before="40"/>
+            </w:pPr>
+            <w:r>
+              <w:rPr>
+                <w:rFonts w:ascii="Times New Roman" w:hAnsi="Times New Roman" w:cs="Times New Roman" w:eastAsia="Times New Roman"/>
+                <w:color w:val="0F172A"/>
+                <w:sz w:val="21"/>
+              </w:rPr>
               <w:t>Xây dựng bộ mock data chuẩn hóa, mô phỏng cảm biến IoT, báo cáo PCCC và chỉ số ngập lụt. (Sản phẩm: Dataset 150 căn hộ)</w:t>
             </w:r>
           </w:p>
@@ -1680,9 +2653,25 @@
               <w:top w:val="dotted" w:sz="4" w:space="0" w:color="000000"/>
               <w:bottom w:val="dotted" w:sz="4" w:space="0" w:color="000000"/>
             </w:tcBorders>
-          </w:tcPr>
-          <w:p>
-            <w:r>
+            <w:vAlign w:val="center"/>
+            <w:shd w:fill="F8FAFC"/>
+            <w:tcMar>
+              <w:top w:w="100" w:type="dxa"/>
+              <w:bottom w:w="100" w:type="dxa"/>
+              <w:left w:w="140" w:type="dxa"/>
+              <w:right w:w="140" w:type="dxa"/>
+            </w:tcMar>
+          </w:tcPr>
+          <w:p>
+            <w:pPr>
+              <w:spacing w:line="276" w:lineRule="auto" w:after="40" w:before="40"/>
+            </w:pPr>
+            <w:r>
+              <w:rPr>
+                <w:rFonts w:ascii="Times New Roman" w:hAnsi="Times New Roman" w:cs="Times New Roman" w:eastAsia="Times New Roman"/>
+                <w:color w:val="0F172A"/>
+                <w:sz w:val="21"/>
+              </w:rPr>
               <w:t>Tô Văn Quyền</w:t>
             </w:r>
           </w:p>
@@ -1691,6 +2680,7 @@
       <w:tr>
         <w:trPr>
           <w:trHeight w:val="340" w:hRule="atLeast"/>
+          <w:cantSplit/>
         </w:trPr>
         <w:tc>
           <w:tcPr>
@@ -1732,9 +2722,25 @@
               <w:bottom w:val="dotted" w:sz="4" w:space="0" w:color="000000"/>
             </w:tcBorders>
             <w:vAlign w:val="center"/>
-          </w:tcPr>
-          <w:p>
-            <w:r>
+            <w:shd w:fill="FFFFFF"/>
+            <w:tcMar>
+              <w:top w:w="100" w:type="dxa"/>
+              <w:bottom w:w="100" w:type="dxa"/>
+              <w:left w:w="140" w:type="dxa"/>
+              <w:right w:w="140" w:type="dxa"/>
+            </w:tcMar>
+          </w:tcPr>
+          <w:p>
+            <w:pPr>
+              <w:spacing w:line="276" w:lineRule="auto" w:after="40" w:before="40"/>
+              <w:jc w:val="center"/>
+            </w:pPr>
+            <w:r>
+              <w:rPr>
+                <w:rFonts w:ascii="Times New Roman" w:hAnsi="Times New Roman" w:cs="Times New Roman" w:eastAsia="Times New Roman"/>
+                <w:color w:val="0F172A"/>
+                <w:sz w:val="21"/>
+              </w:rPr>
               <w:t>Tuần 04 (Từ: 17/08/2026 Đến: 23/08/2026)</w:t>
             </w:r>
           </w:p>
@@ -1747,9 +2753,24 @@
               <w:bottom w:val="dotted" w:sz="4" w:space="0" w:color="000000"/>
             </w:tcBorders>
             <w:vAlign w:val="center"/>
-          </w:tcPr>
-          <w:p>
-            <w:r>
+            <w:shd w:fill="FFFFFF"/>
+            <w:tcMar>
+              <w:top w:w="100" w:type="dxa"/>
+              <w:bottom w:w="100" w:type="dxa"/>
+              <w:left w:w="140" w:type="dxa"/>
+              <w:right w:w="140" w:type="dxa"/>
+            </w:tcMar>
+          </w:tcPr>
+          <w:p>
+            <w:pPr>
+              <w:spacing w:line="276" w:lineRule="auto" w:after="40" w:before="40"/>
+            </w:pPr>
+            <w:r>
+              <w:rPr>
+                <w:rFonts w:ascii="Times New Roman" w:hAnsi="Times New Roman" w:cs="Times New Roman" w:eastAsia="Times New Roman"/>
+                <w:color w:val="0F172A"/>
+                <w:sz w:val="21"/>
+              </w:rPr>
               <w:t>Thiết kế UI Wireframe/Mockups cho 4 phân hệ chính (Tenant, Landlord, Admin, Resident). (Sản phẩm: Giao diện UI Mockups)</w:t>
             </w:r>
           </w:p>
@@ -1761,9 +2782,25 @@
               <w:top w:val="dotted" w:sz="4" w:space="0" w:color="000000"/>
               <w:bottom w:val="dotted" w:sz="4" w:space="0" w:color="000000"/>
             </w:tcBorders>
-          </w:tcPr>
-          <w:p>
-            <w:r>
+            <w:vAlign w:val="center"/>
+            <w:shd w:fill="FFFFFF"/>
+            <w:tcMar>
+              <w:top w:w="100" w:type="dxa"/>
+              <w:bottom w:w="100" w:type="dxa"/>
+              <w:left w:w="140" w:type="dxa"/>
+              <w:right w:w="140" w:type="dxa"/>
+            </w:tcMar>
+          </w:tcPr>
+          <w:p>
+            <w:pPr>
+              <w:spacing w:line="276" w:lineRule="auto" w:after="40" w:before="40"/>
+            </w:pPr>
+            <w:r>
+              <w:rPr>
+                <w:rFonts w:ascii="Times New Roman" w:hAnsi="Times New Roman" w:cs="Times New Roman" w:eastAsia="Times New Roman"/>
+                <w:color w:val="0F172A"/>
+                <w:sz w:val="21"/>
+              </w:rPr>
               <w:t>Lê Bình Nguyên</w:t>
             </w:r>
           </w:p>
@@ -1772,6 +2809,7 @@
       <w:tr>
         <w:trPr>
           <w:trHeight w:val="340" w:hRule="atLeast"/>
+          <w:cantSplit/>
         </w:trPr>
         <w:tc>
           <w:tcPr>
@@ -1812,9 +2850,25 @@
               <w:top w:val="dotted" w:sz="4" w:space="0" w:color="000000"/>
             </w:tcBorders>
             <w:vAlign w:val="center"/>
-          </w:tcPr>
-          <w:p>
-            <w:r>
+            <w:shd w:fill="F8FAFC"/>
+            <w:tcMar>
+              <w:top w:w="100" w:type="dxa"/>
+              <w:bottom w:w="100" w:type="dxa"/>
+              <w:left w:w="140" w:type="dxa"/>
+              <w:right w:w="140" w:type="dxa"/>
+            </w:tcMar>
+          </w:tcPr>
+          <w:p>
+            <w:pPr>
+              <w:spacing w:line="276" w:lineRule="auto" w:after="40" w:before="40"/>
+              <w:jc w:val="center"/>
+            </w:pPr>
+            <w:r>
+              <w:rPr>
+                <w:rFonts w:ascii="Times New Roman" w:hAnsi="Times New Roman" w:cs="Times New Roman" w:eastAsia="Times New Roman"/>
+                <w:color w:val="0F172A"/>
+                <w:sz w:val="21"/>
+              </w:rPr>
               <w:t>Tuần 04 (Từ: 17/08/2026 Đến: 23/08/2026)</w:t>
             </w:r>
           </w:p>
@@ -1826,9 +2880,24 @@
               <w:top w:val="dotted" w:sz="4" w:space="0" w:color="000000"/>
             </w:tcBorders>
             <w:vAlign w:val="center"/>
-          </w:tcPr>
-          <w:p>
-            <w:r>
+            <w:shd w:fill="F8FAFC"/>
+            <w:tcMar>
+              <w:top w:w="100" w:type="dxa"/>
+              <w:bottom w:w="100" w:type="dxa"/>
+              <w:left w:w="140" w:type="dxa"/>
+              <w:right w:w="140" w:type="dxa"/>
+            </w:tcMar>
+          </w:tcPr>
+          <w:p>
+            <w:pPr>
+              <w:spacing w:line="276" w:lineRule="auto" w:after="40" w:before="40"/>
+            </w:pPr>
+            <w:r>
+              <w:rPr>
+                <w:rFonts w:ascii="Times New Roman" w:hAnsi="Times New Roman" w:cs="Times New Roman" w:eastAsia="Times New Roman"/>
+                <w:color w:val="0F172A"/>
+                <w:sz w:val="21"/>
+              </w:rPr>
               <w:t>Tổng kết tiến độ Giai đoạn 1 &amp; Thực hiện Bài Kiểm tra 1 (Nộp bộ 3 tài liệu + Demo). (Sản phẩm: Hoàn thành Bài Kiểm tra 1)</w:t>
             </w:r>
           </w:p>
@@ -1839,9 +2908,25 @@
             <w:tcBorders>
               <w:top w:val="dotted" w:sz="4" w:space="0" w:color="000000"/>
             </w:tcBorders>
-          </w:tcPr>
-          <w:p>
-            <w:r>
+            <w:vAlign w:val="center"/>
+            <w:shd w:fill="F8FAFC"/>
+            <w:tcMar>
+              <w:top w:w="100" w:type="dxa"/>
+              <w:bottom w:w="100" w:type="dxa"/>
+              <w:left w:w="140" w:type="dxa"/>
+              <w:right w:w="140" w:type="dxa"/>
+            </w:tcMar>
+          </w:tcPr>
+          <w:p>
+            <w:pPr>
+              <w:spacing w:line="276" w:lineRule="auto" w:after="40" w:before="40"/>
+            </w:pPr>
+            <w:r>
+              <w:rPr>
+                <w:rFonts w:ascii="Times New Roman" w:hAnsi="Times New Roman" w:cs="Times New Roman" w:eastAsia="Times New Roman"/>
+                <w:color w:val="0F172A"/>
+                <w:sz w:val="21"/>
+              </w:rPr>
               <w:t>Cả nhóm</w:t>
             </w:r>
           </w:p>
@@ -1850,6 +2935,7 @@
       <w:tr>
         <w:trPr>
           <w:trHeight w:val="340" w:hRule="atLeast"/>
+          <w:cantSplit/>
         </w:trPr>
         <w:tc>
           <w:tcPr>
@@ -1857,9 +2943,25 @@
             <w:vMerge w:val="restart"/>
             <w:tcBorders/>
             <w:vAlign w:val="center"/>
-          </w:tcPr>
-          <w:p>
-            <w:r>
+            <w:shd w:fill="F8FAFC"/>
+            <w:tcMar>
+              <w:top w:w="100" w:type="dxa"/>
+              <w:bottom w:w="100" w:type="dxa"/>
+              <w:left w:w="140" w:type="dxa"/>
+              <w:right w:w="140" w:type="dxa"/>
+            </w:tcMar>
+          </w:tcPr>
+          <w:p>
+            <w:pPr>
+              <w:spacing w:line="276" w:lineRule="auto" w:after="40" w:before="40"/>
+              <w:jc w:val="center"/>
+            </w:pPr>
+            <w:r>
+              <w:rPr>
+                <w:rFonts w:ascii="Times New Roman" w:hAnsi="Times New Roman" w:cs="Times New Roman" w:eastAsia="Times New Roman"/>
+                <w:color w:val="0F172A"/>
+                <w:sz w:val="21"/>
+              </w:rPr>
               <w:t>26</w:t>
             </w:r>
           </w:p>
@@ -1871,9 +2973,25 @@
               <w:bottom w:val="dotted" w:sz="4" w:space="0" w:color="000000"/>
             </w:tcBorders>
             <w:vAlign w:val="center"/>
-          </w:tcPr>
-          <w:p>
-            <w:r>
+            <w:shd w:fill="FFFFFF"/>
+            <w:tcMar>
+              <w:top w:w="100" w:type="dxa"/>
+              <w:bottom w:w="100" w:type="dxa"/>
+              <w:left w:w="140" w:type="dxa"/>
+              <w:right w:w="140" w:type="dxa"/>
+            </w:tcMar>
+          </w:tcPr>
+          <w:p>
+            <w:pPr>
+              <w:spacing w:line="276" w:lineRule="auto" w:after="40" w:before="40"/>
+              <w:jc w:val="center"/>
+            </w:pPr>
+            <w:r>
+              <w:rPr>
+                <w:rFonts w:ascii="Times New Roman" w:hAnsi="Times New Roman" w:cs="Times New Roman" w:eastAsia="Times New Roman"/>
+                <w:color w:val="0F172A"/>
+                <w:sz w:val="21"/>
+              </w:rPr>
               <w:t>Tuần 05 (Từ: 24/08/2026 Đến: 30/08/2026)</w:t>
             </w:r>
           </w:p>
@@ -1885,9 +3003,24 @@
               <w:bottom w:val="dotted" w:sz="4" w:space="0" w:color="000000"/>
             </w:tcBorders>
             <w:vAlign w:val="center"/>
-          </w:tcPr>
-          <w:p>
-            <w:r>
+            <w:shd w:fill="FFFFFF"/>
+            <w:tcMar>
+              <w:top w:w="100" w:type="dxa"/>
+              <w:bottom w:w="100" w:type="dxa"/>
+              <w:left w:w="140" w:type="dxa"/>
+              <w:right w:w="140" w:type="dxa"/>
+            </w:tcMar>
+          </w:tcPr>
+          <w:p>
+            <w:pPr>
+              <w:spacing w:line="276" w:lineRule="auto" w:after="40" w:before="40"/>
+            </w:pPr>
+            <w:r>
+              <w:rPr>
+                <w:rFonts w:ascii="Times New Roman" w:hAnsi="Times New Roman" w:cs="Times New Roman" w:eastAsia="Times New Roman"/>
+                <w:color w:val="0F172A"/>
+                <w:sz w:val="21"/>
+              </w:rPr>
               <w:t>Phát triển phân hệ Khách tìm thuê: Tìm kiếm AI ngôn ngữ tự nhiên, bộ lọc đa tiêu chí. (Sản phẩm: Module Tìm kiếm AI)</w:t>
             </w:r>
           </w:p>
@@ -1898,9 +3031,25 @@
             <w:tcBorders>
               <w:bottom w:val="dotted" w:sz="4" w:space="0" w:color="000000"/>
             </w:tcBorders>
-          </w:tcPr>
-          <w:p>
-            <w:r>
+            <w:vAlign w:val="center"/>
+            <w:shd w:fill="FFFFFF"/>
+            <w:tcMar>
+              <w:top w:w="100" w:type="dxa"/>
+              <w:bottom w:w="100" w:type="dxa"/>
+              <w:left w:w="140" w:type="dxa"/>
+              <w:right w:w="140" w:type="dxa"/>
+            </w:tcMar>
+          </w:tcPr>
+          <w:p>
+            <w:pPr>
+              <w:spacing w:line="276" w:lineRule="auto" w:after="40" w:before="40"/>
+            </w:pPr>
+            <w:r>
+              <w:rPr>
+                <w:rFonts w:ascii="Times New Roman" w:hAnsi="Times New Roman" w:cs="Times New Roman" w:eastAsia="Times New Roman"/>
+                <w:color w:val="0F172A"/>
+                <w:sz w:val="21"/>
+              </w:rPr>
               <w:t>Vũ Ngọc Sơn</w:t>
             </w:r>
           </w:p>
@@ -1909,6 +3058,7 @@
       <w:tr>
         <w:trPr>
           <w:trHeight w:val="340" w:hRule="atLeast"/>
+          <w:cantSplit/>
         </w:trPr>
         <w:tc>
           <w:tcPr>
@@ -1950,9 +3100,25 @@
               <w:bottom w:val="dotted" w:sz="4" w:space="0" w:color="000000"/>
             </w:tcBorders>
             <w:vAlign w:val="center"/>
-          </w:tcPr>
-          <w:p>
-            <w:r>
+            <w:shd w:fill="F8FAFC"/>
+            <w:tcMar>
+              <w:top w:w="100" w:type="dxa"/>
+              <w:bottom w:w="100" w:type="dxa"/>
+              <w:left w:w="140" w:type="dxa"/>
+              <w:right w:w="140" w:type="dxa"/>
+            </w:tcMar>
+          </w:tcPr>
+          <w:p>
+            <w:pPr>
+              <w:spacing w:line="276" w:lineRule="auto" w:after="40" w:before="40"/>
+              <w:jc w:val="center"/>
+            </w:pPr>
+            <w:r>
+              <w:rPr>
+                <w:rFonts w:ascii="Times New Roman" w:hAnsi="Times New Roman" w:cs="Times New Roman" w:eastAsia="Times New Roman"/>
+                <w:color w:val="0F172A"/>
+                <w:sz w:val="21"/>
+              </w:rPr>
               <w:t>Tuần 05 (Từ: 24/08/2026 Đến: 30/08/2026)</w:t>
             </w:r>
           </w:p>
@@ -1965,9 +3131,24 @@
               <w:bottom w:val="dotted" w:sz="4" w:space="0" w:color="000000"/>
             </w:tcBorders>
             <w:vAlign w:val="center"/>
-          </w:tcPr>
-          <w:p>
-            <w:r>
+            <w:shd w:fill="F8FAFC"/>
+            <w:tcMar>
+              <w:top w:w="100" w:type="dxa"/>
+              <w:bottom w:w="100" w:type="dxa"/>
+              <w:left w:w="140" w:type="dxa"/>
+              <w:right w:w="140" w:type="dxa"/>
+            </w:tcMar>
+          </w:tcPr>
+          <w:p>
+            <w:pPr>
+              <w:spacing w:line="276" w:lineRule="auto" w:after="40" w:before="40"/>
+            </w:pPr>
+            <w:r>
+              <w:rPr>
+                <w:rFonts w:ascii="Times New Roman" w:hAnsi="Times New Roman" w:cs="Times New Roman" w:eastAsia="Times New Roman"/>
+                <w:color w:val="0F172A"/>
+                <w:sz w:val="21"/>
+              </w:rPr>
               <w:t>Phát triển Bản đồ PCCC &amp; Ngập lụt và So sánh đa chiều (Radar Chart 5 trục). (Sản phẩm: Module Bản đồ &amp; Radar)</w:t>
             </w:r>
           </w:p>
@@ -1979,9 +3160,25 @@
               <w:top w:val="dotted" w:sz="4" w:space="0" w:color="000000"/>
               <w:bottom w:val="dotted" w:sz="4" w:space="0" w:color="000000"/>
             </w:tcBorders>
-          </w:tcPr>
-          <w:p>
-            <w:r>
+            <w:vAlign w:val="center"/>
+            <w:shd w:fill="F8FAFC"/>
+            <w:tcMar>
+              <w:top w:w="100" w:type="dxa"/>
+              <w:bottom w:w="100" w:type="dxa"/>
+              <w:left w:w="140" w:type="dxa"/>
+              <w:right w:w="140" w:type="dxa"/>
+            </w:tcMar>
+          </w:tcPr>
+          <w:p>
+            <w:pPr>
+              <w:spacing w:line="276" w:lineRule="auto" w:after="40" w:before="40"/>
+            </w:pPr>
+            <w:r>
+              <w:rPr>
+                <w:rFonts w:ascii="Times New Roman" w:hAnsi="Times New Roman" w:cs="Times New Roman" w:eastAsia="Times New Roman"/>
+                <w:color w:val="0F172A"/>
+                <w:sz w:val="21"/>
+              </w:rPr>
               <w:t>Vũ Bảo Linh</w:t>
             </w:r>
           </w:p>
@@ -1990,6 +3187,7 @@
       <w:tr>
         <w:trPr>
           <w:trHeight w:val="340" w:hRule="atLeast"/>
+          <w:cantSplit/>
         </w:trPr>
         <w:tc>
           <w:tcPr>
@@ -2031,9 +3229,25 @@
               <w:bottom w:val="dotted" w:sz="4" w:space="0" w:color="000000"/>
             </w:tcBorders>
             <w:vAlign w:val="center"/>
-          </w:tcPr>
-          <w:p>
-            <w:r>
+            <w:shd w:fill="FFFFFF"/>
+            <w:tcMar>
+              <w:top w:w="100" w:type="dxa"/>
+              <w:bottom w:w="100" w:type="dxa"/>
+              <w:left w:w="140" w:type="dxa"/>
+              <w:right w:w="140" w:type="dxa"/>
+            </w:tcMar>
+          </w:tcPr>
+          <w:p>
+            <w:pPr>
+              <w:spacing w:line="276" w:lineRule="auto" w:after="40" w:before="40"/>
+              <w:jc w:val="center"/>
+            </w:pPr>
+            <w:r>
+              <w:rPr>
+                <w:rFonts w:ascii="Times New Roman" w:hAnsi="Times New Roman" w:cs="Times New Roman" w:eastAsia="Times New Roman"/>
+                <w:color w:val="0F172A"/>
+                <w:sz w:val="21"/>
+              </w:rPr>
               <w:t>Tuần 05 (Từ: 24/08/2026 Đến: 30/08/2026)</w:t>
             </w:r>
           </w:p>
@@ -2046,9 +3260,24 @@
               <w:bottom w:val="dotted" w:sz="4" w:space="0" w:color="000000"/>
             </w:tcBorders>
             <w:vAlign w:val="center"/>
-          </w:tcPr>
-          <w:p>
-            <w:r>
+            <w:shd w:fill="FFFFFF"/>
+            <w:tcMar>
+              <w:top w:w="100" w:type="dxa"/>
+              <w:bottom w:w="100" w:type="dxa"/>
+              <w:left w:w="140" w:type="dxa"/>
+              <w:right w:w="140" w:type="dxa"/>
+            </w:tcMar>
+          </w:tcPr>
+          <w:p>
+            <w:pPr>
+              <w:spacing w:line="276" w:lineRule="auto" w:after="40" w:before="40"/>
+            </w:pPr>
+            <w:r>
+              <w:rPr>
+                <w:rFonts w:ascii="Times New Roman" w:hAnsi="Times New Roman" w:cs="Times New Roman" w:eastAsia="Times New Roman"/>
+                <w:color w:val="0F172A"/>
+                <w:sz w:val="21"/>
+              </w:rPr>
               <w:t>Xây dựng Cẩm nang khu vực &amp; Công cụ giả lập tuyến đường đi làm (Commute Simulator). (Sản phẩm: Module Cẩm nang &amp; Commute)</w:t>
             </w:r>
           </w:p>
@@ -2060,9 +3289,25 @@
               <w:top w:val="dotted" w:sz="4" w:space="0" w:color="000000"/>
               <w:bottom w:val="dotted" w:sz="4" w:space="0" w:color="000000"/>
             </w:tcBorders>
-          </w:tcPr>
-          <w:p>
-            <w:r>
+            <w:vAlign w:val="center"/>
+            <w:shd w:fill="FFFFFF"/>
+            <w:tcMar>
+              <w:top w:w="100" w:type="dxa"/>
+              <w:bottom w:w="100" w:type="dxa"/>
+              <w:left w:w="140" w:type="dxa"/>
+              <w:right w:w="140" w:type="dxa"/>
+            </w:tcMar>
+          </w:tcPr>
+          <w:p>
+            <w:pPr>
+              <w:spacing w:line="276" w:lineRule="auto" w:after="40" w:before="40"/>
+            </w:pPr>
+            <w:r>
+              <w:rPr>
+                <w:rFonts w:ascii="Times New Roman" w:hAnsi="Times New Roman" w:cs="Times New Roman" w:eastAsia="Times New Roman"/>
+                <w:color w:val="0F172A"/>
+                <w:sz w:val="21"/>
+              </w:rPr>
               <w:t>Tô Văn Quyền</w:t>
             </w:r>
           </w:p>
@@ -2071,6 +3316,7 @@
       <w:tr>
         <w:trPr>
           <w:trHeight w:val="340" w:hRule="atLeast"/>
+          <w:cantSplit/>
         </w:trPr>
         <w:tc>
           <w:tcPr>
@@ -2112,9 +3358,25 @@
               <w:bottom w:val="dotted" w:sz="4" w:space="0" w:color="000000"/>
             </w:tcBorders>
             <w:vAlign w:val="center"/>
-          </w:tcPr>
-          <w:p>
-            <w:r>
+            <w:shd w:fill="F8FAFC"/>
+            <w:tcMar>
+              <w:top w:w="100" w:type="dxa"/>
+              <w:bottom w:w="100" w:type="dxa"/>
+              <w:left w:w="140" w:type="dxa"/>
+              <w:right w:w="140" w:type="dxa"/>
+            </w:tcMar>
+          </w:tcPr>
+          <w:p>
+            <w:pPr>
+              <w:spacing w:line="276" w:lineRule="auto" w:after="40" w:before="40"/>
+              <w:jc w:val="center"/>
+            </w:pPr>
+            <w:r>
+              <w:rPr>
+                <w:rFonts w:ascii="Times New Roman" w:hAnsi="Times New Roman" w:cs="Times New Roman" w:eastAsia="Times New Roman"/>
+                <w:color w:val="0F172A"/>
+                <w:sz w:val="21"/>
+              </w:rPr>
               <w:t>Tuần 05 (Từ: 24/08/2026 Đến: 30/08/2026)</w:t>
             </w:r>
           </w:p>
@@ -2127,9 +3389,24 @@
               <w:bottom w:val="dotted" w:sz="4" w:space="0" w:color="000000"/>
             </w:tcBorders>
             <w:vAlign w:val="center"/>
-          </w:tcPr>
-          <w:p>
-            <w:r>
+            <w:shd w:fill="F8FAFC"/>
+            <w:tcMar>
+              <w:top w:w="100" w:type="dxa"/>
+              <w:bottom w:w="100" w:type="dxa"/>
+              <w:left w:w="140" w:type="dxa"/>
+              <w:right w:w="140" w:type="dxa"/>
+            </w:tcMar>
+          </w:tcPr>
+          <w:p>
+            <w:pPr>
+              <w:spacing w:line="276" w:lineRule="auto" w:after="40" w:before="40"/>
+            </w:pPr>
+            <w:r>
+              <w:rPr>
+                <w:rFonts w:ascii="Times New Roman" w:hAnsi="Times New Roman" w:cs="Times New Roman" w:eastAsia="Times New Roman"/>
+                <w:color w:val="0F172A"/>
+                <w:sz w:val="21"/>
+              </w:rPr>
               <w:t>Tích hợp Tour tham quan thực tế ảo 360 độ và Thư viện tài liệu mẫu. (Sản phẩm: Module VR 360 &amp; Docs)</w:t>
             </w:r>
           </w:p>
@@ -2141,9 +3418,25 @@
               <w:top w:val="dotted" w:sz="4" w:space="0" w:color="000000"/>
               <w:bottom w:val="dotted" w:sz="4" w:space="0" w:color="000000"/>
             </w:tcBorders>
-          </w:tcPr>
-          <w:p>
-            <w:r>
+            <w:vAlign w:val="center"/>
+            <w:shd w:fill="F8FAFC"/>
+            <w:tcMar>
+              <w:top w:w="100" w:type="dxa"/>
+              <w:bottom w:w="100" w:type="dxa"/>
+              <w:left w:w="140" w:type="dxa"/>
+              <w:right w:w="140" w:type="dxa"/>
+            </w:tcMar>
+          </w:tcPr>
+          <w:p>
+            <w:pPr>
+              <w:spacing w:line="276" w:lineRule="auto" w:after="40" w:before="40"/>
+            </w:pPr>
+            <w:r>
+              <w:rPr>
+                <w:rFonts w:ascii="Times New Roman" w:hAnsi="Times New Roman" w:cs="Times New Roman" w:eastAsia="Times New Roman"/>
+                <w:color w:val="0F172A"/>
+                <w:sz w:val="21"/>
+              </w:rPr>
               <w:t>Lê Bình Nguyên</w:t>
             </w:r>
           </w:p>
@@ -2152,6 +3445,7 @@
       <w:tr>
         <w:trPr>
           <w:trHeight w:val="340" w:hRule="atLeast"/>
+          <w:cantSplit/>
         </w:trPr>
         <w:tc>
           <w:tcPr>
@@ -2193,9 +3487,25 @@
               <w:bottom w:val="dotted" w:sz="4" w:space="0" w:color="000000"/>
             </w:tcBorders>
             <w:vAlign w:val="center"/>
-          </w:tcPr>
-          <w:p>
-            <w:r>
+            <w:shd w:fill="FFFFFF"/>
+            <w:tcMar>
+              <w:top w:w="100" w:type="dxa"/>
+              <w:bottom w:w="100" w:type="dxa"/>
+              <w:left w:w="140" w:type="dxa"/>
+              <w:right w:w="140" w:type="dxa"/>
+            </w:tcMar>
+          </w:tcPr>
+          <w:p>
+            <w:pPr>
+              <w:spacing w:line="276" w:lineRule="auto" w:after="40" w:before="40"/>
+              <w:jc w:val="center"/>
+            </w:pPr>
+            <w:r>
+              <w:rPr>
+                <w:rFonts w:ascii="Times New Roman" w:hAnsi="Times New Roman" w:cs="Times New Roman" w:eastAsia="Times New Roman"/>
+                <w:color w:val="0F172A"/>
+                <w:sz w:val="21"/>
+              </w:rPr>
               <w:t>Tuần 05 (Từ: 24/08/2026 Đến: 30/08/2026)</w:t>
             </w:r>
           </w:p>
@@ -2208,9 +3518,24 @@
               <w:bottom w:val="dotted" w:sz="4" w:space="0" w:color="000000"/>
             </w:tcBorders>
             <w:vAlign w:val="center"/>
-          </w:tcPr>
-          <w:p>
-            <w:r>
+            <w:shd w:fill="FFFFFF"/>
+            <w:tcMar>
+              <w:top w:w="100" w:type="dxa"/>
+              <w:bottom w:w="100" w:type="dxa"/>
+              <w:left w:w="140" w:type="dxa"/>
+              <w:right w:w="140" w:type="dxa"/>
+            </w:tcMar>
+          </w:tcPr>
+          <w:p>
+            <w:pPr>
+              <w:spacing w:line="276" w:lineRule="auto" w:after="40" w:before="40"/>
+            </w:pPr>
+            <w:r>
+              <w:rPr>
+                <w:rFonts w:ascii="Times New Roman" w:hAnsi="Times New Roman" w:cs="Times New Roman" w:eastAsia="Times New Roman"/>
+                <w:color w:val="0F172A"/>
+                <w:sz w:val="21"/>
+              </w:rPr>
               <w:t>Kiểm thử chức năng phân hệ Tenant (Unit Testing &amp; UI Interaction Testing). (Sản phẩm: Báo cáo test phân hệ Tenant)</w:t>
             </w:r>
           </w:p>
@@ -2222,9 +3547,25 @@
               <w:top w:val="dotted" w:sz="4" w:space="0" w:color="000000"/>
               <w:bottom w:val="dotted" w:sz="4" w:space="0" w:color="000000"/>
             </w:tcBorders>
-          </w:tcPr>
-          <w:p>
-            <w:r>
+            <w:vAlign w:val="center"/>
+            <w:shd w:fill="FFFFFF"/>
+            <w:tcMar>
+              <w:top w:w="100" w:type="dxa"/>
+              <w:bottom w:w="100" w:type="dxa"/>
+              <w:left w:w="140" w:type="dxa"/>
+              <w:right w:w="140" w:type="dxa"/>
+            </w:tcMar>
+          </w:tcPr>
+          <w:p>
+            <w:pPr>
+              <w:spacing w:line="276" w:lineRule="auto" w:after="40" w:before="40"/>
+            </w:pPr>
+            <w:r>
+              <w:rPr>
+                <w:rFonts w:ascii="Times New Roman" w:hAnsi="Times New Roman" w:cs="Times New Roman" w:eastAsia="Times New Roman"/>
+                <w:color w:val="0F172A"/>
+                <w:sz w:val="21"/>
+              </w:rPr>
               <w:t>Cả nhóm</w:t>
             </w:r>
           </w:p>
@@ -2233,6 +3574,7 @@
       <w:tr>
         <w:trPr>
           <w:trHeight w:val="340" w:hRule="atLeast"/>
+          <w:cantSplit/>
         </w:trPr>
         <w:tc>
           <w:tcPr>
@@ -2273,9 +3615,25 @@
               <w:top w:val="dotted" w:sz="4" w:space="0" w:color="000000"/>
             </w:tcBorders>
             <w:vAlign w:val="center"/>
-          </w:tcPr>
-          <w:p>
-            <w:r>
+            <w:shd w:fill="F8FAFC"/>
+            <w:tcMar>
+              <w:top w:w="100" w:type="dxa"/>
+              <w:bottom w:w="100" w:type="dxa"/>
+              <w:left w:w="140" w:type="dxa"/>
+              <w:right w:w="140" w:type="dxa"/>
+            </w:tcMar>
+          </w:tcPr>
+          <w:p>
+            <w:pPr>
+              <w:spacing w:line="276" w:lineRule="auto" w:after="40" w:before="40"/>
+              <w:jc w:val="center"/>
+            </w:pPr>
+            <w:r>
+              <w:rPr>
+                <w:rFonts w:ascii="Times New Roman" w:hAnsi="Times New Roman" w:cs="Times New Roman" w:eastAsia="Times New Roman"/>
+                <w:color w:val="0F172A"/>
+                <w:sz w:val="21"/>
+              </w:rPr>
               <w:t>Tuần 06 (Từ: 31/08/2026 Đến: 06/09/2026)</w:t>
             </w:r>
           </w:p>
@@ -2287,9 +3645,24 @@
               <w:top w:val="dotted" w:sz="4" w:space="0" w:color="000000"/>
             </w:tcBorders>
             <w:vAlign w:val="center"/>
-          </w:tcPr>
-          <w:p>
-            <w:r>
+            <w:shd w:fill="F8FAFC"/>
+            <w:tcMar>
+              <w:top w:w="100" w:type="dxa"/>
+              <w:bottom w:w="100" w:type="dxa"/>
+              <w:left w:w="140" w:type="dxa"/>
+              <w:right w:w="140" w:type="dxa"/>
+            </w:tcMar>
+          </w:tcPr>
+          <w:p>
+            <w:pPr>
+              <w:spacing w:line="276" w:lineRule="auto" w:after="40" w:before="40"/>
+            </w:pPr>
+            <w:r>
+              <w:rPr>
+                <w:rFonts w:ascii="Times New Roman" w:hAnsi="Times New Roman" w:cs="Times New Roman" w:eastAsia="Times New Roman"/>
+                <w:color w:val="0F172A"/>
+                <w:sz w:val="21"/>
+              </w:rPr>
               <w:t>Phát triển phân hệ Chủ nhà: Trình soạn tin đăng tự động bằng AI (Smart Listing Creator). (Sản phẩm: Module Soạn tin AI)</w:t>
             </w:r>
           </w:p>
@@ -2300,9 +3673,25 @@
             <w:tcBorders>
               <w:top w:val="dotted" w:sz="4" w:space="0" w:color="000000"/>
             </w:tcBorders>
-          </w:tcPr>
-          <w:p>
-            <w:r>
+            <w:vAlign w:val="center"/>
+            <w:shd w:fill="F8FAFC"/>
+            <w:tcMar>
+              <w:top w:w="100" w:type="dxa"/>
+              <w:bottom w:w="100" w:type="dxa"/>
+              <w:left w:w="140" w:type="dxa"/>
+              <w:right w:w="140" w:type="dxa"/>
+            </w:tcMar>
+          </w:tcPr>
+          <w:p>
+            <w:pPr>
+              <w:spacing w:line="276" w:lineRule="auto" w:after="40" w:before="40"/>
+            </w:pPr>
+            <w:r>
+              <w:rPr>
+                <w:rFonts w:ascii="Times New Roman" w:hAnsi="Times New Roman" w:cs="Times New Roman" w:eastAsia="Times New Roman"/>
+                <w:color w:val="0F172A"/>
+                <w:sz w:val="21"/>
+              </w:rPr>
               <w:t>Vũ Ngọc Sơn</w:t>
             </w:r>
           </w:p>
@@ -2311,6 +3700,7 @@
       <w:tr>
         <w:trPr>
           <w:trHeight w:val="340" w:hRule="atLeast"/>
+          <w:cantSplit/>
         </w:trPr>
         <w:tc>
           <w:tcPr>
@@ -2318,9 +3708,25 @@
             <w:vMerge w:val="restart"/>
             <w:tcBorders/>
             <w:vAlign w:val="center"/>
-          </w:tcPr>
-          <w:p>
-            <w:r>
+            <w:shd w:fill="FFFFFF"/>
+            <w:tcMar>
+              <w:top w:w="100" w:type="dxa"/>
+              <w:bottom w:w="100" w:type="dxa"/>
+              <w:left w:w="140" w:type="dxa"/>
+              <w:right w:w="140" w:type="dxa"/>
+            </w:tcMar>
+          </w:tcPr>
+          <w:p>
+            <w:pPr>
+              <w:spacing w:line="276" w:lineRule="auto" w:after="40" w:before="40"/>
+              <w:jc w:val="center"/>
+            </w:pPr>
+            <w:r>
+              <w:rPr>
+                <w:rFonts w:ascii="Times New Roman" w:hAnsi="Times New Roman" w:cs="Times New Roman" w:eastAsia="Times New Roman"/>
+                <w:color w:val="0F172A"/>
+                <w:sz w:val="21"/>
+              </w:rPr>
               <w:t>31</w:t>
             </w:r>
           </w:p>
@@ -2330,9 +3736,25 @@
             <w:tcW w:w="3456" w:type="dxa"/>
             <w:tcBorders/>
             <w:vAlign w:val="center"/>
-          </w:tcPr>
-          <w:p>
-            <w:r>
+            <w:shd w:fill="FFFFFF"/>
+            <w:tcMar>
+              <w:top w:w="100" w:type="dxa"/>
+              <w:bottom w:w="100" w:type="dxa"/>
+              <w:left w:w="140" w:type="dxa"/>
+              <w:right w:w="140" w:type="dxa"/>
+            </w:tcMar>
+          </w:tcPr>
+          <w:p>
+            <w:pPr>
+              <w:spacing w:line="276" w:lineRule="auto" w:after="40" w:before="40"/>
+              <w:jc w:val="center"/>
+            </w:pPr>
+            <w:r>
+              <w:rPr>
+                <w:rFonts w:ascii="Times New Roman" w:hAnsi="Times New Roman" w:cs="Times New Roman" w:eastAsia="Times New Roman"/>
+                <w:color w:val="0F172A"/>
+                <w:sz w:val="21"/>
+              </w:rPr>
               <w:t>Tuần 06 (Từ: 31/08/2026 Đến: 06/09/2026)</w:t>
             </w:r>
           </w:p>
@@ -2342,9 +3764,24 @@
             <w:tcW w:w="2281" w:type="dxa"/>
             <w:tcBorders/>
             <w:vAlign w:val="center"/>
-          </w:tcPr>
-          <w:p>
-            <w:r>
+            <w:shd w:fill="FFFFFF"/>
+            <w:tcMar>
+              <w:top w:w="100" w:type="dxa"/>
+              <w:bottom w:w="100" w:type="dxa"/>
+              <w:left w:w="140" w:type="dxa"/>
+              <w:right w:w="140" w:type="dxa"/>
+            </w:tcMar>
+          </w:tcPr>
+          <w:p>
+            <w:pPr>
+              <w:spacing w:line="276" w:lineRule="auto" w:after="40" w:before="40"/>
+            </w:pPr>
+            <w:r>
+              <w:rPr>
+                <w:rFonts w:ascii="Times New Roman" w:hAnsi="Times New Roman" w:cs="Times New Roman" w:eastAsia="Times New Roman"/>
+                <w:color w:val="0F172A"/>
+                <w:sz w:val="21"/>
+              </w:rPr>
               <w:t>Phát triển Bảng quản trị danh mục phòng, sơ đồ mặt bằng (Floor Plan Layout). (Sản phẩm: Module Quản lý phòng)</w:t>
             </w:r>
           </w:p>
@@ -2353,9 +3790,25 @@
           <w:tcPr>
             <w:tcW w:w="1789" w:type="dxa"/>
             <w:tcBorders/>
-          </w:tcPr>
-          <w:p>
-            <w:r>
+            <w:vAlign w:val="center"/>
+            <w:shd w:fill="FFFFFF"/>
+            <w:tcMar>
+              <w:top w:w="100" w:type="dxa"/>
+              <w:bottom w:w="100" w:type="dxa"/>
+              <w:left w:w="140" w:type="dxa"/>
+              <w:right w:w="140" w:type="dxa"/>
+            </w:tcMar>
+          </w:tcPr>
+          <w:p>
+            <w:pPr>
+              <w:spacing w:line="276" w:lineRule="auto" w:after="40" w:before="40"/>
+            </w:pPr>
+            <w:r>
+              <w:rPr>
+                <w:rFonts w:ascii="Times New Roman" w:hAnsi="Times New Roman" w:cs="Times New Roman" w:eastAsia="Times New Roman"/>
+                <w:color w:val="0F172A"/>
+                <w:sz w:val="21"/>
+              </w:rPr>
               <w:t>Vũ Bảo Linh</w:t>
             </w:r>
           </w:p>
@@ -2364,6 +3817,7 @@
       <w:tr>
         <w:trPr>
           <w:trHeight w:val="340" w:hRule="atLeast"/>
+          <w:cantSplit/>
         </w:trPr>
         <w:tc>
           <w:tcPr>
@@ -2404,9 +3858,25 @@
               <w:bottom w:val="dotted" w:sz="4" w:space="0" w:color="000000"/>
             </w:tcBorders>
             <w:vAlign w:val="center"/>
-          </w:tcPr>
-          <w:p>
-            <w:r>
+            <w:shd w:fill="F8FAFC"/>
+            <w:tcMar>
+              <w:top w:w="100" w:type="dxa"/>
+              <w:bottom w:w="100" w:type="dxa"/>
+              <w:left w:w="140" w:type="dxa"/>
+              <w:right w:w="140" w:type="dxa"/>
+            </w:tcMar>
+          </w:tcPr>
+          <w:p>
+            <w:pPr>
+              <w:spacing w:line="276" w:lineRule="auto" w:after="40" w:before="40"/>
+              <w:jc w:val="center"/>
+            </w:pPr>
+            <w:r>
+              <w:rPr>
+                <w:rFonts w:ascii="Times New Roman" w:hAnsi="Times New Roman" w:cs="Times New Roman" w:eastAsia="Times New Roman"/>
+                <w:color w:val="0F172A"/>
+                <w:sz w:val="21"/>
+              </w:rPr>
               <w:t>Tuần 06 (Từ: 31/08/2026 Đến: 06/09/2026)</w:t>
             </w:r>
           </w:p>
@@ -2418,9 +3888,24 @@
               <w:bottom w:val="dotted" w:sz="4" w:space="0" w:color="000000"/>
             </w:tcBorders>
             <w:vAlign w:val="center"/>
-          </w:tcPr>
-          <w:p>
-            <w:r>
+            <w:shd w:fill="F8FAFC"/>
+            <w:tcMar>
+              <w:top w:w="100" w:type="dxa"/>
+              <w:bottom w:w="100" w:type="dxa"/>
+              <w:left w:w="140" w:type="dxa"/>
+              <w:right w:w="140" w:type="dxa"/>
+            </w:tcMar>
+          </w:tcPr>
+          <w:p>
+            <w:pPr>
+              <w:spacing w:line="276" w:lineRule="auto" w:after="40" w:before="40"/>
+            </w:pPr>
+            <w:r>
+              <w:rPr>
+                <w:rFonts w:ascii="Times New Roman" w:hAnsi="Times New Roman" w:cs="Times New Roman" w:eastAsia="Times New Roman"/>
+                <w:color w:val="0F172A"/>
+                <w:sz w:val="21"/>
+              </w:rPr>
               <w:t>Phát triển Hệ thống quản lý Lead &amp; Đặt lịch xem phòng trực tiếp. (Sản phẩm: Module Quản lý Lead)</w:t>
             </w:r>
           </w:p>
@@ -2431,9 +3916,25 @@
             <w:tcBorders>
               <w:bottom w:val="dotted" w:sz="4" w:space="0" w:color="000000"/>
             </w:tcBorders>
-          </w:tcPr>
-          <w:p>
-            <w:r>
+            <w:vAlign w:val="center"/>
+            <w:shd w:fill="F8FAFC"/>
+            <w:tcMar>
+              <w:top w:w="100" w:type="dxa"/>
+              <w:bottom w:w="100" w:type="dxa"/>
+              <w:left w:w="140" w:type="dxa"/>
+              <w:right w:w="140" w:type="dxa"/>
+            </w:tcMar>
+          </w:tcPr>
+          <w:p>
+            <w:pPr>
+              <w:spacing w:line="276" w:lineRule="auto" w:after="40" w:before="40"/>
+            </w:pPr>
+            <w:r>
+              <w:rPr>
+                <w:rFonts w:ascii="Times New Roman" w:hAnsi="Times New Roman" w:cs="Times New Roman" w:eastAsia="Times New Roman"/>
+                <w:color w:val="0F172A"/>
+                <w:sz w:val="21"/>
+              </w:rPr>
               <w:t>Tô Văn Quyền</w:t>
             </w:r>
           </w:p>
@@ -2442,6 +3943,7 @@
       <w:tr>
         <w:trPr>
           <w:trHeight w:val="340" w:hRule="atLeast"/>
+          <w:cantSplit/>
         </w:trPr>
         <w:tc>
           <w:tcPr>
@@ -2483,9 +3985,25 @@
               <w:bottom w:val="dotted" w:sz="4" w:space="0" w:color="000000"/>
             </w:tcBorders>
             <w:vAlign w:val="center"/>
-          </w:tcPr>
-          <w:p>
-            <w:r>
+            <w:shd w:fill="FFFFFF"/>
+            <w:tcMar>
+              <w:top w:w="100" w:type="dxa"/>
+              <w:bottom w:w="100" w:type="dxa"/>
+              <w:left w:w="140" w:type="dxa"/>
+              <w:right w:w="140" w:type="dxa"/>
+            </w:tcMar>
+          </w:tcPr>
+          <w:p>
+            <w:pPr>
+              <w:spacing w:line="276" w:lineRule="auto" w:after="40" w:before="40"/>
+              <w:jc w:val="center"/>
+            </w:pPr>
+            <w:r>
+              <w:rPr>
+                <w:rFonts w:ascii="Times New Roman" w:hAnsi="Times New Roman" w:cs="Times New Roman" w:eastAsia="Times New Roman"/>
+                <w:color w:val="0F172A"/>
+                <w:sz w:val="21"/>
+              </w:rPr>
               <w:t>Tuần 06 (Từ: 31/08/2026 Đến: 06/09/2026)</w:t>
             </w:r>
           </w:p>
@@ -2498,9 +4016,24 @@
               <w:bottom w:val="dotted" w:sz="4" w:space="0" w:color="000000"/>
             </w:tcBorders>
             <w:vAlign w:val="center"/>
-          </w:tcPr>
-          <w:p>
-            <w:r>
+            <w:shd w:fill="FFFFFF"/>
+            <w:tcMar>
+              <w:top w:w="100" w:type="dxa"/>
+              <w:bottom w:w="100" w:type="dxa"/>
+              <w:left w:w="140" w:type="dxa"/>
+              <w:right w:w="140" w:type="dxa"/>
+            </w:tcMar>
+          </w:tcPr>
+          <w:p>
+            <w:pPr>
+              <w:spacing w:line="276" w:lineRule="auto" w:after="40" w:before="40"/>
+            </w:pPr>
+            <w:r>
+              <w:rPr>
+                <w:rFonts w:ascii="Times New Roman" w:hAnsi="Times New Roman" w:cs="Times New Roman" w:eastAsia="Times New Roman"/>
+                <w:color w:val="0F172A"/>
+                <w:sz w:val="21"/>
+              </w:rPr>
               <w:t>Xây dựng Trình tạo hợp đồng điện tử E-Sign và Hóa đơn thu tiền tự động. (Sản phẩm: Module Hợp đồng &amp; Hóa đơn)</w:t>
             </w:r>
           </w:p>
@@ -2512,9 +4045,25 @@
               <w:top w:val="dotted" w:sz="4" w:space="0" w:color="000000"/>
               <w:bottom w:val="dotted" w:sz="4" w:space="0" w:color="000000"/>
             </w:tcBorders>
-          </w:tcPr>
-          <w:p>
-            <w:r>
+            <w:vAlign w:val="center"/>
+            <w:shd w:fill="FFFFFF"/>
+            <w:tcMar>
+              <w:top w:w="100" w:type="dxa"/>
+              <w:bottom w:w="100" w:type="dxa"/>
+              <w:left w:w="140" w:type="dxa"/>
+              <w:right w:w="140" w:type="dxa"/>
+            </w:tcMar>
+          </w:tcPr>
+          <w:p>
+            <w:pPr>
+              <w:spacing w:line="276" w:lineRule="auto" w:after="40" w:before="40"/>
+            </w:pPr>
+            <w:r>
+              <w:rPr>
+                <w:rFonts w:ascii="Times New Roman" w:hAnsi="Times New Roman" w:cs="Times New Roman" w:eastAsia="Times New Roman"/>
+                <w:color w:val="0F172A"/>
+                <w:sz w:val="21"/>
+              </w:rPr>
               <w:t>Lê Bình Nguyên</w:t>
             </w:r>
           </w:p>
@@ -2523,6 +4072,7 @@
       <w:tr>
         <w:trPr>
           <w:trHeight w:val="340" w:hRule="atLeast"/>
+          <w:cantSplit/>
         </w:trPr>
         <w:tc>
           <w:tcPr>
@@ -2564,9 +4114,25 @@
               <w:bottom w:val="dotted" w:sz="4" w:space="0" w:color="000000"/>
             </w:tcBorders>
             <w:vAlign w:val="center"/>
-          </w:tcPr>
-          <w:p>
-            <w:r>
+            <w:shd w:fill="F8FAFC"/>
+            <w:tcMar>
+              <w:top w:w="100" w:type="dxa"/>
+              <w:bottom w:w="100" w:type="dxa"/>
+              <w:left w:w="140" w:type="dxa"/>
+              <w:right w:w="140" w:type="dxa"/>
+            </w:tcMar>
+          </w:tcPr>
+          <w:p>
+            <w:pPr>
+              <w:spacing w:line="276" w:lineRule="auto" w:after="40" w:before="40"/>
+              <w:jc w:val="center"/>
+            </w:pPr>
+            <w:r>
+              <w:rPr>
+                <w:rFonts w:ascii="Times New Roman" w:hAnsi="Times New Roman" w:cs="Times New Roman" w:eastAsia="Times New Roman"/>
+                <w:color w:val="0F172A"/>
+                <w:sz w:val="21"/>
+              </w:rPr>
               <w:t>Tuần 06 (Từ: 31/08/2026 Đến: 06/09/2026)</w:t>
             </w:r>
           </w:p>
@@ -2579,9 +4145,24 @@
               <w:bottom w:val="dotted" w:sz="4" w:space="0" w:color="000000"/>
             </w:tcBorders>
             <w:vAlign w:val="center"/>
-          </w:tcPr>
-          <w:p>
-            <w:r>
+            <w:shd w:fill="F8FAFC"/>
+            <w:tcMar>
+              <w:top w:w="100" w:type="dxa"/>
+              <w:bottom w:w="100" w:type="dxa"/>
+              <w:left w:w="140" w:type="dxa"/>
+              <w:right w:w="140" w:type="dxa"/>
+            </w:tcMar>
+          </w:tcPr>
+          <w:p>
+            <w:pPr>
+              <w:spacing w:line="276" w:lineRule="auto" w:after="40" w:before="40"/>
+            </w:pPr>
+            <w:r>
+              <w:rPr>
+                <w:rFonts w:ascii="Times New Roman" w:hAnsi="Times New Roman" w:cs="Times New Roman" w:eastAsia="Times New Roman"/>
+                <w:color w:val="0F172A"/>
+                <w:sz w:val="21"/>
+              </w:rPr>
               <w:t>Tổng kết tiến độ Giai đoạn 2 &amp; Thực hiện Bài Kiểm tra 2. (Sản phẩm: Hoàn thành Bài Kiểm tra 2)</w:t>
             </w:r>
           </w:p>
@@ -2593,9 +4174,25 @@
               <w:top w:val="dotted" w:sz="4" w:space="0" w:color="000000"/>
               <w:bottom w:val="dotted" w:sz="4" w:space="0" w:color="000000"/>
             </w:tcBorders>
-          </w:tcPr>
-          <w:p>
-            <w:r>
+            <w:vAlign w:val="center"/>
+            <w:shd w:fill="F8FAFC"/>
+            <w:tcMar>
+              <w:top w:w="100" w:type="dxa"/>
+              <w:bottom w:w="100" w:type="dxa"/>
+              <w:left w:w="140" w:type="dxa"/>
+              <w:right w:w="140" w:type="dxa"/>
+            </w:tcMar>
+          </w:tcPr>
+          <w:p>
+            <w:pPr>
+              <w:spacing w:line="276" w:lineRule="auto" w:after="40" w:before="40"/>
+            </w:pPr>
+            <w:r>
+              <w:rPr>
+                <w:rFonts w:ascii="Times New Roman" w:hAnsi="Times New Roman" w:cs="Times New Roman" w:eastAsia="Times New Roman"/>
+                <w:color w:val="0F172A"/>
+                <w:sz w:val="21"/>
+              </w:rPr>
               <w:t>Cả nhóm</w:t>
             </w:r>
           </w:p>
@@ -2604,6 +4201,7 @@
       <w:tr>
         <w:trPr>
           <w:trHeight w:val="340" w:hRule="atLeast"/>
+          <w:cantSplit/>
         </w:trPr>
         <w:tc>
           <w:tcPr>
@@ -2644,9 +4242,25 @@
               <w:top w:val="dotted" w:sz="4" w:space="0" w:color="000000"/>
             </w:tcBorders>
             <w:vAlign w:val="center"/>
-          </w:tcPr>
-          <w:p>
-            <w:r>
+            <w:shd w:fill="FFFFFF"/>
+            <w:tcMar>
+              <w:top w:w="100" w:type="dxa"/>
+              <w:bottom w:w="100" w:type="dxa"/>
+              <w:left w:w="140" w:type="dxa"/>
+              <w:right w:w="140" w:type="dxa"/>
+            </w:tcMar>
+          </w:tcPr>
+          <w:p>
+            <w:pPr>
+              <w:spacing w:line="276" w:lineRule="auto" w:after="40" w:before="40"/>
+              <w:jc w:val="center"/>
+            </w:pPr>
+            <w:r>
+              <w:rPr>
+                <w:rFonts w:ascii="Times New Roman" w:hAnsi="Times New Roman" w:cs="Times New Roman" w:eastAsia="Times New Roman"/>
+                <w:color w:val="0F172A"/>
+                <w:sz w:val="21"/>
+              </w:rPr>
               <w:t>Tuần 07 (Từ: 07/09/2026 Đến: 13/09/2026)</w:t>
             </w:r>
           </w:p>
@@ -2658,9 +4272,24 @@
               <w:top w:val="dotted" w:sz="4" w:space="0" w:color="000000"/>
             </w:tcBorders>
             <w:vAlign w:val="center"/>
-          </w:tcPr>
-          <w:p>
-            <w:r>
+            <w:shd w:fill="FFFFFF"/>
+            <w:tcMar>
+              <w:top w:w="100" w:type="dxa"/>
+              <w:bottom w:w="100" w:type="dxa"/>
+              <w:left w:w="140" w:type="dxa"/>
+              <w:right w:w="140" w:type="dxa"/>
+            </w:tcMar>
+          </w:tcPr>
+          <w:p>
+            <w:pPr>
+              <w:spacing w:line="276" w:lineRule="auto" w:after="40" w:before="40"/>
+            </w:pPr>
+            <w:r>
+              <w:rPr>
+                <w:rFonts w:ascii="Times New Roman" w:hAnsi="Times New Roman" w:cs="Times New Roman" w:eastAsia="Times New Roman"/>
+                <w:color w:val="0F172A"/>
+                <w:sz w:val="21"/>
+              </w:rPr>
               <w:t>Phát triển phân hệ Quản trị sàn (Marketplace Admin Dashboard &amp; Sức khỏe sàn). (Sản phẩm: Module Admin Dashboard)</w:t>
             </w:r>
           </w:p>
@@ -2671,9 +4300,25 @@
             <w:tcBorders>
               <w:top w:val="dotted" w:sz="4" w:space="0" w:color="000000"/>
             </w:tcBorders>
-          </w:tcPr>
-          <w:p>
-            <w:r>
+            <w:vAlign w:val="center"/>
+            <w:shd w:fill="FFFFFF"/>
+            <w:tcMar>
+              <w:top w:w="100" w:type="dxa"/>
+              <w:bottom w:w="100" w:type="dxa"/>
+              <w:left w:w="140" w:type="dxa"/>
+              <w:right w:w="140" w:type="dxa"/>
+            </w:tcMar>
+          </w:tcPr>
+          <w:p>
+            <w:pPr>
+              <w:spacing w:line="276" w:lineRule="auto" w:after="40" w:before="40"/>
+            </w:pPr>
+            <w:r>
+              <w:rPr>
+                <w:rFonts w:ascii="Times New Roman" w:hAnsi="Times New Roman" w:cs="Times New Roman" w:eastAsia="Times New Roman"/>
+                <w:color w:val="0F172A"/>
+                <w:sz w:val="21"/>
+              </w:rPr>
               <w:t>Vũ Ngọc Sơn</w:t>
             </w:r>
           </w:p>
@@ -2682,6 +4327,7 @@
       <w:tr>
         <w:trPr>
           <w:trHeight w:val="340" w:hRule="atLeast"/>
+          <w:cantSplit/>
         </w:trPr>
         <w:tc>
           <w:tcPr>
@@ -2689,9 +4335,25 @@
             <w:vMerge w:val="restart"/>
             <w:tcBorders/>
             <w:vAlign w:val="center"/>
-          </w:tcPr>
-          <w:p>
-            <w:r>
+            <w:shd w:fill="F8FAFC"/>
+            <w:tcMar>
+              <w:top w:w="100" w:type="dxa"/>
+              <w:bottom w:w="100" w:type="dxa"/>
+              <w:left w:w="140" w:type="dxa"/>
+              <w:right w:w="140" w:type="dxa"/>
+            </w:tcMar>
+          </w:tcPr>
+          <w:p>
+            <w:pPr>
+              <w:spacing w:line="276" w:lineRule="auto" w:after="40" w:before="40"/>
+              <w:jc w:val="center"/>
+            </w:pPr>
+            <w:r>
+              <w:rPr>
+                <w:rFonts w:ascii="Times New Roman" w:hAnsi="Times New Roman" w:cs="Times New Roman" w:eastAsia="Times New Roman"/>
+                <w:color w:val="0F172A"/>
+                <w:sz w:val="21"/>
+              </w:rPr>
               <w:t>36</w:t>
             </w:r>
           </w:p>
@@ -2703,9 +4365,25 @@
               <w:bottom w:val="dotted" w:sz="4" w:space="0" w:color="000000"/>
             </w:tcBorders>
             <w:vAlign w:val="center"/>
-          </w:tcPr>
-          <w:p>
-            <w:r>
+            <w:shd w:fill="F8FAFC"/>
+            <w:tcMar>
+              <w:top w:w="100" w:type="dxa"/>
+              <w:bottom w:w="100" w:type="dxa"/>
+              <w:left w:w="140" w:type="dxa"/>
+              <w:right w:w="140" w:type="dxa"/>
+            </w:tcMar>
+          </w:tcPr>
+          <w:p>
+            <w:pPr>
+              <w:spacing w:line="276" w:lineRule="auto" w:after="40" w:before="40"/>
+              <w:jc w:val="center"/>
+            </w:pPr>
+            <w:r>
+              <w:rPr>
+                <w:rFonts w:ascii="Times New Roman" w:hAnsi="Times New Roman" w:cs="Times New Roman" w:eastAsia="Times New Roman"/>
+                <w:color w:val="0F172A"/>
+                <w:sz w:val="21"/>
+              </w:rPr>
               <w:t>Tuần 07 (Từ: 07/09/2026 Đến: 13/09/2026)</w:t>
             </w:r>
           </w:p>
@@ -2717,9 +4395,24 @@
               <w:bottom w:val="dotted" w:sz="4" w:space="0" w:color="000000"/>
             </w:tcBorders>
             <w:vAlign w:val="center"/>
-          </w:tcPr>
-          <w:p>
-            <w:r>
+            <w:shd w:fill="F8FAFC"/>
+            <w:tcMar>
+              <w:top w:w="100" w:type="dxa"/>
+              <w:bottom w:w="100" w:type="dxa"/>
+              <w:left w:w="140" w:type="dxa"/>
+              <w:right w:w="140" w:type="dxa"/>
+            </w:tcMar>
+          </w:tcPr>
+          <w:p>
+            <w:pPr>
+              <w:spacing w:line="276" w:lineRule="auto" w:after="40" w:before="40"/>
+            </w:pPr>
+            <w:r>
+              <w:rPr>
+                <w:rFonts w:ascii="Times New Roman" w:hAnsi="Times New Roman" w:cs="Times New Roman" w:eastAsia="Times New Roman"/>
+                <w:color w:val="0F172A"/>
+                <w:sz w:val="21"/>
+              </w:rPr>
               <w:t>Xây dựng Trung tâm kiểm duyệt tin đăng, phát hiện tin ảo và cơ chế xếp hạng Trust Score. (Sản phẩm: Module Kiểm duyệt &amp; Trust Score)</w:t>
             </w:r>
           </w:p>
@@ -2730,9 +4423,25 @@
             <w:tcBorders>
               <w:bottom w:val="dotted" w:sz="4" w:space="0" w:color="000000"/>
             </w:tcBorders>
-          </w:tcPr>
-          <w:p>
-            <w:r>
+            <w:vAlign w:val="center"/>
+            <w:shd w:fill="F8FAFC"/>
+            <w:tcMar>
+              <w:top w:w="100" w:type="dxa"/>
+              <w:bottom w:w="100" w:type="dxa"/>
+              <w:left w:w="140" w:type="dxa"/>
+              <w:right w:w="140" w:type="dxa"/>
+            </w:tcMar>
+          </w:tcPr>
+          <w:p>
+            <w:pPr>
+              <w:spacing w:line="276" w:lineRule="auto" w:after="40" w:before="40"/>
+            </w:pPr>
+            <w:r>
+              <w:rPr>
+                <w:rFonts w:ascii="Times New Roman" w:hAnsi="Times New Roman" w:cs="Times New Roman" w:eastAsia="Times New Roman"/>
+                <w:color w:val="0F172A"/>
+                <w:sz w:val="21"/>
+              </w:rPr>
               <w:t>Vũ Bảo Linh</w:t>
             </w:r>
           </w:p>
@@ -2741,6 +4450,7 @@
       <w:tr>
         <w:trPr>
           <w:trHeight w:val="340" w:hRule="atLeast"/>
+          <w:cantSplit/>
         </w:trPr>
         <w:tc>
           <w:tcPr>
@@ -2782,9 +4492,25 @@
               <w:bottom w:val="dotted" w:sz="4" w:space="0" w:color="000000"/>
             </w:tcBorders>
             <w:vAlign w:val="center"/>
-          </w:tcPr>
-          <w:p>
-            <w:r>
+            <w:shd w:fill="FFFFFF"/>
+            <w:tcMar>
+              <w:top w:w="100" w:type="dxa"/>
+              <w:bottom w:w="100" w:type="dxa"/>
+              <w:left w:w="140" w:type="dxa"/>
+              <w:right w:w="140" w:type="dxa"/>
+            </w:tcMar>
+          </w:tcPr>
+          <w:p>
+            <w:pPr>
+              <w:spacing w:line="276" w:lineRule="auto" w:after="40" w:before="40"/>
+              <w:jc w:val="center"/>
+            </w:pPr>
+            <w:r>
+              <w:rPr>
+                <w:rFonts w:ascii="Times New Roman" w:hAnsi="Times New Roman" w:cs="Times New Roman" w:eastAsia="Times New Roman"/>
+                <w:color w:val="0F172A"/>
+                <w:sz w:val="21"/>
+              </w:rPr>
               <w:t>Tuần 07 (Từ: 07/09/2026 Đến: 13/09/2026)</w:t>
             </w:r>
           </w:p>
@@ -2797,9 +4523,24 @@
               <w:bottom w:val="dotted" w:sz="4" w:space="0" w:color="000000"/>
             </w:tcBorders>
             <w:vAlign w:val="center"/>
-          </w:tcPr>
-          <w:p>
-            <w:r>
+            <w:shd w:fill="FFFFFF"/>
+            <w:tcMar>
+              <w:top w:w="100" w:type="dxa"/>
+              <w:bottom w:w="100" w:type="dxa"/>
+              <w:left w:w="140" w:type="dxa"/>
+              <w:right w:w="140" w:type="dxa"/>
+            </w:tcMar>
+          </w:tcPr>
+          <w:p>
+            <w:pPr>
+              <w:spacing w:line="276" w:lineRule="auto" w:after="40" w:before="40"/>
+            </w:pPr>
+            <w:r>
+              <w:rPr>
+                <w:rFonts w:ascii="Times New Roman" w:hAnsi="Times New Roman" w:cs="Times New Roman" w:eastAsia="Times New Roman"/>
+                <w:color w:val="0F172A"/>
+                <w:sz w:val="21"/>
+              </w:rPr>
               <w:t>Phát triển Hệ thống phòng chống lừa đảo, bảo vệ tiền cọc trung gian (Escrow Protection). (Sản phẩm: Module Escrow &amp; Anti-Fraud)</w:t>
             </w:r>
           </w:p>
@@ -2811,9 +4552,25 @@
               <w:top w:val="dotted" w:sz="4" w:space="0" w:color="000000"/>
               <w:bottom w:val="dotted" w:sz="4" w:space="0" w:color="000000"/>
             </w:tcBorders>
-          </w:tcPr>
-          <w:p>
-            <w:r>
+            <w:vAlign w:val="center"/>
+            <w:shd w:fill="FFFFFF"/>
+            <w:tcMar>
+              <w:top w:w="100" w:type="dxa"/>
+              <w:bottom w:w="100" w:type="dxa"/>
+              <w:left w:w="140" w:type="dxa"/>
+              <w:right w:w="140" w:type="dxa"/>
+            </w:tcMar>
+          </w:tcPr>
+          <w:p>
+            <w:pPr>
+              <w:spacing w:line="276" w:lineRule="auto" w:after="40" w:before="40"/>
+            </w:pPr>
+            <w:r>
+              <w:rPr>
+                <w:rFonts w:ascii="Times New Roman" w:hAnsi="Times New Roman" w:cs="Times New Roman" w:eastAsia="Times New Roman"/>
+                <w:color w:val="0F172A"/>
+                <w:sz w:val="21"/>
+              </w:rPr>
               <w:t>Tô Văn Quyền</w:t>
             </w:r>
           </w:p>
@@ -2822,6 +4579,7 @@
       <w:tr>
         <w:trPr>
           <w:trHeight w:val="340" w:hRule="atLeast"/>
+          <w:cantSplit/>
         </w:trPr>
         <w:tc>
           <w:tcPr>
@@ -2863,9 +4621,25 @@
               <w:bottom w:val="dotted" w:sz="4" w:space="0" w:color="000000"/>
             </w:tcBorders>
             <w:vAlign w:val="center"/>
-          </w:tcPr>
-          <w:p>
-            <w:r>
+            <w:shd w:fill="F8FAFC"/>
+            <w:tcMar>
+              <w:top w:w="100" w:type="dxa"/>
+              <w:bottom w:w="100" w:type="dxa"/>
+              <w:left w:w="140" w:type="dxa"/>
+              <w:right w:w="140" w:type="dxa"/>
+            </w:tcMar>
+          </w:tcPr>
+          <w:p>
+            <w:pPr>
+              <w:spacing w:line="276" w:lineRule="auto" w:after="40" w:before="40"/>
+              <w:jc w:val="center"/>
+            </w:pPr>
+            <w:r>
+              <w:rPr>
+                <w:rFonts w:ascii="Times New Roman" w:hAnsi="Times New Roman" w:cs="Times New Roman" w:eastAsia="Times New Roman"/>
+                <w:color w:val="0F172A"/>
+                <w:sz w:val="21"/>
+              </w:rPr>
               <w:t>Tuần 07 (Từ: 07/09/2026 Đến: 13/09/2026)</w:t>
             </w:r>
           </w:p>
@@ -2878,9 +4652,24 @@
               <w:bottom w:val="dotted" w:sz="4" w:space="0" w:color="000000"/>
             </w:tcBorders>
             <w:vAlign w:val="center"/>
-          </w:tcPr>
-          <w:p>
-            <w:r>
+            <w:shd w:fill="F8FAFC"/>
+            <w:tcMar>
+              <w:top w:w="100" w:type="dxa"/>
+              <w:bottom w:w="100" w:type="dxa"/>
+              <w:left w:w="140" w:type="dxa"/>
+              <w:right w:w="140" w:type="dxa"/>
+            </w:tcMar>
+          </w:tcPr>
+          <w:p>
+            <w:pPr>
+              <w:spacing w:line="276" w:lineRule="auto" w:after="40" w:before="40"/>
+            </w:pPr>
+            <w:r>
+              <w:rPr>
+                <w:rFonts w:ascii="Times New Roman" w:hAnsi="Times New Roman" w:cs="Times New Roman" w:eastAsia="Times New Roman"/>
+                <w:color w:val="0F172A"/>
+                <w:sz w:val="21"/>
+              </w:rPr>
               <w:t>Xây dựng Báo cáo phân tích doanh thu sàn, Take-rate và gói thuê bao. (Sản phẩm: Module Doanh thu sàn)</w:t>
             </w:r>
           </w:p>
@@ -2892,9 +4681,25 @@
               <w:top w:val="dotted" w:sz="4" w:space="0" w:color="000000"/>
               <w:bottom w:val="dotted" w:sz="4" w:space="0" w:color="000000"/>
             </w:tcBorders>
-          </w:tcPr>
-          <w:p>
-            <w:r>
+            <w:vAlign w:val="center"/>
+            <w:shd w:fill="F8FAFC"/>
+            <w:tcMar>
+              <w:top w:w="100" w:type="dxa"/>
+              <w:bottom w:w="100" w:type="dxa"/>
+              <w:left w:w="140" w:type="dxa"/>
+              <w:right w:w="140" w:type="dxa"/>
+            </w:tcMar>
+          </w:tcPr>
+          <w:p>
+            <w:pPr>
+              <w:spacing w:line="276" w:lineRule="auto" w:after="40" w:before="40"/>
+            </w:pPr>
+            <w:r>
+              <w:rPr>
+                <w:rFonts w:ascii="Times New Roman" w:hAnsi="Times New Roman" w:cs="Times New Roman" w:eastAsia="Times New Roman"/>
+                <w:color w:val="0F172A"/>
+                <w:sz w:val="21"/>
+              </w:rPr>
               <w:t>Lê Bình Nguyên</w:t>
             </w:r>
           </w:p>
@@ -2903,6 +4708,7 @@
       <w:tr>
         <w:trPr>
           <w:trHeight w:val="340" w:hRule="atLeast"/>
+          <w:cantSplit/>
         </w:trPr>
         <w:tc>
           <w:tcPr>
@@ -2944,9 +4750,25 @@
               <w:bottom w:val="dotted" w:sz="4" w:space="0" w:color="000000"/>
             </w:tcBorders>
             <w:vAlign w:val="center"/>
-          </w:tcPr>
-          <w:p>
-            <w:r>
+            <w:shd w:fill="FFFFFF"/>
+            <w:tcMar>
+              <w:top w:w="100" w:type="dxa"/>
+              <w:bottom w:w="100" w:type="dxa"/>
+              <w:left w:w="140" w:type="dxa"/>
+              <w:right w:w="140" w:type="dxa"/>
+            </w:tcMar>
+          </w:tcPr>
+          <w:p>
+            <w:pPr>
+              <w:spacing w:line="276" w:lineRule="auto" w:after="40" w:before="40"/>
+              <w:jc w:val="center"/>
+            </w:pPr>
+            <w:r>
+              <w:rPr>
+                <w:rFonts w:ascii="Times New Roman" w:hAnsi="Times New Roman" w:cs="Times New Roman" w:eastAsia="Times New Roman"/>
+                <w:color w:val="0F172A"/>
+                <w:sz w:val="21"/>
+              </w:rPr>
               <w:t>Tuần 07 (Từ: 07/09/2026 Đến: 13/09/2026)</w:t>
             </w:r>
           </w:p>
@@ -2959,9 +4781,24 @@
               <w:bottom w:val="dotted" w:sz="4" w:space="0" w:color="000000"/>
             </w:tcBorders>
             <w:vAlign w:val="center"/>
-          </w:tcPr>
-          <w:p>
-            <w:r>
+            <w:shd w:fill="FFFFFF"/>
+            <w:tcMar>
+              <w:top w:w="100" w:type="dxa"/>
+              <w:bottom w:w="100" w:type="dxa"/>
+              <w:left w:w="140" w:type="dxa"/>
+              <w:right w:w="140" w:type="dxa"/>
+            </w:tcMar>
+          </w:tcPr>
+          <w:p>
+            <w:pPr>
+              <w:spacing w:line="276" w:lineRule="auto" w:after="40" w:before="40"/>
+            </w:pPr>
+            <w:r>
+              <w:rPr>
+                <w:rFonts w:ascii="Times New Roman" w:hAnsi="Times New Roman" w:cs="Times New Roman" w:eastAsia="Times New Roman"/>
+                <w:color w:val="0F172A"/>
+                <w:sz w:val="21"/>
+              </w:rPr>
               <w:t>Kiểm thử tích hợp hệ thống phân hệ Admin (Integration Testing). (Sản phẩm: Báo cáo test phân hệ Admin)</w:t>
             </w:r>
           </w:p>
@@ -2973,9 +4810,25 @@
               <w:top w:val="dotted" w:sz="4" w:space="0" w:color="000000"/>
               <w:bottom w:val="dotted" w:sz="4" w:space="0" w:color="000000"/>
             </w:tcBorders>
-          </w:tcPr>
-          <w:p>
-            <w:r>
+            <w:vAlign w:val="center"/>
+            <w:shd w:fill="FFFFFF"/>
+            <w:tcMar>
+              <w:top w:w="100" w:type="dxa"/>
+              <w:bottom w:w="100" w:type="dxa"/>
+              <w:left w:w="140" w:type="dxa"/>
+              <w:right w:w="140" w:type="dxa"/>
+            </w:tcMar>
+          </w:tcPr>
+          <w:p>
+            <w:pPr>
+              <w:spacing w:line="276" w:lineRule="auto" w:after="40" w:before="40"/>
+            </w:pPr>
+            <w:r>
+              <w:rPr>
+                <w:rFonts w:ascii="Times New Roman" w:hAnsi="Times New Roman" w:cs="Times New Roman" w:eastAsia="Times New Roman"/>
+                <w:color w:val="0F172A"/>
+                <w:sz w:val="21"/>
+              </w:rPr>
               <w:t>Cả nhóm</w:t>
             </w:r>
           </w:p>
@@ -2984,6 +4837,7 @@
       <w:tr>
         <w:trPr>
           <w:trHeight w:val="340" w:hRule="atLeast"/>
+          <w:cantSplit/>
         </w:trPr>
         <w:tc>
           <w:tcPr>
@@ -3024,9 +4878,25 @@
               <w:top w:val="dotted" w:sz="4" w:space="0" w:color="000000"/>
             </w:tcBorders>
             <w:vAlign w:val="center"/>
-          </w:tcPr>
-          <w:p>
-            <w:r>
+            <w:shd w:fill="F8FAFC"/>
+            <w:tcMar>
+              <w:top w:w="100" w:type="dxa"/>
+              <w:bottom w:w="100" w:type="dxa"/>
+              <w:left w:w="140" w:type="dxa"/>
+              <w:right w:w="140" w:type="dxa"/>
+            </w:tcMar>
+          </w:tcPr>
+          <w:p>
+            <w:pPr>
+              <w:spacing w:line="276" w:lineRule="auto" w:after="40" w:before="40"/>
+              <w:jc w:val="center"/>
+            </w:pPr>
+            <w:r>
+              <w:rPr>
+                <w:rFonts w:ascii="Times New Roman" w:hAnsi="Times New Roman" w:cs="Times New Roman" w:eastAsia="Times New Roman"/>
+                <w:color w:val="0F172A"/>
+                <w:sz w:val="21"/>
+              </w:rPr>
               <w:t>Tuần 08 (Từ: 14/09/2026 Đến: 20/09/2026)</w:t>
             </w:r>
           </w:p>
@@ -3038,9 +4908,24 @@
               <w:top w:val="dotted" w:sz="4" w:space="0" w:color="000000"/>
             </w:tcBorders>
             <w:vAlign w:val="center"/>
-          </w:tcPr>
-          <w:p>
-            <w:r>
+            <w:shd w:fill="F8FAFC"/>
+            <w:tcMar>
+              <w:top w:w="100" w:type="dxa"/>
+              <w:bottom w:w="100" w:type="dxa"/>
+              <w:left w:w="140" w:type="dxa"/>
+              <w:right w:w="140" w:type="dxa"/>
+            </w:tcMar>
+          </w:tcPr>
+          <w:p>
+            <w:pPr>
+              <w:spacing w:line="276" w:lineRule="auto" w:after="40" w:before="40"/>
+            </w:pPr>
+            <w:r>
+              <w:rPr>
+                <w:rFonts w:ascii="Times New Roman" w:hAnsi="Times New Roman" w:cs="Times New Roman" w:eastAsia="Times New Roman"/>
+                <w:color w:val="0F172A"/>
+                <w:sz w:val="21"/>
+              </w:rPr>
               <w:t>Hoàn thiện phân hệ Cư dân đang thuê (Resident App: IoT Smart Home, VAS, Vé bảo trì). (Sản phẩm: Module Resident App)</w:t>
             </w:r>
           </w:p>
@@ -3051,9 +4936,25 @@
             <w:tcBorders>
               <w:top w:val="dotted" w:sz="4" w:space="0" w:color="000000"/>
             </w:tcBorders>
-          </w:tcPr>
-          <w:p>
-            <w:r>
+            <w:vAlign w:val="center"/>
+            <w:shd w:fill="F8FAFC"/>
+            <w:tcMar>
+              <w:top w:w="100" w:type="dxa"/>
+              <w:bottom w:w="100" w:type="dxa"/>
+              <w:left w:w="140" w:type="dxa"/>
+              <w:right w:w="140" w:type="dxa"/>
+            </w:tcMar>
+          </w:tcPr>
+          <w:p>
+            <w:pPr>
+              <w:spacing w:line="276" w:lineRule="auto" w:after="40" w:before="40"/>
+            </w:pPr>
+            <w:r>
+              <w:rPr>
+                <w:rFonts w:ascii="Times New Roman" w:hAnsi="Times New Roman" w:cs="Times New Roman" w:eastAsia="Times New Roman"/>
+                <w:color w:val="0F172A"/>
+                <w:sz w:val="21"/>
+              </w:rPr>
               <w:t>Vũ Ngọc Sơn</w:t>
             </w:r>
           </w:p>
@@ -3062,6 +4963,7 @@
       <w:tr>
         <w:trPr>
           <w:trHeight w:val="340" w:hRule="atLeast"/>
+          <w:cantSplit/>
         </w:trPr>
         <w:tc>
           <w:tcPr>
@@ -3069,9 +4971,25 @@
             <w:vMerge w:val="restart"/>
             <w:tcBorders/>
             <w:vAlign w:val="center"/>
-          </w:tcPr>
-          <w:p>
-            <w:r>
+            <w:shd w:fill="FFFFFF"/>
+            <w:tcMar>
+              <w:top w:w="100" w:type="dxa"/>
+              <w:bottom w:w="100" w:type="dxa"/>
+              <w:left w:w="140" w:type="dxa"/>
+              <w:right w:w="140" w:type="dxa"/>
+            </w:tcMar>
+          </w:tcPr>
+          <w:p>
+            <w:pPr>
+              <w:spacing w:line="276" w:lineRule="auto" w:after="40" w:before="40"/>
+              <w:jc w:val="center"/>
+            </w:pPr>
+            <w:r>
+              <w:rPr>
+                <w:rFonts w:ascii="Times New Roman" w:hAnsi="Times New Roman" w:cs="Times New Roman" w:eastAsia="Times New Roman"/>
+                <w:color w:val="0F172A"/>
+                <w:sz w:val="21"/>
+              </w:rPr>
               <w:t>41</w:t>
             </w:r>
           </w:p>
@@ -3083,9 +5001,25 @@
               <w:bottom w:val="dotted" w:sz="4" w:space="0" w:color="000000"/>
             </w:tcBorders>
             <w:vAlign w:val="center"/>
-          </w:tcPr>
-          <w:p>
-            <w:r>
+            <w:shd w:fill="FFFFFF"/>
+            <w:tcMar>
+              <w:top w:w="100" w:type="dxa"/>
+              <w:bottom w:w="100" w:type="dxa"/>
+              <w:left w:w="140" w:type="dxa"/>
+              <w:right w:w="140" w:type="dxa"/>
+            </w:tcMar>
+          </w:tcPr>
+          <w:p>
+            <w:pPr>
+              <w:spacing w:line="276" w:lineRule="auto" w:after="40" w:before="40"/>
+              <w:jc w:val="center"/>
+            </w:pPr>
+            <w:r>
+              <w:rPr>
+                <w:rFonts w:ascii="Times New Roman" w:hAnsi="Times New Roman" w:cs="Times New Roman" w:eastAsia="Times New Roman"/>
+                <w:color w:val="0F172A"/>
+                <w:sz w:val="21"/>
+              </w:rPr>
               <w:t>Tuần 08 (Từ: 14/09/2026 Đến: 20/09/2026)</w:t>
             </w:r>
           </w:p>
@@ -3097,9 +5031,24 @@
               <w:bottom w:val="dotted" w:sz="4" w:space="0" w:color="000000"/>
             </w:tcBorders>
             <w:vAlign w:val="center"/>
-          </w:tcPr>
-          <w:p>
-            <w:r>
+            <w:shd w:fill="FFFFFF"/>
+            <w:tcMar>
+              <w:top w:w="100" w:type="dxa"/>
+              <w:bottom w:w="100" w:type="dxa"/>
+              <w:left w:w="140" w:type="dxa"/>
+              <w:right w:w="140" w:type="dxa"/>
+            </w:tcMar>
+          </w:tcPr>
+          <w:p>
+            <w:pPr>
+              <w:spacing w:line="276" w:lineRule="auto" w:after="40" w:before="40"/>
+            </w:pPr>
+            <w:r>
+              <w:rPr>
+                <w:rFonts w:ascii="Times New Roman" w:hAnsi="Times New Roman" w:cs="Times New Roman" w:eastAsia="Times New Roman"/>
+                <w:color w:val="0F172A"/>
+                <w:sz w:val="21"/>
+              </w:rPr>
               <w:t>Tối ưu hóa hiệu năng, SEO, Lighthouse Audit và tương thích Responsive Mobile. (Sản phẩm: Báo cáo Performance &amp; SEO)</w:t>
             </w:r>
           </w:p>
@@ -3110,9 +5059,25 @@
             <w:tcBorders>
               <w:bottom w:val="dotted" w:sz="4" w:space="0" w:color="000000"/>
             </w:tcBorders>
-          </w:tcPr>
-          <w:p>
-            <w:r>
+            <w:vAlign w:val="center"/>
+            <w:shd w:fill="FFFFFF"/>
+            <w:tcMar>
+              <w:top w:w="100" w:type="dxa"/>
+              <w:bottom w:w="100" w:type="dxa"/>
+              <w:left w:w="140" w:type="dxa"/>
+              <w:right w:w="140" w:type="dxa"/>
+            </w:tcMar>
+          </w:tcPr>
+          <w:p>
+            <w:pPr>
+              <w:spacing w:line="276" w:lineRule="auto" w:after="40" w:before="40"/>
+            </w:pPr>
+            <w:r>
+              <w:rPr>
+                <w:rFonts w:ascii="Times New Roman" w:hAnsi="Times New Roman" w:cs="Times New Roman" w:eastAsia="Times New Roman"/>
+                <w:color w:val="0F172A"/>
+                <w:sz w:val="21"/>
+              </w:rPr>
               <w:t>Vũ Bảo Linh</w:t>
             </w:r>
           </w:p>
@@ -3121,6 +5086,7 @@
       <w:tr>
         <w:trPr>
           <w:trHeight w:val="340" w:hRule="atLeast"/>
+          <w:cantSplit/>
         </w:trPr>
         <w:tc>
           <w:tcPr>
@@ -3162,9 +5128,25 @@
               <w:bottom w:val="dotted" w:sz="4" w:space="0" w:color="000000"/>
             </w:tcBorders>
             <w:vAlign w:val="center"/>
-          </w:tcPr>
-          <w:p>
-            <w:r>
+            <w:shd w:fill="F8FAFC"/>
+            <w:tcMar>
+              <w:top w:w="100" w:type="dxa"/>
+              <w:bottom w:w="100" w:type="dxa"/>
+              <w:left w:w="140" w:type="dxa"/>
+              <w:right w:w="140" w:type="dxa"/>
+            </w:tcMar>
+          </w:tcPr>
+          <w:p>
+            <w:pPr>
+              <w:spacing w:line="276" w:lineRule="auto" w:after="40" w:before="40"/>
+              <w:jc w:val="center"/>
+            </w:pPr>
+            <w:r>
+              <w:rPr>
+                <w:rFonts w:ascii="Times New Roman" w:hAnsi="Times New Roman" w:cs="Times New Roman" w:eastAsia="Times New Roman"/>
+                <w:color w:val="0F172A"/>
+                <w:sz w:val="21"/>
+              </w:rPr>
               <w:t>Tuần 08 (Từ: 14/09/2026 Đến: 20/09/2026)</w:t>
             </w:r>
           </w:p>
@@ -3177,9 +5159,24 @@
               <w:bottom w:val="dotted" w:sz="4" w:space="0" w:color="000000"/>
             </w:tcBorders>
             <w:vAlign w:val="center"/>
-          </w:tcPr>
-          <w:p>
-            <w:r>
+            <w:shd w:fill="F8FAFC"/>
+            <w:tcMar>
+              <w:top w:w="100" w:type="dxa"/>
+              <w:bottom w:w="100" w:type="dxa"/>
+              <w:left w:w="140" w:type="dxa"/>
+              <w:right w:w="140" w:type="dxa"/>
+            </w:tcMar>
+          </w:tcPr>
+          <w:p>
+            <w:pPr>
+              <w:spacing w:line="276" w:lineRule="auto" w:after="40" w:before="40"/>
+            </w:pPr>
+            <w:r>
+              <w:rPr>
+                <w:rFonts w:ascii="Times New Roman" w:hAnsi="Times New Roman" w:cs="Times New Roman" w:eastAsia="Times New Roman"/>
+                <w:color w:val="0F172A"/>
+                <w:sz w:val="21"/>
+              </w:rPr>
               <w:t>Kiểm thử tải (Load Testing), kiểm thử bảo mật (Security Review) và khắc phục lỗi. (Sản phẩm: Báo cáo bảo mật &amp; bug fix)</w:t>
             </w:r>
           </w:p>
@@ -3191,9 +5188,25 @@
               <w:top w:val="dotted" w:sz="4" w:space="0" w:color="000000"/>
               <w:bottom w:val="dotted" w:sz="4" w:space="0" w:color="000000"/>
             </w:tcBorders>
-          </w:tcPr>
-          <w:p>
-            <w:r>
+            <w:vAlign w:val="center"/>
+            <w:shd w:fill="F8FAFC"/>
+            <w:tcMar>
+              <w:top w:w="100" w:type="dxa"/>
+              <w:bottom w:w="100" w:type="dxa"/>
+              <w:left w:w="140" w:type="dxa"/>
+              <w:right w:w="140" w:type="dxa"/>
+            </w:tcMar>
+          </w:tcPr>
+          <w:p>
+            <w:pPr>
+              <w:spacing w:line="276" w:lineRule="auto" w:after="40" w:before="40"/>
+            </w:pPr>
+            <w:r>
+              <w:rPr>
+                <w:rFonts w:ascii="Times New Roman" w:hAnsi="Times New Roman" w:cs="Times New Roman" w:eastAsia="Times New Roman"/>
+                <w:color w:val="0F172A"/>
+                <w:sz w:val="21"/>
+              </w:rPr>
               <w:t>Tô Văn Quyền</w:t>
             </w:r>
           </w:p>
@@ -3202,6 +5215,7 @@
       <w:tr>
         <w:trPr>
           <w:trHeight w:val="340" w:hRule="atLeast"/>
+          <w:cantSplit/>
         </w:trPr>
         <w:tc>
           <w:tcPr>
@@ -3243,9 +5257,25 @@
               <w:bottom w:val="dotted" w:sz="4" w:space="0" w:color="000000"/>
             </w:tcBorders>
             <w:vAlign w:val="center"/>
-          </w:tcPr>
-          <w:p>
-            <w:r>
+            <w:shd w:fill="FFFFFF"/>
+            <w:tcMar>
+              <w:top w:w="100" w:type="dxa"/>
+              <w:bottom w:w="100" w:type="dxa"/>
+              <w:left w:w="140" w:type="dxa"/>
+              <w:right w:w="140" w:type="dxa"/>
+            </w:tcMar>
+          </w:tcPr>
+          <w:p>
+            <w:pPr>
+              <w:spacing w:line="276" w:lineRule="auto" w:after="40" w:before="40"/>
+              <w:jc w:val="center"/>
+            </w:pPr>
+            <w:r>
+              <w:rPr>
+                <w:rFonts w:ascii="Times New Roman" w:hAnsi="Times New Roman" w:cs="Times New Roman" w:eastAsia="Times New Roman"/>
+                <w:color w:val="0F172A"/>
+                <w:sz w:val="21"/>
+              </w:rPr>
               <w:t>Tuần 08 (Từ: 14/09/2026 Đến: 20/09/2026)</w:t>
             </w:r>
           </w:p>
@@ -3258,9 +5288,24 @@
               <w:bottom w:val="dotted" w:sz="4" w:space="0" w:color="000000"/>
             </w:tcBorders>
             <w:vAlign w:val="center"/>
-          </w:tcPr>
-          <w:p>
-            <w:r>
+            <w:shd w:fill="FFFFFF"/>
+            <w:tcMar>
+              <w:top w:w="100" w:type="dxa"/>
+              <w:bottom w:w="100" w:type="dxa"/>
+              <w:left w:w="140" w:type="dxa"/>
+              <w:right w:w="140" w:type="dxa"/>
+            </w:tcMar>
+          </w:tcPr>
+          <w:p>
+            <w:pPr>
+              <w:spacing w:line="276" w:lineRule="auto" w:after="40" w:before="40"/>
+            </w:pPr>
+            <w:r>
+              <w:rPr>
+                <w:rFonts w:ascii="Times New Roman" w:hAnsi="Times New Roman" w:cs="Times New Roman" w:eastAsia="Times New Roman"/>
+                <w:color w:val="0F172A"/>
+                <w:sz w:val="21"/>
+              </w:rPr>
               <w:t>Đóng gói ứng dụng, cấu hình CI/CD và triển khai thử nghiệm trên môi trường Production. (Sản phẩm: Production Deployment)</w:t>
             </w:r>
           </w:p>
@@ -3272,9 +5317,25 @@
               <w:top w:val="dotted" w:sz="4" w:space="0" w:color="000000"/>
               <w:bottom w:val="dotted" w:sz="4" w:space="0" w:color="000000"/>
             </w:tcBorders>
-          </w:tcPr>
-          <w:p>
-            <w:r>
+            <w:vAlign w:val="center"/>
+            <w:shd w:fill="FFFFFF"/>
+            <w:tcMar>
+              <w:top w:w="100" w:type="dxa"/>
+              <w:bottom w:w="100" w:type="dxa"/>
+              <w:left w:w="140" w:type="dxa"/>
+              <w:right w:w="140" w:type="dxa"/>
+            </w:tcMar>
+          </w:tcPr>
+          <w:p>
+            <w:pPr>
+              <w:spacing w:line="276" w:lineRule="auto" w:after="40" w:before="40"/>
+            </w:pPr>
+            <w:r>
+              <w:rPr>
+                <w:rFonts w:ascii="Times New Roman" w:hAnsi="Times New Roman" w:cs="Times New Roman" w:eastAsia="Times New Roman"/>
+                <w:color w:val="0F172A"/>
+                <w:sz w:val="21"/>
+              </w:rPr>
               <w:t>Lê Bình Nguyên</w:t>
             </w:r>
           </w:p>
@@ -3283,6 +5344,7 @@
       <w:tr>
         <w:trPr>
           <w:trHeight w:val="340" w:hRule="atLeast"/>
+          <w:cantSplit/>
         </w:trPr>
         <w:tc>
           <w:tcPr>
@@ -3324,9 +5386,25 @@
               <w:bottom w:val="dotted" w:sz="4" w:space="0" w:color="000000"/>
             </w:tcBorders>
             <w:vAlign w:val="center"/>
-          </w:tcPr>
-          <w:p>
-            <w:r>
+            <w:shd w:fill="F8FAFC"/>
+            <w:tcMar>
+              <w:top w:w="100" w:type="dxa"/>
+              <w:bottom w:w="100" w:type="dxa"/>
+              <w:left w:w="140" w:type="dxa"/>
+              <w:right w:w="140" w:type="dxa"/>
+            </w:tcMar>
+          </w:tcPr>
+          <w:p>
+            <w:pPr>
+              <w:spacing w:line="276" w:lineRule="auto" w:after="40" w:before="40"/>
+              <w:jc w:val="center"/>
+            </w:pPr>
+            <w:r>
+              <w:rPr>
+                <w:rFonts w:ascii="Times New Roman" w:hAnsi="Times New Roman" w:cs="Times New Roman" w:eastAsia="Times New Roman"/>
+                <w:color w:val="0F172A"/>
+                <w:sz w:val="21"/>
+              </w:rPr>
               <w:t>Tuần 08 (Từ: 14/09/2026 Đến: 20/09/2026)</w:t>
             </w:r>
           </w:p>
@@ -3339,9 +5417,24 @@
               <w:bottom w:val="dotted" w:sz="4" w:space="0" w:color="000000"/>
             </w:tcBorders>
             <w:vAlign w:val="center"/>
-          </w:tcPr>
-          <w:p>
-            <w:r>
+            <w:shd w:fill="F8FAFC"/>
+            <w:tcMar>
+              <w:top w:w="100" w:type="dxa"/>
+              <w:bottom w:w="100" w:type="dxa"/>
+              <w:left w:w="140" w:type="dxa"/>
+              <w:right w:w="140" w:type="dxa"/>
+            </w:tcMar>
+          </w:tcPr>
+          <w:p>
+            <w:pPr>
+              <w:spacing w:line="276" w:lineRule="auto" w:after="40" w:before="40"/>
+            </w:pPr>
+            <w:r>
+              <w:rPr>
+                <w:rFonts w:ascii="Times New Roman" w:hAnsi="Times New Roman" w:cs="Times New Roman" w:eastAsia="Times New Roman"/>
+                <w:color w:val="0F172A"/>
+                <w:sz w:val="21"/>
+              </w:rPr>
               <w:t>Họp nghiệm thu toàn bộ tính năng phần mềm nội bộ nhóm. (Sản phẩm: Biên bản nghiệm thu phần mềm)</w:t>
             </w:r>
           </w:p>
@@ -3353,9 +5446,25 @@
               <w:top w:val="dotted" w:sz="4" w:space="0" w:color="000000"/>
               <w:bottom w:val="dotted" w:sz="4" w:space="0" w:color="000000"/>
             </w:tcBorders>
-          </w:tcPr>
-          <w:p>
-            <w:r>
+            <w:vAlign w:val="center"/>
+            <w:shd w:fill="F8FAFC"/>
+            <w:tcMar>
+              <w:top w:w="100" w:type="dxa"/>
+              <w:bottom w:w="100" w:type="dxa"/>
+              <w:left w:w="140" w:type="dxa"/>
+              <w:right w:w="140" w:type="dxa"/>
+            </w:tcMar>
+          </w:tcPr>
+          <w:p>
+            <w:pPr>
+              <w:spacing w:line="276" w:lineRule="auto" w:after="40" w:before="40"/>
+            </w:pPr>
+            <w:r>
+              <w:rPr>
+                <w:rFonts w:ascii="Times New Roman" w:hAnsi="Times New Roman" w:cs="Times New Roman" w:eastAsia="Times New Roman"/>
+                <w:color w:val="0F172A"/>
+                <w:sz w:val="21"/>
+              </w:rPr>
               <w:t>Cả nhóm</w:t>
             </w:r>
           </w:p>
@@ -3364,6 +5473,7 @@
       <w:tr>
         <w:trPr>
           <w:trHeight w:val="340" w:hRule="atLeast"/>
+          <w:cantSplit/>
         </w:trPr>
         <w:tc>
           <w:tcPr>
@@ -3404,9 +5514,25 @@
               <w:top w:val="dotted" w:sz="4" w:space="0" w:color="000000"/>
             </w:tcBorders>
             <w:vAlign w:val="center"/>
-          </w:tcPr>
-          <w:p>
-            <w:r>
+            <w:shd w:fill="FFFFFF"/>
+            <w:tcMar>
+              <w:top w:w="100" w:type="dxa"/>
+              <w:bottom w:w="100" w:type="dxa"/>
+              <w:left w:w="140" w:type="dxa"/>
+              <w:right w:w="140" w:type="dxa"/>
+            </w:tcMar>
+          </w:tcPr>
+          <w:p>
+            <w:pPr>
+              <w:spacing w:line="276" w:lineRule="auto" w:after="40" w:before="40"/>
+              <w:jc w:val="center"/>
+            </w:pPr>
+            <w:r>
+              <w:rPr>
+                <w:rFonts w:ascii="Times New Roman" w:hAnsi="Times New Roman" w:cs="Times New Roman" w:eastAsia="Times New Roman"/>
+                <w:color w:val="0F172A"/>
+                <w:sz w:val="21"/>
+              </w:rPr>
               <w:t>Tuần 09 (Từ: 21/09/2026 Đến: 27/09/2026)</w:t>
             </w:r>
           </w:p>
@@ -3418,9 +5544,24 @@
               <w:top w:val="dotted" w:sz="4" w:space="0" w:color="000000"/>
             </w:tcBorders>
             <w:vAlign w:val="center"/>
-          </w:tcPr>
-          <w:p>
-            <w:r>
+            <w:shd w:fill="FFFFFF"/>
+            <w:tcMar>
+              <w:top w:w="100" w:type="dxa"/>
+              <w:bottom w:w="100" w:type="dxa"/>
+              <w:left w:w="140" w:type="dxa"/>
+              <w:right w:w="140" w:type="dxa"/>
+            </w:tcMar>
+          </w:tcPr>
+          <w:p>
+            <w:pPr>
+              <w:spacing w:line="276" w:lineRule="auto" w:after="40" w:before="40"/>
+            </w:pPr>
+            <w:r>
+              <w:rPr>
+                <w:rFonts w:ascii="Times New Roman" w:hAnsi="Times New Roman" w:cs="Times New Roman" w:eastAsia="Times New Roman"/>
+                <w:color w:val="0F172A"/>
+                <w:sz w:val="21"/>
+              </w:rPr>
               <w:t>Chuẩn bị bài thuyết trình, tài liệu hướng dẫn sử dụng và kịch bản demo trực tiếp. (Sản phẩm: Slide &amp; Kịch bản demo)</w:t>
             </w:r>
           </w:p>
@@ -3431,9 +5572,25 @@
             <w:tcBorders>
               <w:top w:val="dotted" w:sz="4" w:space="0" w:color="000000"/>
             </w:tcBorders>
-          </w:tcPr>
-          <w:p>
-            <w:r>
+            <w:vAlign w:val="center"/>
+            <w:shd w:fill="FFFFFF"/>
+            <w:tcMar>
+              <w:top w:w="100" w:type="dxa"/>
+              <w:bottom w:w="100" w:type="dxa"/>
+              <w:left w:w="140" w:type="dxa"/>
+              <w:right w:w="140" w:type="dxa"/>
+            </w:tcMar>
+          </w:tcPr>
+          <w:p>
+            <w:pPr>
+              <w:spacing w:line="276" w:lineRule="auto" w:after="40" w:before="40"/>
+            </w:pPr>
+            <w:r>
+              <w:rPr>
+                <w:rFonts w:ascii="Times New Roman" w:hAnsi="Times New Roman" w:cs="Times New Roman" w:eastAsia="Times New Roman"/>
+                <w:color w:val="0F172A"/>
+                <w:sz w:val="21"/>
+              </w:rPr>
               <w:t>Vũ Ngọc Sơn</w:t>
             </w:r>
           </w:p>
@@ -3442,6 +5599,7 @@
       <w:tr>
         <w:trPr>
           <w:trHeight w:val="340" w:hRule="atLeast"/>
+          <w:cantSplit/>
         </w:trPr>
         <w:tc>
           <w:tcPr>
@@ -3449,9 +5607,25 @@
             <w:vMerge w:val="restart"/>
             <w:tcBorders/>
             <w:vAlign w:val="center"/>
-          </w:tcPr>
-          <w:p>
-            <w:r>
+            <w:shd w:fill="FFFFFF"/>
+            <w:tcMar>
+              <w:top w:w="100" w:type="dxa"/>
+              <w:bottom w:w="100" w:type="dxa"/>
+              <w:left w:w="140" w:type="dxa"/>
+              <w:right w:w="140" w:type="dxa"/>
+            </w:tcMar>
+          </w:tcPr>
+          <w:p>
+            <w:pPr>
+              <w:spacing w:line="276" w:lineRule="auto" w:after="40" w:before="40"/>
+              <w:jc w:val="center"/>
+            </w:pPr>
+            <w:r>
+              <w:rPr>
+                <w:rFonts w:ascii="Times New Roman" w:hAnsi="Times New Roman" w:cs="Times New Roman" w:eastAsia="Times New Roman"/>
+                <w:color w:val="0F172A"/>
+                <w:sz w:val="21"/>
+              </w:rPr>
               <w:t>44</w:t>
             </w:r>
           </w:p>
@@ -3463,9 +5637,25 @@
               <w:bottom w:val="dotted" w:sz="4" w:space="0" w:color="000000"/>
             </w:tcBorders>
             <w:vAlign w:val="center"/>
-          </w:tcPr>
-          <w:p>
-            <w:r>
+            <w:shd w:fill="F8FAFC"/>
+            <w:tcMar>
+              <w:top w:w="100" w:type="dxa"/>
+              <w:bottom w:w="100" w:type="dxa"/>
+              <w:left w:w="140" w:type="dxa"/>
+              <w:right w:w="140" w:type="dxa"/>
+            </w:tcMar>
+          </w:tcPr>
+          <w:p>
+            <w:pPr>
+              <w:spacing w:line="276" w:lineRule="auto" w:after="40" w:before="40"/>
+              <w:jc w:val="center"/>
+            </w:pPr>
+            <w:r>
+              <w:rPr>
+                <w:rFonts w:ascii="Times New Roman" w:hAnsi="Times New Roman" w:cs="Times New Roman" w:eastAsia="Times New Roman"/>
+                <w:color w:val="0F172A"/>
+                <w:sz w:val="21"/>
+              </w:rPr>
               <w:t>Tuần 09 (Từ: 21/09/2026 Đến: 27/09/2026)</w:t>
             </w:r>
           </w:p>
@@ -3477,9 +5667,24 @@
               <w:bottom w:val="dotted" w:sz="4" w:space="0" w:color="000000"/>
             </w:tcBorders>
             <w:vAlign w:val="center"/>
-          </w:tcPr>
-          <w:p>
-            <w:r>
+            <w:shd w:fill="F8FAFC"/>
+            <w:tcMar>
+              <w:top w:w="100" w:type="dxa"/>
+              <w:bottom w:w="100" w:type="dxa"/>
+              <w:left w:w="140" w:type="dxa"/>
+              <w:right w:w="140" w:type="dxa"/>
+            </w:tcMar>
+          </w:tcPr>
+          <w:p>
+            <w:pPr>
+              <w:spacing w:line="276" w:lineRule="auto" w:after="40" w:before="40"/>
+            </w:pPr>
+            <w:r>
+              <w:rPr>
+                <w:rFonts w:ascii="Times New Roman" w:hAnsi="Times New Roman" w:cs="Times New Roman" w:eastAsia="Times New Roman"/>
+                <w:color w:val="0F172A"/>
+                <w:sz w:val="21"/>
+              </w:rPr>
               <w:t>Rà soát, đóng gói toàn bộ mã nguồn, tài liệu học thuật và artifact dự án. (Sản phẩm: Kho tài liệu hoàn chỉnh)</w:t>
             </w:r>
           </w:p>
@@ -3490,9 +5695,25 @@
             <w:tcBorders>
               <w:bottom w:val="dotted" w:sz="4" w:space="0" w:color="000000"/>
             </w:tcBorders>
-          </w:tcPr>
-          <w:p>
-            <w:r>
+            <w:vAlign w:val="center"/>
+            <w:shd w:fill="F8FAFC"/>
+            <w:tcMar>
+              <w:top w:w="100" w:type="dxa"/>
+              <w:bottom w:w="100" w:type="dxa"/>
+              <w:left w:w="140" w:type="dxa"/>
+              <w:right w:w="140" w:type="dxa"/>
+            </w:tcMar>
+          </w:tcPr>
+          <w:p>
+            <w:pPr>
+              <w:spacing w:line="276" w:lineRule="auto" w:after="40" w:before="40"/>
+            </w:pPr>
+            <w:r>
+              <w:rPr>
+                <w:rFonts w:ascii="Times New Roman" w:hAnsi="Times New Roman" w:cs="Times New Roman" w:eastAsia="Times New Roman"/>
+                <w:color w:val="0F172A"/>
+                <w:sz w:val="21"/>
+              </w:rPr>
               <w:t>Vũ Bảo Linh</w:t>
             </w:r>
           </w:p>
@@ -3501,6 +5722,7 @@
       <w:tr>
         <w:trPr>
           <w:trHeight w:val="340" w:hRule="atLeast"/>
+          <w:cantSplit/>
         </w:trPr>
         <w:tc>
           <w:tcPr>
@@ -3542,9 +5764,25 @@
               <w:bottom w:val="dotted" w:sz="4" w:space="0" w:color="000000"/>
             </w:tcBorders>
             <w:vAlign w:val="center"/>
-          </w:tcPr>
-          <w:p>
-            <w:r>
+            <w:shd w:fill="FFFFFF"/>
+            <w:tcMar>
+              <w:top w:w="100" w:type="dxa"/>
+              <w:bottom w:w="100" w:type="dxa"/>
+              <w:left w:w="140" w:type="dxa"/>
+              <w:right w:w="140" w:type="dxa"/>
+            </w:tcMar>
+          </w:tcPr>
+          <w:p>
+            <w:pPr>
+              <w:spacing w:line="276" w:lineRule="auto" w:after="40" w:before="40"/>
+              <w:jc w:val="center"/>
+            </w:pPr>
+            <w:r>
+              <w:rPr>
+                <w:rFonts w:ascii="Times New Roman" w:hAnsi="Times New Roman" w:cs="Times New Roman" w:eastAsia="Times New Roman"/>
+                <w:color w:val="0F172A"/>
+                <w:sz w:val="21"/>
+              </w:rPr>
               <w:t>Tuần 09 (Từ: 21/09/2026 Đến: 27/09/2026)</w:t>
             </w:r>
           </w:p>
@@ -3557,9 +5795,24 @@
               <w:bottom w:val="dotted" w:sz="4" w:space="0" w:color="000000"/>
             </w:tcBorders>
             <w:vAlign w:val="center"/>
-          </w:tcPr>
-          <w:p>
-            <w:r>
+            <w:shd w:fill="FFFFFF"/>
+            <w:tcMar>
+              <w:top w:w="100" w:type="dxa"/>
+              <w:bottom w:w="100" w:type="dxa"/>
+              <w:left w:w="140" w:type="dxa"/>
+              <w:right w:w="140" w:type="dxa"/>
+            </w:tcMar>
+          </w:tcPr>
+          <w:p>
+            <w:pPr>
+              <w:spacing w:line="276" w:lineRule="auto" w:after="40" w:before="40"/>
+            </w:pPr>
+            <w:r>
+              <w:rPr>
+                <w:rFonts w:ascii="Times New Roman" w:hAnsi="Times New Roman" w:cs="Times New Roman" w:eastAsia="Times New Roman"/>
+                <w:color w:val="0F172A"/>
+                <w:sz w:val="21"/>
+              </w:rPr>
               <w:t>Thực hiện Bài Kiểm tra 3 &amp; Báo cáo tổng kết môn học trước giảng viên. (Sản phẩm: Báo cáo tổng kết môn học)</w:t>
             </w:r>
           </w:p>
@@ -3571,9 +5824,25 @@
               <w:top w:val="dotted" w:sz="4" w:space="0" w:color="000000"/>
               <w:bottom w:val="dotted" w:sz="4" w:space="0" w:color="000000"/>
             </w:tcBorders>
-          </w:tcPr>
-          <w:p>
-            <w:r>
+            <w:vAlign w:val="center"/>
+            <w:shd w:fill="FFFFFF"/>
+            <w:tcMar>
+              <w:top w:w="100" w:type="dxa"/>
+              <w:bottom w:w="100" w:type="dxa"/>
+              <w:left w:w="140" w:type="dxa"/>
+              <w:right w:w="140" w:type="dxa"/>
+            </w:tcMar>
+          </w:tcPr>
+          <w:p>
+            <w:pPr>
+              <w:spacing w:line="276" w:lineRule="auto" w:after="40" w:before="40"/>
+            </w:pPr>
+            <w:r>
+              <w:rPr>
+                <w:rFonts w:ascii="Times New Roman" w:hAnsi="Times New Roman" w:cs="Times New Roman" w:eastAsia="Times New Roman"/>
+                <w:color w:val="0F172A"/>
+                <w:sz w:val="21"/>
+              </w:rPr>
               <w:t>Cả nhóm</w:t>
             </w:r>
           </w:p>
@@ -3582,6 +5851,7 @@
       <w:tr>
         <w:trPr>
           <w:trHeight w:val="340" w:hRule="atLeast"/>
+          <w:cantSplit/>
         </w:trPr>
         <w:tc>
           <w:tcPr>
@@ -3623,9 +5893,25 @@
               <w:bottom w:val="dotted" w:sz="4" w:space="0" w:color="000000"/>
             </w:tcBorders>
             <w:vAlign w:val="center"/>
-          </w:tcPr>
-          <w:p>
-            <w:r>
+            <w:shd w:fill="F8FAFC"/>
+            <w:tcMar>
+              <w:top w:w="100" w:type="dxa"/>
+              <w:bottom w:w="100" w:type="dxa"/>
+              <w:left w:w="140" w:type="dxa"/>
+              <w:right w:w="140" w:type="dxa"/>
+            </w:tcMar>
+          </w:tcPr>
+          <w:p>
+            <w:pPr>
+              <w:spacing w:line="276" w:lineRule="auto" w:after="40" w:before="40"/>
+              <w:jc w:val="center"/>
+            </w:pPr>
+            <w:r>
+              <w:rPr>
+                <w:rFonts w:ascii="Times New Roman" w:hAnsi="Times New Roman" w:cs="Times New Roman" w:eastAsia="Times New Roman"/>
+                <w:color w:val="0F172A"/>
+                <w:sz w:val="21"/>
+              </w:rPr>
               <w:t>Tuần 09 (Từ: 21/09/2026 Đến: 27/09/2026)</w:t>
             </w:r>
           </w:p>
@@ -3638,9 +5924,24 @@
               <w:bottom w:val="dotted" w:sz="4" w:space="0" w:color="000000"/>
             </w:tcBorders>
             <w:vAlign w:val="center"/>
-          </w:tcPr>
-          <w:p>
-            <w:r>
+            <w:shd w:fill="F8FAFC"/>
+            <w:tcMar>
+              <w:top w:w="100" w:type="dxa"/>
+              <w:bottom w:w="100" w:type="dxa"/>
+              <w:left w:w="140" w:type="dxa"/>
+              <w:right w:w="140" w:type="dxa"/>
+            </w:tcMar>
+          </w:tcPr>
+          <w:p>
+            <w:pPr>
+              <w:spacing w:line="276" w:lineRule="auto" w:after="40" w:before="40"/>
+            </w:pPr>
+            <w:r>
+              <w:rPr>
+                <w:rFonts w:ascii="Times New Roman" w:hAnsi="Times New Roman" w:cs="Times New Roman" w:eastAsia="Times New Roman"/>
+                <w:color w:val="0F172A"/>
+                <w:sz w:val="21"/>
+              </w:rPr>
               <w:t>Tổng kết đánh giá đóng góp thành viên và đúc kết kinh nghiệm phát triển cùng GenAI. (Sản phẩm: Báo cáo Kaizen tổng kết)</w:t>
             </w:r>
           </w:p>
@@ -3652,9 +5953,25 @@
               <w:top w:val="dotted" w:sz="4" w:space="0" w:color="000000"/>
               <w:bottom w:val="dotted" w:sz="4" w:space="0" w:color="000000"/>
             </w:tcBorders>
-          </w:tcPr>
-          <w:p>
-            <w:r>
+            <w:vAlign w:val="center"/>
+            <w:shd w:fill="F8FAFC"/>
+            <w:tcMar>
+              <w:top w:w="100" w:type="dxa"/>
+              <w:bottom w:w="100" w:type="dxa"/>
+              <w:left w:w="140" w:type="dxa"/>
+              <w:right w:w="140" w:type="dxa"/>
+            </w:tcMar>
+          </w:tcPr>
+          <w:p>
+            <w:pPr>
+              <w:spacing w:line="276" w:lineRule="auto" w:after="40" w:before="40"/>
+            </w:pPr>
+            <w:r>
+              <w:rPr>
+                <w:rFonts w:ascii="Times New Roman" w:hAnsi="Times New Roman" w:cs="Times New Roman" w:eastAsia="Times New Roman"/>
+                <w:color w:val="0F172A"/>
+                <w:sz w:val="21"/>
+              </w:rPr>
               <w:t>Cả nhóm</w:t>
             </w:r>
           </w:p>
@@ -3663,6 +5980,7 @@
       <w:tr>
         <w:trPr>
           <w:trHeight w:val="340" w:hRule="atLeast"/>
+          <w:cantSplit/>
         </w:trPr>
         <w:tc>
           <w:tcPr>
@@ -3704,9 +6022,24 @@
               <w:bottom w:val="dotted" w:sz="4" w:space="0" w:color="000000"/>
             </w:tcBorders>
             <w:vAlign w:val="center"/>
-          </w:tcPr>
-          <w:p>
-            <w:r>
+            <w:shd w:fill="FFFFFF"/>
+            <w:tcMar>
+              <w:top w:w="100" w:type="dxa"/>
+              <w:bottom w:w="100" w:type="dxa"/>
+              <w:left w:w="140" w:type="dxa"/>
+              <w:right w:w="140" w:type="dxa"/>
+            </w:tcMar>
+          </w:tcPr>
+          <w:p>
+            <w:pPr>
+              <w:spacing w:line="276" w:lineRule="auto" w:after="40" w:before="40"/>
+            </w:pPr>
+            <w:r>
+              <w:rPr>
+                <w:rFonts w:ascii="Times New Roman" w:hAnsi="Times New Roman" w:cs="Times New Roman" w:eastAsia="Times New Roman"/>
+                <w:color w:val="0F172A"/>
+                <w:sz w:val="21"/>
+              </w:rPr>
               <w:t>BẢO VỆ ĐỒ ÁN CUỐI KỲ TRƯỚC HỘI ĐỒNG (FINAL PROJECT DEFENSE).</w:t>
             </w:r>
           </w:p>
@@ -3719,9 +6052,24 @@
               <w:bottom w:val="dotted" w:sz="4" w:space="0" w:color="000000"/>
             </w:tcBorders>
             <w:vAlign w:val="center"/>
-          </w:tcPr>
-          <w:p>
-            <w:r>
+            <w:shd w:fill="FFFFFF"/>
+            <w:tcMar>
+              <w:top w:w="100" w:type="dxa"/>
+              <w:bottom w:w="100" w:type="dxa"/>
+              <w:left w:w="140" w:type="dxa"/>
+              <w:right w:w="140" w:type="dxa"/>
+            </w:tcMar>
+          </w:tcPr>
+          <w:p>
+            <w:pPr>
+              <w:spacing w:line="276" w:lineRule="auto" w:after="40" w:before="40"/>
+            </w:pPr>
+            <w:r>
+              <w:rPr>
+                <w:rFonts w:ascii="Times New Roman" w:hAnsi="Times New Roman" w:cs="Times New Roman" w:eastAsia="Times New Roman"/>
+                <w:color w:val="0F172A"/>
+                <w:sz w:val="21"/>
+              </w:rPr>
               <w:t>Cả nhóm</w:t>
             </w:r>
           </w:p>
@@ -3733,139 +6081,26 @@
               <w:top w:val="dotted" w:sz="4" w:space="0" w:color="000000"/>
               <w:bottom w:val="dotted" w:sz="4" w:space="0" w:color="000000"/>
             </w:tcBorders>
-          </w:tcPr>
-          <w:p>
-            <w:r>
+            <w:vAlign w:val="center"/>
+            <w:shd w:fill="FFFFFF"/>
+            <w:tcMar>
+              <w:top w:w="100" w:type="dxa"/>
+              <w:bottom w:w="100" w:type="dxa"/>
+              <w:left w:w="140" w:type="dxa"/>
+              <w:right w:w="140" w:type="dxa"/>
+            </w:tcMar>
+          </w:tcPr>
+          <w:p>
+            <w:pPr>
+              <w:spacing w:line="276" w:lineRule="auto" w:after="40" w:before="40"/>
+            </w:pPr>
+            <w:r>
+              <w:rPr>
+                <w:rFonts w:ascii="Times New Roman" w:hAnsi="Times New Roman" w:cs="Times New Roman" w:eastAsia="Times New Roman"/>
+                <w:color w:val="0F172A"/>
+                <w:sz w:val="21"/>
+              </w:rPr>
               <w:t>BÀI KIỂM TRA 3 - FINAL</w:t>
-            </w:r>
-          </w:p>
-        </w:tc>
-      </w:tr>
-      <w:tr>
-        <w:trPr>
-          <w:trHeight w:val="340" w:hRule="atLeast"/>
-        </w:trPr>
-        <w:tc>
-          <w:tcPr>
-            <w:tcW w:w="1545" w:type="dxa"/>
-            <w:vMerge w:val="continue"/>
-            <w:tcBorders/>
-            <w:vAlign w:val="center"/>
-          </w:tcPr>
-          <w:p>
-            <w:pPr>
-              <w:pStyle w:val="Normal"/>
-              <w:widowControl/>
-              <w:spacing w:lineRule="auto" w:line="240" w:before="0" w:after="0"/>
-              <w:jc w:val="start"/>
-              <w:rPr>
-                <w:rFonts w:ascii="Times New Roman" w:hAnsi="Times New Roman" w:cs="Times New Roman"/>
-                <w:b/>
-                <w:sz w:val="26"/>
-                <w:szCs w:val="26"/>
-              </w:rPr>
-            </w:pPr>
-            <w:r>
-              <w:rPr>
-                <w:rFonts w:eastAsia="Calibri" w:cs="Times New Roman" w:ascii="Times New Roman" w:hAnsi="Times New Roman"/>
-                <w:b/>
-                <w:kern w:val="0"/>
-                <w:sz w:val="26"/>
-                <w:szCs w:val="26"/>
-                <w:lang w:val="en-US" w:eastAsia="en-US" w:bidi="ar-SA"/>
-              </w:rPr>
-            </w:r>
-          </w:p>
-        </w:tc>
-        <w:tc>
-          <w:tcPr>
-            <w:tcW w:w="3456" w:type="dxa"/>
-            <w:tcBorders>
-              <w:top w:val="dotted" w:sz="4" w:space="0" w:color="000000"/>
-            </w:tcBorders>
-            <w:vAlign w:val="center"/>
-          </w:tcPr>
-          <w:p>
-            <w:pPr>
-              <w:pStyle w:val="Normal"/>
-              <w:widowControl/>
-              <w:spacing w:lineRule="auto" w:line="240" w:before="0" w:after="0"/>
-              <w:jc w:val="start"/>
-              <w:rPr>
-                <w:rFonts w:ascii="Times New Roman" w:hAnsi="Times New Roman" w:cs="Times New Roman"/>
-                <w:sz w:val="26"/>
-                <w:szCs w:val="26"/>
-              </w:rPr>
-            </w:pPr>
-            <w:r>
-              <w:rPr>
-                <w:rFonts w:eastAsia="Calibri" w:cs="Times New Roman" w:ascii="Times New Roman" w:hAnsi="Times New Roman"/>
-                <w:kern w:val="0"/>
-                <w:sz w:val="26"/>
-                <w:szCs w:val="26"/>
-                <w:lang w:val="en-US" w:eastAsia="en-US" w:bidi="ar-SA"/>
-              </w:rPr>
-            </w:r>
-          </w:p>
-        </w:tc>
-        <w:tc>
-          <w:tcPr>
-            <w:tcW w:w="2281" w:type="dxa"/>
-            <w:tcBorders>
-              <w:top w:val="dotted" w:sz="4" w:space="0" w:color="000000"/>
-            </w:tcBorders>
-            <w:vAlign w:val="center"/>
-          </w:tcPr>
-          <w:p>
-            <w:pPr>
-              <w:pStyle w:val="Normal"/>
-              <w:widowControl/>
-              <w:spacing w:lineRule="auto" w:line="240" w:before="0" w:after="0"/>
-              <w:jc w:val="start"/>
-              <w:rPr>
-                <w:rFonts w:ascii="Times New Roman" w:hAnsi="Times New Roman" w:cs="Times New Roman"/>
-                <w:sz w:val="26"/>
-                <w:szCs w:val="26"/>
-              </w:rPr>
-            </w:pPr>
-            <w:r>
-              <w:rPr>
-                <w:rFonts w:eastAsia="Calibri" w:cs="Times New Roman" w:ascii="Times New Roman" w:hAnsi="Times New Roman"/>
-                <w:kern w:val="0"/>
-                <w:sz w:val="26"/>
-                <w:szCs w:val="26"/>
-                <w:lang w:val="en-US" w:eastAsia="en-US" w:bidi="ar-SA"/>
-              </w:rPr>
-            </w:r>
-          </w:p>
-        </w:tc>
-        <w:tc>
-          <w:tcPr>
-            <w:tcW w:w="1789" w:type="dxa"/>
-            <w:tcBorders>
-              <w:top w:val="dotted" w:sz="4" w:space="0" w:color="000000"/>
-            </w:tcBorders>
-          </w:tcPr>
-          <w:p>
-            <w:pPr>
-              <w:pStyle w:val="Normal"/>
-              <w:widowControl/>
-              <w:spacing w:lineRule="auto" w:line="240" w:before="0" w:after="0"/>
-              <w:jc w:val="start"/>
-              <w:rPr>
-                <w:rFonts w:ascii="Times New Roman" w:hAnsi="Times New Roman" w:cs="Times New Roman"/>
-                <w:sz w:val="26"/>
-                <w:szCs w:val="26"/>
-              </w:rPr>
-            </w:pPr>
-            <w:r>
-              <w:rPr>
-                <w:rFonts w:eastAsia="Calibri" w:cs="Times New Roman" w:ascii="Times New Roman" w:hAnsi="Times New Roman"/>
-                <w:kern w:val="0"/>
-                <w:sz w:val="26"/>
-                <w:szCs w:val="26"/>
-                <w:lang w:val="en-US" w:eastAsia="en-US" w:bidi="ar-SA"/>
-              </w:rPr>
             </w:r>
           </w:p>
         </w:tc>
@@ -3899,7 +6134,7 @@
       <w:footerReference w:type="first" r:id="rId7"/>
       <w:type w:val="nextPage"/>
       <w:pgSz w:w="11906" w:h="16838"/>
-      <w:pgMar w:left="1701" w:right="1134" w:gutter="0" w:header="567" w:top="1134" w:footer="567" w:bottom="1134"/>
+      <w:pgMar w:left="1417" w:right="1134" w:gutter="0" w:header="567" w:top="1134" w:footer="567" w:bottom="1134"/>
       <w:pgNumType w:fmt="decimal"/>
       <w:formProt w:val="false"/>
       <w:textDirection w:val="lrTb"/>

</xml_diff>